<commit_message>
Correct DBS6 corrections after review: head terms, brand broad, margins
Reword the bamboo sheets finding, hold the brand-broad negatives until
brand exacts are ready, rebuild King Size bids, show per-colour margins
and both stock paces, and note what the audit's review already held.

Co-Authored-By: Claude Opus 5.5 <noreply@anthropic.com>
Claude-Session: https://claude.ai/code/session_01LY7A1KPDoE1cQtWdmceR2R
</commit_message>
<xml_diff>
--- a/docs/DBS6_Audit_Corrections_20260928.docx
+++ b/docs/DBS6_Audit_Corrections_20260928.docx
@@ -99,7 +99,7 @@
         <w:t xml:space="preserve">Push the terms that actually qualify. </w:t>
       </w:r>
       <w:r>
-        <w:t xml:space="preserve">Nine B6 terms beat the market at top of search on both click-through and conversion and have the stock. “bamboo sheets”, the biggest, is one of them, and the audit tapers it (Sections 5.2 and 5.4).</w:t>
+        <w:t xml:space="preserve">Nine B6 terms beat the market at top of search on both click-through and conversion and have the stock. “bamboo sheets”, the biggest, is one of them. The audit marks it out of focus and calls its change a step down, while the change it writes raises the price (Sections 5.2 and 5.4).</w:t>
       </w:r>
     </w:p>
     <w:p>
@@ -119,7 +119,7 @@
         <w:t xml:space="preserve">Break-even is lower than the audit thinks. </w:t>
       </w:r>
       <w:r>
-        <w:t xml:space="preserve">The audit prices on $26.88 profit per unit (34.0% break-even ACoS). Sellerboard shows $18.81 before the deal and $18.18 at the deal price: 23.8% break-even ACoS.</w:t>
+        <w:t xml:space="preserve">The audit prices on $26.88 profit per unit (34.0% break-even ACoS). Sellerboard shows $18.81 across B6 before the deal and $18.18 at the deal price: 23.8% break-even ACoS. Each campaign is priced on its advertised colour’s own margin.</w:t>
       </w:r>
     </w:p>
     <w:p>
@@ -639,7 +639,7 @@
                 <w:sz w:val="17"/>
                 <w:szCs w:val="17"/>
               </w:rPr>
-              <w:t xml:space="preserve">Profit per unit before ads × the chance a top-of-search click becomes a sale. Above it, each ad sale loses money. Profit per unit comes from Sellerboard: $18.81 before the deal and $18.18 at the deal price (break-even ACoS 23.8%). The conversion rate is the size’s rate until a campaign has 15 top-of-search clicks, blends toward its own between 15 and 50, and is its own from 50. Each campaign’s figure is in the campaign register.</w:t>
+              <w:t xml:space="preserve">Profit per unit before ads × the chance a top-of-search click becomes a sale. Above it, each ad sale loses money. Profit per unit comes from Sellerboard (27 August–25 September). It is $18.81 across B6 before the deal and $18.18 at the deal price (break-even ACoS 23.8%). Each campaign uses its advertised colour’s own margin, for example King White $15.97, Queen White $19.51, Full White $22.06, Queen Olive $12.43 and Queen Creme $22.51. The conversion rate is the size’s rate until a campaign has 15 top-of-search clicks, blends toward its own between 15 and 50, and is its own from 50. Each campaign’s figure is in the campaign register.</w:t>
             </w:r>
           </w:p>
         </w:tc>
@@ -1923,7 +1923,7 @@
         <w:spacing w:after="100"/>
       </w:pPr>
       <w:r>
-        <w:t xml:space="preserve">The audit forecasts ad spend rising from $462 to $1,295 a day, ACoS from 28% to 40% (against 23.8% break-even) and TACoS from 8.8% to 18.9%. It sizes its biggest jumps against a 25% TACoS ceiling. It never sets a goal for the run, so none of those numbers is checked against anything.</w:t>
+        <w:t xml:space="preserve">The audit forecasts ad spend rising from $462 to $1,295 a day, ACoS from 28% to 40% (against 23.8% break-even) and TACoS from 8.8% to 18.9%. It sizes its biggest jumps against a 25% TACoS ceiling. It never sets a goal for the run, so none of those numbers is checked against anything. Its review, after removing the rows it holds, puts spend at $1,164 a day and endorses the run.</w:t>
       </w:r>
     </w:p>
     <w:p>
@@ -2020,7 +2020,7 @@
         <w:spacing w:after="60"/>
       </w:pPr>
       <w:r>
-        <w:t xml:space="preserve">Hold what the deal bought: “bamboo sheets” 29, “bamboo sheets queen size” 21 and “bamboo cooling sheets” 20.</w:t>
+        <w:t xml:space="preserve">Hold what the deal bought: “bamboo sheets” 29, “bamboo sheets queen size” 21 and “bamboo cooling sheets” 20. “bamboo sheets queen size” gained 4 places in the deal but is still below where the audit’s own rank table had it a month ago (12), so it hasn’t recovered.</w:t>
       </w:r>
     </w:p>
     <w:p>
@@ -2088,15 +2088,23 @@
     </w:p>
     <w:p>
       <w:pPr>
-        <w:pStyle w:val="ListParagraph"/>
-        <w:numPr>
-          <w:ilvl w:val="0"/>
-          <w:numId w:val="3"/>
-        </w:numPr>
-        <w:spacing w:after="60"/>
-      </w:pPr>
-      <w:r>
-        <w:t xml:space="preserve">Switch the push campaigns to fixed bidding. Lower their base bids and raise the boosts, so the ads compete at the top instead of on product pages (Section 8).</w:t>
+        <w:spacing w:after="100"/>
+      </w:pPr>
+      <w:r>
+        <w:t xml:space="preserve">Changes land on 29 September at the earliest, so this is about one deal day of top-of-search sales at the push price. Deal data judges nothing, so it buys sales speed and rank, not a read.</w:t>
+      </w:r>
+    </w:p>
+    <w:p>
+      <w:pPr>
+        <w:pStyle w:val="ListParagraph"/>
+        <w:numPr>
+          <w:ilvl w:val="0"/>
+          <w:numId w:val="3"/>
+        </w:numPr>
+        <w:spacing w:after="60"/>
+      </w:pPr>
+      <w:r>
+        <w:t xml:space="preserve">Switch the push campaigns to fixed bidding and cut their base bids in the same write, raising the boosts so the top-of-search price holds (Section 8). Fixed bidding removes Amazon’s down-only trim on product pages. A switch without the base cut would raise product-page cost for a few days on the campaigns that already leak there.</w:t>
       </w:r>
     </w:p>
     <w:p>
@@ -2243,7 +2251,7 @@
         <w:t xml:space="preserve">Check daily: </w:t>
       </w:r>
       <w:r>
-        <w:t xml:space="preserve">spend against the limit; ad orders against 14 a day; top-of-search share on the push campaigns; rank on the head terms; and Available stock on Full White (62 units, 26 days) and Queen White (323 units, 47 days).</w:t>
+        <w:t xml:space="preserve">spend against the limit; ad orders against 14 a day; top-of-search share on the push campaigns; rank on the head terms; and Available stock on Full White (62 units, 26–36 days) and Queen White (323 units, 47–58 days).</w:t>
       </w:r>
     </w:p>
     <w:p>
@@ -2379,7 +2387,7 @@
         <w:spacing w:after="60"/>
       </w:pPr>
       <w:r>
-        <w:t xml:space="preserve">It gives 18 campaigns a 75% price jump in one step, several of them to $10–15 a click. Example: Full Size Bamboo Sheets goes from $8.43 to $14.77. That campaign ran at 111% ACoS over the last 30 days, and the audit’s own notes say it already loses $34.73 per order. The notes put the odds of these jumps working at 20–41%.</w:t>
+        <w:t xml:space="preserve">It gives 18 campaigns a 75% price jump in one step, several of them to $10–15 a click. Example: Full Size Bamboo Sheets goes from $8.43 to $14.77. That campaign ran at 111% ACoS over the last 30 days, and the audit’s own notes say it already loses $34.73 per order. The row contradicts itself: its notes say today’s $8.43 already needs a person to approve, and its fallback still describes a price cut. The notes put the odds of these jumps working at 20–41%.</w:t>
       </w:r>
     </w:p>
     <w:p>
@@ -2431,7 +2439,7 @@
         <w:spacing w:after="60"/>
       </w:pPr>
       <w:r>
-        <w:t xml:space="preserve">It tapers “bamboo sheets”, the biggest term that qualifies (Section 5.4).</w:t>
+        <w:t xml:space="preserve">It contradicts itself on “bamboo sheets”, the biggest term that qualifies (Section 5.4).</w:t>
       </w:r>
     </w:p>
     <w:p>
@@ -4207,7 +4215,7 @@
                 <w:sz w:val="17"/>
                 <w:szCs w:val="17"/>
               </w:rPr>
-              <w:t xml:space="preserve">$3.08 (19.3%, own)</w:t>
+              <w:t xml:space="preserve">$3.08 = King White $15.97 × 19.3%</w:t>
             </w:r>
           </w:p>
         </w:tc>
@@ -4353,7 +4361,7 @@
                 <w:sz w:val="17"/>
                 <w:szCs w:val="17"/>
               </w:rPr>
-              <w:t xml:space="preserve">$3.20 (14.5%)</w:t>
+              <w:t xml:space="preserve">$3.20 = Full White $22.06 × 14.5%</w:t>
             </w:r>
           </w:p>
         </w:tc>
@@ -4499,7 +4507,7 @@
                 <w:sz w:val="17"/>
                 <w:szCs w:val="17"/>
               </w:rPr>
-              <w:t xml:space="preserve">$2.26 (18.2%)</w:t>
+              <w:t xml:space="preserve">$3.55 once on Queen White = $19.51 × 18.2% (on Olive today: $12.43 × 18.2% = $2.26)</w:t>
             </w:r>
           </w:p>
         </w:tc>
@@ -4547,7 +4555,7 @@
                 <w:sz w:val="17"/>
                 <w:szCs w:val="17"/>
               </w:rPr>
-              <w:t xml:space="preserve">$5.84, capped at 2× = $4.52</w:t>
+              <w:t xml:space="preserve">$3.55 × 2.58 = $9.16, capped at 2× = $7.10</w:t>
             </w:r>
           </w:p>
         </w:tc>
@@ -4595,7 +4603,7 @@
                 <w:sz w:val="17"/>
                 <w:szCs w:val="17"/>
               </w:rPr>
-              <w:t xml:space="preserve">$4.52 (−43%) with the base $1.70 → $1.28; move the ad to Queen White</w:t>
+              <w:t xml:space="preserve">Move the ad to Queen White and fix the mix (base $1.70 → $1.28), then $7.10</w:t>
             </w:r>
           </w:p>
         </w:tc>
@@ -4645,7 +4653,7 @@
                 <w:sz w:val="17"/>
                 <w:szCs w:val="17"/>
               </w:rPr>
-              <w:t xml:space="preserve">$4.43 (22.7%)</w:t>
+              <w:t xml:space="preserve">$4.43 = Queen White $19.51 × 22.7%</w:t>
             </w:r>
           </w:p>
         </w:tc>
@@ -4791,7 +4799,7 @@
                 <w:sz w:val="17"/>
                 <w:szCs w:val="17"/>
               </w:rPr>
-              <w:t xml:space="preserve">$5.72 (25.4%)</w:t>
+              <w:t xml:space="preserve">$4.96 once on Queen White = $19.51 × 25.4% (on Creme today: $5.72)</w:t>
             </w:r>
           </w:p>
         </w:tc>
@@ -5051,7 +5059,7 @@
           <w:sz w:val="17"/>
           <w:szCs w:val="17"/>
         </w:rPr>
-        <w:t xml:space="preserve">Premium = (rank now ÷ target − 1) × 50%, or +25% when the ratio is 1.5 or less; the push price never exceeds twice break-even. Break-even figures are the register’s: Sellerboard margin × the campaign’s top-of-search conversion. “Now · audit” = today’s top-of-search price and what the audit writes.</w:t>
+        <w:t xml:space="preserve">Premium = (rank now ÷ target − 1) × 50%, or +25% when the ratio is 1.5 or less; the push price never exceeds twice break-even. Break-even = the advertised colour’s Sellerboard margin × the campaign’s top-of-search conversion; where the ad moves to White, it is priced on White’s margin. “Now · audit” = today’s top-of-search price and what the audit writes.</w:t>
       </w:r>
     </w:p>
     <w:p>
@@ -5067,7 +5075,62 @@
         <w:spacing w:after="100"/>
       </w:pPr>
       <w:r>
-        <w:t xml:space="preserve">It is B6’s biggest term: about 116,000 searches a month, and 116 units a week in the audit’s plan at rank 9. In the last 30 days its exact campaign took 760 clicks at 15.3% conversion and spent $2,958. At the top it beats the market on click-through and on conversion (19.3% against 2.7%), and King White has 1,406 units Available. It meets every push condition, but the audit marks it out of focus and tapers it.</w:t>
+        <w:t xml:space="preserve">It is B6’s biggest term: about 116,000 searches a month, and 116 units a week in the audit’s plan at rank 9. In the last 30 days its exact campaign took 760 clicks at 15.3% conversion and spent $2,958. At the top it beats the market on click-through and on conversion (19.3% against 2.7%), and King White has 1,406 units Available. It meets every push condition.</w:t>
+      </w:r>
+    </w:p>
+    <w:p>
+      <w:pPr>
+        <w:spacing w:after="100"/>
+      </w:pPr>
+      <w:r>
+        <w:t xml:space="preserve">The audit marks it out of focus and contradicts itself three times:</w:t>
+      </w:r>
+    </w:p>
+    <w:p>
+      <w:pPr>
+        <w:pStyle w:val="ListParagraph"/>
+        <w:numPr>
+          <w:ilvl w:val="0"/>
+          <w:numId w:val="3"/>
+        </w:numPr>
+        <w:spacing w:after="60"/>
+      </w:pPr>
+      <w:r>
+        <w:t xml:space="preserve">It calls its change a step down to $5.65.</w:t>
+      </w:r>
+    </w:p>
+    <w:p>
+      <w:pPr>
+        <w:pStyle w:val="ListParagraph"/>
+        <w:numPr>
+          <w:ilvl w:val="0"/>
+          <w:numId w:val="3"/>
+        </w:numPr>
+        <w:spacing w:after="60"/>
+      </w:pPr>
+      <w:r>
+        <w:t xml:space="preserve">Its own check then holds that step down (“placement problem, not performance”).</w:t>
+      </w:r>
+    </w:p>
+    <w:p>
+      <w:pPr>
+        <w:pStyle w:val="ListParagraph"/>
+        <w:numPr>
+          <w:ilvl w:val="0"/>
+          <w:numId w:val="3"/>
+        </w:numPr>
+        <w:spacing w:after="60"/>
+      </w:pPr>
+      <w:r>
+        <w:t xml:space="preserve">The change it actually writes (base $1.60 → $1.39, boost 281% → 369%) raises the price from $6.10 to $6.52, while its notes say the price holds to the cent.</w:t>
+      </w:r>
+    </w:p>
+    <w:p>
+      <w:pPr>
+        <w:spacing w:after="100"/>
+      </w:pPr>
+      <w:r>
+        <w:t xml:space="preserve">The push price here, $6.16, is within 6% of the audit’s number. The real correction is fixed bidding and a deeper base cut.</w:t>
       </w:r>
     </w:p>
     <w:p>
@@ -5482,7 +5545,7 @@
                 <w:sz w:val="17"/>
                 <w:szCs w:val="17"/>
               </w:rPr>
-              <w:t xml:space="preserve">219 units (#1 in the size) · 1,406 = 132 days</w:t>
+              <w:t xml:space="preserve">219 units (#1 in the size) · 1,406 = 193 days at the 30-day pace (132 at the recent pace)</w:t>
             </w:r>
           </w:p>
         </w:tc>
@@ -5580,7 +5643,7 @@
                 <w:sz w:val="17"/>
                 <w:szCs w:val="17"/>
               </w:rPr>
-              <w:t xml:space="preserve">166 units (#1) · 323 = 47 days; 1,002 arriving about 30 Oct (32 days away)</w:t>
+              <w:t xml:space="preserve">166 units (#1) · 323 = 58 days at the 30-day pace (47 at the recent pace); 1,002 arriving about 30 Oct (32 days away)</w:t>
             </w:r>
           </w:p>
         </w:tc>
@@ -5678,7 +5741,7 @@
                 <w:sz w:val="17"/>
                 <w:szCs w:val="17"/>
               </w:rPr>
-              <w:t xml:space="preserve">51 units (#1) · 62 = 26 days; 78 inbound</w:t>
+              <w:t xml:space="preserve">51 units (#1) · 62 = 36 days (26 recent); 78 inbound</w:t>
             </w:r>
           </w:p>
         </w:tc>
@@ -5776,7 +5839,7 @@
                 <w:sz w:val="17"/>
                 <w:szCs w:val="17"/>
               </w:rPr>
-              <w:t xml:space="preserve">27 units (#1) · 53 = 32 days; 72 inbound</w:t>
+              <w:t xml:space="preserve">27 units (#1) · 53 = 59 days (32 recent); 72 inbound</w:t>
             </w:r>
           </w:p>
         </w:tc>
@@ -5940,7 +6003,7 @@
           <w:sz w:val="17"/>
           <w:szCs w:val="17"/>
         </w:rPr>
-        <w:t xml:space="preserve">Sellerboard, 30-day units and Available stock on 28 September.</w:t>
+        <w:t xml:space="preserve">Sellerboard, 30-day units and Available stock on 28 September. The recent pace is the register’s weighted sales rate, which leans on the last weeks, deal days included.</w:t>
       </w:r>
     </w:p>
     <w:p>
@@ -5960,7 +6023,7 @@
         <w:t xml:space="preserve">Why not Queen Olive: </w:t>
       </w:r>
       <w:r>
-        <w:t xml:space="preserve">Olive is the size’s seventh seller. The audit’s reason is that White would run out at its push pace, three days before the arrival. That is the push creating its own stockout, on a forecast about ten times too high (Section 12). At today’s pace White lasts 47 days against 32 to the arrival.</w:t>
+        <w:t xml:space="preserve">Olive is the size’s seventh seller. The audit’s reason is that White would run out at its push pace, three days before the arrival. That is the push creating its own stockout, on a forecast about ten times too high (Section 12). White lasts 58 days at the 30-day pace, and 47 at the faster recent pace, against 32 to the arrival.</w:t>
       </w:r>
     </w:p>
     <w:p>
@@ -5977,10 +6040,10 @@
           <w:b/>
           <w:bCs/>
         </w:rPr>
-        <w:t xml:space="preserve">Switches that change the size are plain errors. </w:t>
-      </w:r>
-      <w:r>
-        <w:t xml:space="preserve">The audit moves Black Bamboo Sheets from King Black to California King Black. It moves White Cooling Sheets from Queen White to King White, and Cali King Bamboo Sheets from California King Sage Green to King White. A colour switch is a stock fix inside a size. None of these has a stock reason, and the California King term belongs on California King White.</w:t>
+        <w:t xml:space="preserve">Switches that change the size are wrong. </w:t>
+      </w:r>
+      <w:r>
+        <w:t xml:space="preserve">The audit moves Black Bamboo Sheets from King Black to California King Black. It moves White Cooling Sheets from Queen White to King White, and Cali King Bamboo Sheets from California King Sage Green to King White. A colour switch is a stock fix inside a size. Two of them follow an operator ruling of 19 September that a colour named in the keyword fixes the colour, not the size. They also move away from colours the audit says are running out. That is the same inflated push-pace reading as Queen. King Black has 117 in stock against 52 sold in 30 days (about 67 days). The switch would move “black bamboo sheets” off a colour with 509 clicks and 58 orders onto one with none. The ruling should change: a colour switch stays inside the size. The third, California King Sage Green to King White, has no reason at all; that term belongs on California King White.</w:t>
       </w:r>
     </w:p>
     <w:p>
@@ -6924,7 +6987,23 @@
         <w:spacing w:after="100"/>
       </w:pPr>
       <w:r>
-        <w:t xml:space="preserve">Bamboo Sheets King Size (HSV) is live but has nearly stopped serving: 14 clicks in 30 days and $9.60 in 14 days, at a $0.50 base on down-only bidding. Switch it to fixed bidding and hold its top-of-search price until it serves again. Don’t raise the base to $1.40 as the audit does.</w:t>
+        <w:t xml:space="preserve">Bamboo Sheets King Size (HSV) is live but has nearly stopped serving: 14 clicks in 30 days and $9.60 in 14 days, at a $0.50 base on down-only bidding. At that base its boost can’t go past 900%, so the most it can bid at the top is $5.00. That is why the audit lifts the base to $1.40, which also nearly triples its product-page bid.</w:t>
+      </w:r>
+    </w:p>
+    <w:p>
+      <w:pPr>
+        <w:spacing w:after="100"/>
+      </w:pPr>
+      <w:r>
+        <w:rPr>
+          <w:b/>
+          <w:bCs/>
+          <w:color w:val="1F3A5F"/>
+        </w:rPr>
+        <w:t xml:space="preserve">Correction. </w:t>
+      </w:r>
+      <w:r>
+        <w:t xml:space="preserve">Set the base to $0.60 and the boost to 700% (the same $4.80 at the top) on fixed bidding, in one write. That leaves room up to $6.00 at the top. Once it has 15 top-of-search clicks, climb +30% a step toward its push price. “bamboo sheets king size” is the plan’s second term (54 units a week), so it is not parked.</w:t>
       </w:r>
     </w:p>
     <w:p>
@@ -7954,46 +8033,117 @@
         <w:spacing w:after="100"/>
       </w:pPr>
       <w:r>
-        <w:t xml:space="preserve">B6 has 64 non-ranking campaigns: 8 inside break-even, 8 over it and 38 too thin to read. Each is judged on its own ACoS against 23.8%. Over break-even, the base comes down; inside it, nothing moves. The clearest error is the brand broad campaign “Decolure” (discovery):</w:t>
-      </w:r>
-    </w:p>
-    <w:p>
-      <w:pPr>
-        <w:pStyle w:val="ListParagraph"/>
-        <w:numPr>
-          <w:ilvl w:val="0"/>
-          <w:numId w:val="3"/>
-        </w:numPr>
-        <w:spacing w:after="60"/>
-      </w:pPr>
-      <w:r>
-        <w:t xml:space="preserve">It took 583 clicks and 117 orders in 30 days at 11% ACoS.</w:t>
-      </w:r>
-    </w:p>
-    <w:p>
-      <w:pPr>
-        <w:pStyle w:val="ListParagraph"/>
-        <w:numPr>
-          <w:ilvl w:val="0"/>
-          <w:numId w:val="3"/>
-        </w:numPr>
-        <w:spacing w:after="60"/>
-      </w:pPr>
-      <w:r>
-        <w:t xml:space="preserve">The audit moves its ad from Queen White to Queen Olive and trims its boost.</w:t>
-      </w:r>
-    </w:p>
-    <w:p>
-      <w:pPr>
-        <w:pStyle w:val="ListParagraph"/>
-        <w:numPr>
-          <w:ilvl w:val="0"/>
-          <w:numId w:val="3"/>
-        </w:numPr>
-        <w:spacing w:after="60"/>
-      </w:pPr>
-      <w:r>
-        <w:t xml:space="preserve">Correction: nothing moves. A brand-term campaign keeps its own colour.</w:t>
+        <w:t xml:space="preserve">B6 has 64 non-ranking campaigns: 8 inside break-even, 8 over it and 38 too thin to read. Each is judged on its own ACoS against 23.8%. Over break-even, the base comes down; inside it, nothing moves.</w:t>
+      </w:r>
+    </w:p>
+    <w:p>
+      <w:pPr>
+        <w:spacing w:after="100"/>
+      </w:pPr>
+      <w:r>
+        <w:t xml:space="preserve">The change that matters most is on the brand broad campaign “Decolure”, the most profitable campaign on the product: 583 clicks and 117 orders in 30 days at 11% ACoS. The audit does three things to it:</w:t>
+      </w:r>
+    </w:p>
+    <w:p>
+      <w:pPr>
+        <w:pStyle w:val="ListParagraph"/>
+        <w:numPr>
+          <w:ilvl w:val="0"/>
+          <w:numId w:val="3"/>
+        </w:numPr>
+        <w:spacing w:after="60"/>
+      </w:pPr>
+      <w:r>
+        <w:t xml:space="preserve">It moves its ad from Queen White to Queen Olive.</w:t>
+      </w:r>
+    </w:p>
+    <w:p>
+      <w:pPr>
+        <w:pStyle w:val="ListParagraph"/>
+        <w:numPr>
+          <w:ilvl w:val="0"/>
+          <w:numId w:val="3"/>
+        </w:numPr>
+        <w:spacing w:after="60"/>
+      </w:pPr>
+      <w:r>
+        <w:t xml:space="preserve">It trims its boost.</w:t>
+      </w:r>
+    </w:p>
+    <w:p>
+      <w:pPr>
+        <w:pStyle w:val="ListParagraph"/>
+        <w:numPr>
+          <w:ilvl w:val="0"/>
+          <w:numId w:val="3"/>
+        </w:numPr>
+        <w:spacing w:after="60"/>
+      </w:pPr>
+      <w:r>
+        <w:t xml:space="preserve">Row 2265 adds negative-exact on “decolure bamboo sheets”, “decolure bamboo sheets king size” and “decolure bamboo sheets queen size”. Those three terms took 529 clicks and $921 in this campaign in 90 days, and the review passed the row.</w:t>
+      </w:r>
+    </w:p>
+    <w:p>
+      <w:pPr>
+        <w:spacing w:after="100"/>
+      </w:pPr>
+      <w:r>
+        <w:t xml:space="preserve">Moving brand terms to their own exact campaigns follows the one-campaign-per-term rule, and exact campaigns exist for all three. But they aren’t ready to take the traffic:</w:t>
+      </w:r>
+    </w:p>
+    <w:p>
+      <w:pPr>
+        <w:pStyle w:val="ListParagraph"/>
+        <w:numPr>
+          <w:ilvl w:val="0"/>
+          <w:numId w:val="3"/>
+        </w:numPr>
+        <w:spacing w:after="60"/>
+      </w:pPr>
+      <w:r>
+        <w:t xml:space="preserve">The queen-size one took 1 click in 90 days.</w:t>
+      </w:r>
+    </w:p>
+    <w:p>
+      <w:pPr>
+        <w:pStyle w:val="ListParagraph"/>
+        <w:numPr>
+          <w:ilvl w:val="0"/>
+          <w:numId w:val="3"/>
+        </w:numPr>
+        <w:spacing w:after="60"/>
+      </w:pPr>
+      <w:r>
+        <w:t xml:space="preserve">The king-size one has a $20 daily budget.</w:t>
+      </w:r>
+    </w:p>
+    <w:p>
+      <w:pPr>
+        <w:pStyle w:val="ListParagraph"/>
+        <w:numPr>
+          <w:ilvl w:val="0"/>
+          <w:numId w:val="3"/>
+        </w:numPr>
+        <w:spacing w:after="60"/>
+      </w:pPr>
+      <w:r>
+        <w:t xml:space="preserve">The audit also cuts the main brand exact’s base from $2.11 to $1.74.</w:t>
+      </w:r>
+    </w:p>
+    <w:p>
+      <w:pPr>
+        <w:spacing w:after="100"/>
+      </w:pPr>
+      <w:r>
+        <w:rPr>
+          <w:b/>
+          <w:bCs/>
+          <w:color w:val="1F3A5F"/>
+        </w:rPr>
+        <w:t xml:space="preserve">Correction. </w:t>
+      </w:r>
+      <w:r>
+        <w:t xml:space="preserve">Hold row 2265, the colour switch and the boost trim. First retag the three brand exact campaigns as defensive, and check that each serves on the right colour with enough budget. Only then add the negatives.</w:t>
       </w:r>
     </w:p>
     <w:p>
@@ -8069,7 +8219,7 @@
         <w:t xml:space="preserve">Use real ranks. </w:t>
       </w:r>
       <w:r>
-        <w:t xml:space="preserve">38 of the audit’s 40 targets carry no current rank, although the rank tracker has them. “cooling sheets” is a target at rank 10 for 93 units a week, but B6 ranks 142 there. Take it out of the requirement until it is within reach.</w:t>
+        <w:t xml:space="preserve">38 of the audit’s 40 targets carry no current rank, although the rank tracker has them. “cooling sheets” is a target at rank 10 for 93 units a week, but our rank crawl has B6 at 142 for it on 28 September (the audit has no rank for this term; the 142 in the audit belongs to “cooling bed sheets”). Take it out of the requirement until it is within reach.</w:t>
       </w:r>
     </w:p>
     <w:p>
@@ -8214,6 +8364,14 @@
       </w:pPr>
       <w:r>
         <w:t xml:space="preserve">14. Changes that shouldn’t load as written</w:t>
+      </w:r>
+    </w:p>
+    <w:p>
+      <w:pPr>
+        <w:spacing w:after="100"/>
+      </w:pPr>
+      <w:r>
+        <w:t xml:space="preserve">The audit’s review already holds some of these: two of the five writes on paused campaigns, five of the probes, and the 38 rows the engine’s own checks failed (the 35 budgets and 3 pause rows). They are listed here too, so nothing is missed. The review passed the rest, including all 18 withheld rows.</w:t>
       </w:r>
     </w:p>
     <w:p>
@@ -8327,6 +8485,26 @@
           <w:b/>
           <w:bCs/>
         </w:rPr>
+        <w:t xml:space="preserve">Row 2265: </w:t>
+      </w:r>
+      <w:r>
+        <w:t xml:space="preserve">the brand-term negatives on the Decolure brand broad, until the brand exact campaigns are ready (Section 11).</w:t>
+      </w:r>
+    </w:p>
+    <w:p>
+      <w:pPr>
+        <w:pStyle w:val="ListParagraph"/>
+        <w:numPr>
+          <w:ilvl w:val="0"/>
+          <w:numId w:val="3"/>
+        </w:numPr>
+        <w:spacing w:after="60"/>
+      </w:pPr>
+      <w:r>
+        <w:rPr>
+          <w:b/>
+          <w:bCs/>
+        </w:rPr>
         <w:t xml:space="preserve">15 new campaigns mid-deal: </w:t>
       </w:r>
       <w:r>
@@ -8350,7 +8528,7 @@
         <w:t xml:space="preserve">Its review endorses the run </w:t>
       </w:r>
       <w:r>
-        <w:t xml:space="preserve">at $1,295 a day and says no deal falls in the window, while the Best Deal is running.</w:t>
+        <w:t xml:space="preserve">at $1,164 a day after its own holds, and says no deal falls in the window while the Best Deal is running.</w:t>
       </w:r>
     </w:p>
     <w:p>
@@ -8501,7 +8679,7 @@
         <w:spacing w:after="60"/>
       </w:pPr>
       <w:r>
-        <w:t xml:space="preserve">Leave the Decolure brand broad untouched.</w:t>
+        <w:t xml:space="preserve">Hold the Decolure brand-broad negatives until the three brand exact campaigns are defensive and serving.</w:t>
       </w:r>
     </w:p>
     <w:p>
@@ -8718,6 +8896,45 @@
       </w:pPr>
       <w:r>
         <w:t xml:space="preserve">It has no current rank for 38 of its 40 target terms.</w:t>
+      </w:r>
+    </w:p>
+    <w:p>
+      <w:pPr>
+        <w:pStyle w:val="ListParagraph"/>
+        <w:numPr>
+          <w:ilvl w:val="0"/>
+          <w:numId w:val="3"/>
+        </w:numPr>
+        <w:spacing w:after="60"/>
+      </w:pPr>
+      <w:r>
+        <w:t xml:space="preserve">Its notes contradict the change it writes: on “bamboo sheets” it says the price holds to the cent while raising it 7%.</w:t>
+      </w:r>
+    </w:p>
+    <w:p>
+      <w:pPr>
+        <w:pStyle w:val="ListParagraph"/>
+        <w:numPr>
+          <w:ilvl w:val="0"/>
+          <w:numId w:val="3"/>
+        </w:numPr>
+        <w:spacing w:after="60"/>
+      </w:pPr>
+      <w:r>
+        <w:t xml:space="preserve">It adds brand-term negatives to the brand broad before the brand exact campaigns can take the traffic.</w:t>
+      </w:r>
+    </w:p>
+    <w:p>
+      <w:pPr>
+        <w:pStyle w:val="ListParagraph"/>
+        <w:numPr>
+          <w:ilvl w:val="0"/>
+          <w:numId w:val="3"/>
+        </w:numPr>
+        <w:spacing w:after="60"/>
+      </w:pPr>
+      <w:r>
+        <w:t xml:space="preserve">Where the boost is at its 900% ceiling, it raises the base bid, which raises product-page bids too.</w:t>
       </w:r>
     </w:p>
     <w:sectPr>

</xml_diff>

<commit_message>
Add competitor evidence and costed push plan to DBS6 corrections
Per the Slack thread on True Bamboo: tactical push set with click,
order and budget plan, daily price steps, mix fix in the same write,
and weeks-not-months rank milestones.

Co-Authored-By: Claude Opus 5.5 <noreply@anthropic.com>
Claude-Session: https://claude.ai/code/session_01LY7A1KPDoE1cQtWdmceR2R
</commit_message>
<xml_diff>
--- a/docs/DBS6_Audit_Corrections_20260928.docx
+++ b/docs/DBS6_Audit_Corrections_20260928.docx
@@ -76,10 +76,10 @@
           <w:b/>
           <w:bCs/>
         </w:rPr>
-        <w:t xml:space="preserve">Push at top of search now, while the deal runs, but in the right order. </w:t>
-      </w:r>
-      <w:r>
-        <w:t xml:space="preserve">Half of B6’s ad clicks land on product pages: 99 of 244 ranking campaigns take too few clicks at the top or lose too many to product pages. First get the ads to the top: lower the base bid, raise the boost, and switch push campaigns from down-only to fixed bidding. Then price each qualifying term to its push price: sized to its rank gap, never more than twice break-even, climbing at most 30% per step. The audit’s 18 jumps of 75% go (Section 5).</w:t>
+        <w:t xml:space="preserve">Push harder at top of search, on a tactical set of terms, with a costed plan. </w:t>
+      </w:r>
+      <w:r>
+        <w:t xml:space="preserve">A competitor with 129 reviews, True Bamboo, climbed from about 110 to the top 5 on three of our main terms in about 9 days by holding the top ad slot. Our click-through and conversion already beat the market on these terms; what’s missing is volume at the top. Eight terms get a plan for clicks, orders and budget (Section 5.3). Fixed bidding, the base cut and the push price go in one write. Prices then step up daily until each term holds the top slot, never above twice break-even. The audit’s 18 jumps of 75% go.</w:t>
       </w:r>
     </w:p>
     <w:p>
@@ -96,10 +96,10 @@
           <w:b/>
           <w:bCs/>
         </w:rPr>
-        <w:t xml:space="preserve">Push the terms that actually qualify. </w:t>
-      </w:r>
-      <w:r>
-        <w:t xml:space="preserve">Nine B6 terms beat the market at top of search on both click-through and conversion and have the stock. “bamboo sheets”, the biggest, is one of them. The audit marks it out of focus and calls its change a step down, while the change it writes raises the price (Sections 5.2 and 5.4).</w:t>
+        <w:t xml:space="preserve">“bamboo sheets” is in the push. </w:t>
+      </w:r>
+      <w:r>
+        <w:t xml:space="preserve">It is B6’s biggest term and qualifies. The audit marks it out of focus and contradicts itself on its price (Section 5.6).</w:t>
       </w:r>
     </w:p>
     <w:p>
@@ -308,7 +308,7 @@
         <w:t xml:space="preserve">Decisions needed from you today: </w:t>
       </w:r>
       <w:r>
-        <w:t xml:space="preserve">the goals for the deal days and after (Section 3), and whether “bamboo sheets” joins the push (Section 5.4).</w:t>
+        <w:t xml:space="preserve">the goals for the deal days and after (Section 3), and the push budget for three weeks: about $1,200 a day at the full plan, or $750 adjusted for overlap between terms (Section 5.3).</w:t>
       </w:r>
     </w:p>
     <w:p>
@@ -689,7 +689,7 @@
                 <w:sz w:val="17"/>
                 <w:szCs w:val="17"/>
               </w:rPr>
-              <w:t xml:space="preserve">A price above break-even paid on purpose to buy rank. It is set by how far the term is from its target rank. It is never more than twice break-even, which keeps the cost per sale below the order value, and it climbs at most 30% per step.</w:t>
+              <w:t xml:space="preserve">A price above break-even paid on purpose to buy rank. It is set by how far the term is from its target rank. It is never more than twice break-even, which keeps the cost per sale below the order value, and it steps up by at most 30% a day while the term isn’t holding the top slot.</w:t>
             </w:r>
           </w:p>
         </w:tc>
@@ -1724,10 +1724,10 @@
           <w:b/>
           <w:bCs/>
         </w:rPr>
-        <w:t xml:space="preserve">Push the qualifying focus terms at top of search while the deal runs, and keep building into Prime and Black Friday / Cyber Monday. </w:t>
-      </w:r>
-      <w:r>
-        <w:t xml:space="preserve">A term qualifies when it meets four conditions: it beats the market at top of search on click-through and on conversion, it has 7 or more days of Available stock, and its keyword is live and serving. A term that doesn’t qualify runs at break-even until it does.</w:t>
+        <w:t xml:space="preserve">Push a tactical set of terms at top of search, starting while the deal runs and building into Prime and Black Friday / Cyber Monday. </w:t>
+      </w:r>
+      <w:r>
+        <w:t xml:space="preserve">Not hundreds of terms, and more than a few. Each push term gets a plan for top-of-search clicks, orders and budget a day, which is tuned weekly on results. A term qualifies when it meets four conditions: it beats the market at top of search on click-through and on conversion, it has 7 or more days of Available stock, and its keyword is live and serving. Where a term has barely been shown at the top, judge it on its overall conversion against the market until it has 15 top-of-search clicks. A term that doesn’t qualify runs at break-even until it does.</w:t>
       </w:r>
     </w:p>
     <w:p>
@@ -1747,7 +1747,7 @@
         <w:t xml:space="preserve">A push price has limits. </w:t>
       </w:r>
       <w:r>
-        <w:t xml:space="preserve">Start from break-even and add a premium for the rank gap: +25% when the current rank is within 1.5× the target, otherwise (current ÷ target − 1) × 50%. Never pay more than twice break-even. Never climb more than 30% in one step.</w:t>
+        <w:t xml:space="preserve">Start from break-even and add a premium for the rank gap: +25% when the current rank is within 1.5× the target, otherwise (current ÷ target − 1) × 50%. Step up by at most 30% a day until the term holds a top-3 sponsored position most hours and at least 30% of top-of-search impressions. Never pay more than twice break-even. If a term sits at that ceiling on fixed bidding and still can’t hold the top for 3 days, bring it to you: raise its ceiling for a set time, or swap the term.</w:t>
       </w:r>
     </w:p>
     <w:p>
@@ -1764,10 +1764,10 @@
           <w:b/>
           <w:bCs/>
         </w:rPr>
-        <w:t xml:space="preserve">Get the ad to the top before paying more. </w:t>
-      </w:r>
-      <w:r>
-        <w:t xml:space="preserve">If more than 20% of clicks land on product pages, lower the base bid and raise the boost so the top-of-search price holds. Cut the base by at most 50% a step, or 25% where product pages bring orders. If under 30% of clicks land at the top, this comes before any price or budget move. Push campaigns run on fixed bidding.</w:t>
+        <w:t xml:space="preserve">Fix the mix in the same write as the push. </w:t>
+      </w:r>
+      <w:r>
+        <w:t xml:space="preserve">If more than 20% of clicks land on product pages, lower the base bid and raise the boost to reach the push price, in one write. Cut the base by at most 50% a step, or 25% where product pages bring orders. Push campaigns run on fixed bidding.</w:t>
       </w:r>
     </w:p>
     <w:p>
@@ -1967,7 +1967,7 @@
         <w:t xml:space="preserve">For the deal days (to 30 September): </w:t>
       </w:r>
       <w:r>
-        <w:t xml:space="preserve">a spend limit and a TACoS ceiling for the push. Deal spend is running at $924 a day; the limit should cover the push terms first.</w:t>
+        <w:t xml:space="preserve">the push budget (Section 5.3) plus a spend limit for everything else. Deal spend is running at $924 a day.</w:t>
       </w:r>
     </w:p>
     <w:p>
@@ -1987,7 +1987,7 @@
         <w:t xml:space="preserve">From 1 October: </w:t>
       </w:r>
       <w:r>
-        <w:t xml:space="preserve">a TACoS goal well below the audit’s 25% (B6 ran at about 7% before the deal), and a daily spend limit set as a share of the last 7 days’ total sales, so the push can grow as sales grow.</w:t>
+        <w:t xml:space="preserve">the push budget is a deliberate, time-boxed investment, approved for three weeks and reviewed weekly. Everything outside the push gets a TACoS goal well below the audit’s 25% (B6 ran at about 7% before the deal), and a daily spend limit set as a share of the last 7 days’ total sales.</w:t>
       </w:r>
     </w:p>
     <w:p>
@@ -2007,7 +2007,7 @@
         <w:t xml:space="preserve">Product goal: </w:t>
       </w:r>
       <w:r>
-        <w:t xml:space="preserve">enter the October Prime event and Black Friday with the focus terms as high as possible. Milestones:</w:t>
+        <w:t xml:space="preserve">top 10 on at least half of the push terms by 19 October, and on the rest by early November, ahead of Prime and Black Friday. True Bamboo moved from about 110 to the top 5 on three of these terms in 9 days, so this is achievable. Milestones:</w:t>
       </w:r>
     </w:p>
     <w:p>
@@ -2117,7 +2117,7 @@
         <w:spacing w:after="60"/>
       </w:pPr>
       <w:r>
-        <w:t xml:space="preserve">Write each qualifying focus term’s push price: one step now, at most 30% above today and never above twice break-even. Terms that don’t qualify move toward break-even (Section 5).</w:t>
+        <w:t xml:space="preserve">Write each push term’s price from the plan (Section 5.3), in the same write as the base cut. Step it up by up to 30% a day until it holds the top slot, never above twice break-even. Terms outside the push move toward break-even.</w:t>
       </w:r>
     </w:p>
     <w:p>
@@ -2194,7 +2194,7 @@
           <w:b/>
           <w:bCs/>
         </w:rPr>
-        <w:t xml:space="preserve">Bring spend back inside the limit. </w:t>
+        <w:t xml:space="preserve">Bring spend outside the push back inside the limit. </w:t>
       </w:r>
       <w:r>
         <w:t xml:space="preserve">Out-of-focus ranking campaigns come to break-even. Deal budgets come down to each campaign’s required clicks at its new price. Product-page leaks keep getting fixed.</w:t>
@@ -2298,7 +2298,7 @@
         <w:spacing w:after="60"/>
       </w:pPr>
       <w:r>
-        <w:t xml:space="preserve">Give push terms whose rank moved their next step (at most +30%, never above twice break-even). Where rank didn’t move after a week of full delivery at the top, stop the premium and find out why.</w:t>
+        <w:t xml:space="preserve">Tune the push weekly (5, 12 and 19 October). Keep funding the terms whose organic rank is moving. For a term that held the top slot for a week without moving, check the listing against True Bamboo (main image, price, reviews), stock and conversion before spending more, and swap it if there is no fix. Stop a term whose top-of-search conversion falls below the market on 50+ clicks.</w:t>
       </w:r>
     </w:p>
     <w:p>
@@ -2439,7 +2439,7 @@
         <w:spacing w:after="60"/>
       </w:pPr>
       <w:r>
-        <w:t xml:space="preserve">It contradicts itself on “bamboo sheets”, the biggest term that qualifies (Section 5.4).</w:t>
+        <w:t xml:space="preserve">It contradicts itself on “bamboo sheets”, the biggest term that qualifies (Section 5.6).</w:t>
       </w:r>
     </w:p>
     <w:p>
@@ -2447,7 +2447,7 @@
         <w:pStyle w:val="Heading2"/>
       </w:pPr>
       <w:r>
-        <w:t xml:space="preserve">5.2 Which terms qualify</w:t>
+        <w:t xml:space="preserve">5.2 What a competitor shows is possible</w:t>
       </w:r>
     </w:p>
     <w:p>
@@ -2455,7 +2455,3001 @@
         <w:spacing w:after="100"/>
       </w:pPr>
       <w:r>
-        <w:t xml:space="preserve">Nine B6 terms beat the market at top of search on both click-through and conversion and have 7+ days of Available stock. Most of them must fix their placement mix first, because a push on a campaign leaking to product pages pays for the wrong placement.</w:t>
+        <w:t xml:space="preserve">True Bamboo’s 6-piece (B0HD7R5L1D: $89.99, 4.6 stars, 129 reviews) came back after months out of stock. It reached the top 5 on several of our main terms within days:</w:t>
+      </w:r>
+    </w:p>
+    <w:tbl>
+      <w:tblPr>
+        <w:tblW w:type="dxa" w:w="9972"/>
+        <w:tblBorders>
+          <w:top w:val="single" w:color="auto" w:sz="4"/>
+          <w:left w:val="single" w:color="auto" w:sz="4"/>
+          <w:bottom w:val="single" w:color="auto" w:sz="4"/>
+          <w:right w:val="single" w:color="auto" w:sz="4"/>
+          <w:insideH w:val="single" w:color="auto" w:sz="4"/>
+          <w:insideV w:val="single" w:color="auto" w:sz="4"/>
+        </w:tblBorders>
+      </w:tblPr>
+      <w:tblGrid>
+        <w:gridCol w:w="2700"/>
+        <w:gridCol w:w="1500"/>
+        <w:gridCol w:w="3200"/>
+        <w:gridCol w:w="2572"/>
+      </w:tblGrid>
+      <w:tr>
+        <w:trPr>
+          <w:tblHeader/>
+        </w:trPr>
+        <w:tc>
+          <w:tcPr>
+            <w:tcW w:type="dxa" w:w="2700"/>
+            <w:shd w:fill="1F3A5F" w:color="auto" w:val="clear"/>
+            <w:tcMar>
+              <w:top w:type="dxa" w:w="40"/>
+              <w:left w:type="dxa" w:w="70"/>
+              <w:bottom w:type="dxa" w:w="40"/>
+              <w:right w:type="dxa" w:w="70"/>
+            </w:tcMar>
+          </w:tcPr>
+          <w:p>
+            <w:pPr>
+              <w:spacing w:after="0"/>
+            </w:pPr>
+            <w:r>
+              <w:rPr>
+                <w:b/>
+                <w:bCs/>
+                <w:color w:val="FFFFFF"/>
+                <w:sz w:val="17"/>
+                <w:szCs w:val="17"/>
+              </w:rPr>
+              <w:t xml:space="preserve">Term</w:t>
+            </w:r>
+          </w:p>
+        </w:tc>
+        <w:tc>
+          <w:tcPr>
+            <w:tcW w:type="dxa" w:w="1500"/>
+            <w:shd w:fill="1F3A5F" w:color="auto" w:val="clear"/>
+            <w:tcMar>
+              <w:top w:type="dxa" w:w="40"/>
+              <w:left w:type="dxa" w:w="70"/>
+              <w:bottom w:type="dxa" w:w="40"/>
+              <w:right w:type="dxa" w:w="70"/>
+            </w:tcMar>
+          </w:tcPr>
+          <w:p>
+            <w:pPr>
+              <w:spacing w:after="0"/>
+            </w:pPr>
+            <w:r>
+              <w:rPr>
+                <w:b/>
+                <w:bCs/>
+                <w:color w:val="FFFFFF"/>
+                <w:sz w:val="17"/>
+                <w:szCs w:val="17"/>
+              </w:rPr>
+              <w:t xml:space="preserve">Keyword sales, last 4 weeks</w:t>
+            </w:r>
+          </w:p>
+        </w:tc>
+        <w:tc>
+          <w:tcPr>
+            <w:tcW w:type="dxa" w:w="3200"/>
+            <w:shd w:fill="1F3A5F" w:color="auto" w:val="clear"/>
+            <w:tcMar>
+              <w:top w:type="dxa" w:w="40"/>
+              <w:left w:type="dxa" w:w="70"/>
+              <w:bottom w:type="dxa" w:w="40"/>
+              <w:right w:type="dxa" w:w="70"/>
+            </w:tcMar>
+          </w:tcPr>
+          <w:p>
+            <w:pPr>
+              <w:spacing w:after="0"/>
+            </w:pPr>
+            <w:r>
+              <w:rPr>
+                <w:b/>
+                <w:bCs/>
+                <w:color w:val="FFFFFF"/>
+                <w:sz w:val="17"/>
+                <w:szCs w:val="17"/>
+              </w:rPr>
+              <w:t xml:space="preserve">True Bamboo rank: 4 Sep → 18 Sep → 27 Sep</w:t>
+            </w:r>
+          </w:p>
+        </w:tc>
+        <w:tc>
+          <w:tcPr>
+            <w:tcW w:type="dxa" w:w="2572"/>
+            <w:shd w:fill="1F3A5F" w:color="auto" w:val="clear"/>
+            <w:tcMar>
+              <w:top w:type="dxa" w:w="40"/>
+              <w:left w:type="dxa" w:w="70"/>
+              <w:bottom w:type="dxa" w:w="40"/>
+              <w:right w:type="dxa" w:w="70"/>
+            </w:tcMar>
+          </w:tcPr>
+          <w:p>
+            <w:pPr>
+              <w:spacing w:after="0"/>
+            </w:pPr>
+            <w:r>
+              <w:rPr>
+                <w:b/>
+                <w:bCs/>
+                <w:color w:val="FFFFFF"/>
+                <w:sz w:val="17"/>
+                <w:szCs w:val="17"/>
+              </w:rPr>
+              <w:t xml:space="preserve">B6 rank, 28 Sep</w:t>
+            </w:r>
+          </w:p>
+        </w:tc>
+      </w:tr>
+      <w:tr>
+        <w:tc>
+          <w:tcPr>
+            <w:tcW w:type="dxa" w:w="2700"/>
+            <w:shd w:fill="FFFFFF" w:color="auto" w:val="clear"/>
+            <w:tcMar>
+              <w:top w:type="dxa" w:w="40"/>
+              <w:left w:type="dxa" w:w="70"/>
+              <w:bottom w:type="dxa" w:w="40"/>
+              <w:right w:type="dxa" w:w="70"/>
+            </w:tcMar>
+          </w:tcPr>
+          <w:p>
+            <w:pPr>
+              <w:spacing w:after="0"/>
+            </w:pPr>
+            <w:r>
+              <w:rPr>
+                <w:sz w:val="17"/>
+                <w:szCs w:val="17"/>
+              </w:rPr>
+              <w:t xml:space="preserve">bamboo sheets</w:t>
+            </w:r>
+          </w:p>
+        </w:tc>
+        <w:tc>
+          <w:tcPr>
+            <w:tcW w:type="dxa" w:w="1500"/>
+            <w:shd w:fill="FFFFFF" w:color="auto" w:val="clear"/>
+            <w:tcMar>
+              <w:top w:type="dxa" w:w="40"/>
+              <w:left w:type="dxa" w:w="70"/>
+              <w:bottom w:type="dxa" w:w="40"/>
+              <w:right w:type="dxa" w:w="70"/>
+            </w:tcMar>
+          </w:tcPr>
+          <w:p>
+            <w:pPr>
+              <w:spacing w:after="0"/>
+            </w:pPr>
+            <w:r>
+              <w:rPr>
+                <w:sz w:val="17"/>
+                <w:szCs w:val="17"/>
+              </w:rPr>
+              <w:t xml:space="preserve">7,476</w:t>
+            </w:r>
+          </w:p>
+        </w:tc>
+        <w:tc>
+          <w:tcPr>
+            <w:tcW w:type="dxa" w:w="3200"/>
+            <w:shd w:fill="FFFFFF" w:color="auto" w:val="clear"/>
+            <w:tcMar>
+              <w:top w:type="dxa" w:w="40"/>
+              <w:left w:type="dxa" w:w="70"/>
+              <w:bottom w:type="dxa" w:w="40"/>
+              <w:right w:type="dxa" w:w="70"/>
+            </w:tcMar>
+          </w:tcPr>
+          <w:p>
+            <w:pPr>
+              <w:spacing w:after="0"/>
+            </w:pPr>
+            <w:r>
+              <w:rPr>
+                <w:sz w:val="17"/>
+                <w:szCs w:val="17"/>
+              </w:rPr>
+              <w:t xml:space="preserve">48 → 109 → 24</w:t>
+            </w:r>
+          </w:p>
+        </w:tc>
+        <w:tc>
+          <w:tcPr>
+            <w:tcW w:type="dxa" w:w="2572"/>
+            <w:shd w:fill="FFFFFF" w:color="auto" w:val="clear"/>
+            <w:tcMar>
+              <w:top w:type="dxa" w:w="40"/>
+              <w:left w:type="dxa" w:w="70"/>
+              <w:bottom w:type="dxa" w:w="40"/>
+              <w:right w:type="dxa" w:w="70"/>
+            </w:tcMar>
+          </w:tcPr>
+          <w:p>
+            <w:pPr>
+              <w:spacing w:after="0"/>
+            </w:pPr>
+            <w:r>
+              <w:rPr>
+                <w:sz w:val="17"/>
+                <w:szCs w:val="17"/>
+              </w:rPr>
+              <w:t xml:space="preserve">29</w:t>
+            </w:r>
+          </w:p>
+        </w:tc>
+      </w:tr>
+      <w:tr>
+        <w:tc>
+          <w:tcPr>
+            <w:tcW w:type="dxa" w:w="2700"/>
+            <w:shd w:fill="F2F5F9" w:color="auto" w:val="clear"/>
+            <w:tcMar>
+              <w:top w:type="dxa" w:w="40"/>
+              <w:left w:type="dxa" w:w="70"/>
+              <w:bottom w:type="dxa" w:w="40"/>
+              <w:right w:type="dxa" w:w="70"/>
+            </w:tcMar>
+          </w:tcPr>
+          <w:p>
+            <w:pPr>
+              <w:spacing w:after="0"/>
+            </w:pPr>
+            <w:r>
+              <w:rPr>
+                <w:sz w:val="17"/>
+                <w:szCs w:val="17"/>
+              </w:rPr>
+              <w:t xml:space="preserve">bamboo sheets queen size</w:t>
+            </w:r>
+          </w:p>
+        </w:tc>
+        <w:tc>
+          <w:tcPr>
+            <w:tcW w:type="dxa" w:w="1500"/>
+            <w:shd w:fill="F2F5F9" w:color="auto" w:val="clear"/>
+            <w:tcMar>
+              <w:top w:type="dxa" w:w="40"/>
+              <w:left w:type="dxa" w:w="70"/>
+              <w:bottom w:type="dxa" w:w="40"/>
+              <w:right w:type="dxa" w:w="70"/>
+            </w:tcMar>
+          </w:tcPr>
+          <w:p>
+            <w:pPr>
+              <w:spacing w:after="0"/>
+            </w:pPr>
+            <w:r>
+              <w:rPr>
+                <w:sz w:val="17"/>
+                <w:szCs w:val="17"/>
+              </w:rPr>
+              <w:t xml:space="preserve">2,583</w:t>
+            </w:r>
+          </w:p>
+        </w:tc>
+        <w:tc>
+          <w:tcPr>
+            <w:tcW w:type="dxa" w:w="3200"/>
+            <w:shd w:fill="F2F5F9" w:color="auto" w:val="clear"/>
+            <w:tcMar>
+              <w:top w:type="dxa" w:w="40"/>
+              <w:left w:type="dxa" w:w="70"/>
+              <w:bottom w:type="dxa" w:w="40"/>
+              <w:right w:type="dxa" w:w="70"/>
+            </w:tcMar>
+          </w:tcPr>
+          <w:p>
+            <w:pPr>
+              <w:spacing w:after="0"/>
+            </w:pPr>
+            <w:r>
+              <w:rPr>
+                <w:sz w:val="17"/>
+                <w:szCs w:val="17"/>
+              </w:rPr>
+              <w:t xml:space="preserve">114 → 33 → 3</w:t>
+            </w:r>
+          </w:p>
+        </w:tc>
+        <w:tc>
+          <w:tcPr>
+            <w:tcW w:type="dxa" w:w="2572"/>
+            <w:shd w:fill="F2F5F9" w:color="auto" w:val="clear"/>
+            <w:tcMar>
+              <w:top w:type="dxa" w:w="40"/>
+              <w:left w:type="dxa" w:w="70"/>
+              <w:bottom w:type="dxa" w:w="40"/>
+              <w:right w:type="dxa" w:w="70"/>
+            </w:tcMar>
+          </w:tcPr>
+          <w:p>
+            <w:pPr>
+              <w:spacing w:after="0"/>
+            </w:pPr>
+            <w:r>
+              <w:rPr>
+                <w:sz w:val="17"/>
+                <w:szCs w:val="17"/>
+              </w:rPr>
+              <w:t xml:space="preserve">21</w:t>
+            </w:r>
+          </w:p>
+        </w:tc>
+      </w:tr>
+      <w:tr>
+        <w:tc>
+          <w:tcPr>
+            <w:tcW w:type="dxa" w:w="2700"/>
+            <w:shd w:fill="FFFFFF" w:color="auto" w:val="clear"/>
+            <w:tcMar>
+              <w:top w:type="dxa" w:w="40"/>
+              <w:left w:type="dxa" w:w="70"/>
+              <w:bottom w:type="dxa" w:w="40"/>
+              <w:right w:type="dxa" w:w="70"/>
+            </w:tcMar>
+          </w:tcPr>
+          <w:p>
+            <w:pPr>
+              <w:spacing w:after="0"/>
+            </w:pPr>
+            <w:r>
+              <w:rPr>
+                <w:sz w:val="17"/>
+                <w:szCs w:val="17"/>
+              </w:rPr>
+              <w:t xml:space="preserve">cooling sheets queen</w:t>
+            </w:r>
+          </w:p>
+        </w:tc>
+        <w:tc>
+          <w:tcPr>
+            <w:tcW w:type="dxa" w:w="1500"/>
+            <w:shd w:fill="FFFFFF" w:color="auto" w:val="clear"/>
+            <w:tcMar>
+              <w:top w:type="dxa" w:w="40"/>
+              <w:left w:type="dxa" w:w="70"/>
+              <w:bottom w:type="dxa" w:w="40"/>
+              <w:right w:type="dxa" w:w="70"/>
+            </w:tcMar>
+          </w:tcPr>
+          <w:p>
+            <w:pPr>
+              <w:spacing w:after="0"/>
+            </w:pPr>
+            <w:r>
+              <w:rPr>
+                <w:sz w:val="17"/>
+                <w:szCs w:val="17"/>
+              </w:rPr>
+              <w:t xml:space="preserve">2,277</w:t>
+            </w:r>
+          </w:p>
+        </w:tc>
+        <w:tc>
+          <w:tcPr>
+            <w:tcW w:type="dxa" w:w="3200"/>
+            <w:shd w:fill="FFFFFF" w:color="auto" w:val="clear"/>
+            <w:tcMar>
+              <w:top w:type="dxa" w:w="40"/>
+              <w:left w:type="dxa" w:w="70"/>
+              <w:bottom w:type="dxa" w:w="40"/>
+              <w:right w:type="dxa" w:w="70"/>
+            </w:tcMar>
+          </w:tcPr>
+          <w:p>
+            <w:pPr>
+              <w:spacing w:after="0"/>
+            </w:pPr>
+            <w:r>
+              <w:rPr>
+                <w:sz w:val="17"/>
+                <w:szCs w:val="17"/>
+              </w:rPr>
+              <w:t xml:space="preserve">131 (9 Sep) → — → 19</w:t>
+            </w:r>
+          </w:p>
+        </w:tc>
+        <w:tc>
+          <w:tcPr>
+            <w:tcW w:type="dxa" w:w="2572"/>
+            <w:shd w:fill="FFFFFF" w:color="auto" w:val="clear"/>
+            <w:tcMar>
+              <w:top w:type="dxa" w:w="40"/>
+              <w:left w:type="dxa" w:w="70"/>
+              <w:bottom w:type="dxa" w:w="40"/>
+              <w:right w:type="dxa" w:w="70"/>
+            </w:tcMar>
+          </w:tcPr>
+          <w:p>
+            <w:pPr>
+              <w:spacing w:after="0"/>
+            </w:pPr>
+            <w:r>
+              <w:rPr>
+                <w:sz w:val="17"/>
+                <w:szCs w:val="17"/>
+              </w:rPr>
+              <w:t xml:space="preserve">not tracked</w:t>
+            </w:r>
+          </w:p>
+        </w:tc>
+      </w:tr>
+      <w:tr>
+        <w:tc>
+          <w:tcPr>
+            <w:tcW w:type="dxa" w:w="2700"/>
+            <w:shd w:fill="F2F5F9" w:color="auto" w:val="clear"/>
+            <w:tcMar>
+              <w:top w:type="dxa" w:w="40"/>
+              <w:left w:type="dxa" w:w="70"/>
+              <w:bottom w:type="dxa" w:w="40"/>
+              <w:right w:type="dxa" w:w="70"/>
+            </w:tcMar>
+          </w:tcPr>
+          <w:p>
+            <w:pPr>
+              <w:spacing w:after="0"/>
+            </w:pPr>
+            <w:r>
+              <w:rPr>
+                <w:sz w:val="17"/>
+                <w:szCs w:val="17"/>
+              </w:rPr>
+              <w:t xml:space="preserve">bamboo sheets king size</w:t>
+            </w:r>
+          </w:p>
+        </w:tc>
+        <w:tc>
+          <w:tcPr>
+            <w:tcW w:type="dxa" w:w="1500"/>
+            <w:shd w:fill="F2F5F9" w:color="auto" w:val="clear"/>
+            <w:tcMar>
+              <w:top w:type="dxa" w:w="40"/>
+              <w:left w:type="dxa" w:w="70"/>
+              <w:bottom w:type="dxa" w:w="40"/>
+              <w:right w:type="dxa" w:w="70"/>
+            </w:tcMar>
+          </w:tcPr>
+          <w:p>
+            <w:pPr>
+              <w:spacing w:after="0"/>
+            </w:pPr>
+            <w:r>
+              <w:rPr>
+                <w:sz w:val="17"/>
+                <w:szCs w:val="17"/>
+              </w:rPr>
+              <w:t xml:space="preserve">1,502</w:t>
+            </w:r>
+          </w:p>
+        </w:tc>
+        <w:tc>
+          <w:tcPr>
+            <w:tcW w:type="dxa" w:w="3200"/>
+            <w:shd w:fill="F2F5F9" w:color="auto" w:val="clear"/>
+            <w:tcMar>
+              <w:top w:type="dxa" w:w="40"/>
+              <w:left w:type="dxa" w:w="70"/>
+              <w:bottom w:type="dxa" w:w="40"/>
+              <w:right w:type="dxa" w:w="70"/>
+            </w:tcMar>
+          </w:tcPr>
+          <w:p>
+            <w:pPr>
+              <w:spacing w:after="0"/>
+            </w:pPr>
+            <w:r>
+              <w:rPr>
+                <w:sz w:val="17"/>
+                <w:szCs w:val="17"/>
+              </w:rPr>
+              <w:t xml:space="preserve">117 → 113 → 5</w:t>
+            </w:r>
+          </w:p>
+        </w:tc>
+        <w:tc>
+          <w:tcPr>
+            <w:tcW w:type="dxa" w:w="2572"/>
+            <w:shd w:fill="F2F5F9" w:color="auto" w:val="clear"/>
+            <w:tcMar>
+              <w:top w:type="dxa" w:w="40"/>
+              <w:left w:type="dxa" w:w="70"/>
+              <w:bottom w:type="dxa" w:w="40"/>
+              <w:right w:type="dxa" w:w="70"/>
+            </w:tcMar>
+          </w:tcPr>
+          <w:p>
+            <w:pPr>
+              <w:spacing w:after="0"/>
+            </w:pPr>
+            <w:r>
+              <w:rPr>
+                <w:sz w:val="17"/>
+                <w:szCs w:val="17"/>
+              </w:rPr>
+              <w:t xml:space="preserve">27</w:t>
+            </w:r>
+          </w:p>
+        </w:tc>
+      </w:tr>
+      <w:tr>
+        <w:tc>
+          <w:tcPr>
+            <w:tcW w:type="dxa" w:w="2700"/>
+            <w:shd w:fill="FFFFFF" w:color="auto" w:val="clear"/>
+            <w:tcMar>
+              <w:top w:type="dxa" w:w="40"/>
+              <w:left w:type="dxa" w:w="70"/>
+              <w:bottom w:type="dxa" w:w="40"/>
+              <w:right w:type="dxa" w:w="70"/>
+            </w:tcMar>
+          </w:tcPr>
+          <w:p>
+            <w:pPr>
+              <w:spacing w:after="0"/>
+            </w:pPr>
+            <w:r>
+              <w:rPr>
+                <w:sz w:val="17"/>
+                <w:szCs w:val="17"/>
+              </w:rPr>
+              <w:t xml:space="preserve">cooling sheets king size</w:t>
+            </w:r>
+          </w:p>
+        </w:tc>
+        <w:tc>
+          <w:tcPr>
+            <w:tcW w:type="dxa" w:w="1500"/>
+            <w:shd w:fill="FFFFFF" w:color="auto" w:val="clear"/>
+            <w:tcMar>
+              <w:top w:type="dxa" w:w="40"/>
+              <w:left w:type="dxa" w:w="70"/>
+              <w:bottom w:type="dxa" w:w="40"/>
+              <w:right w:type="dxa" w:w="70"/>
+            </w:tcMar>
+          </w:tcPr>
+          <w:p>
+            <w:pPr>
+              <w:spacing w:after="0"/>
+            </w:pPr>
+            <w:r>
+              <w:rPr>
+                <w:sz w:val="17"/>
+                <w:szCs w:val="17"/>
+              </w:rPr>
+              <w:t xml:space="preserve">1,468</w:t>
+            </w:r>
+          </w:p>
+        </w:tc>
+        <w:tc>
+          <w:tcPr>
+            <w:tcW w:type="dxa" w:w="3200"/>
+            <w:shd w:fill="FFFFFF" w:color="auto" w:val="clear"/>
+            <w:tcMar>
+              <w:top w:type="dxa" w:w="40"/>
+              <w:left w:type="dxa" w:w="70"/>
+              <w:bottom w:type="dxa" w:w="40"/>
+              <w:right w:type="dxa" w:w="70"/>
+            </w:tcMar>
+          </w:tcPr>
+          <w:p>
+            <w:pPr>
+              <w:spacing w:after="0"/>
+            </w:pPr>
+            <w:r>
+              <w:rPr>
+                <w:sz w:val="17"/>
+                <w:szCs w:val="17"/>
+              </w:rPr>
+              <w:t xml:space="preserve">— → 114 → 14</w:t>
+            </w:r>
+          </w:p>
+        </w:tc>
+        <w:tc>
+          <w:tcPr>
+            <w:tcW w:type="dxa" w:w="2572"/>
+            <w:shd w:fill="FFFFFF" w:color="auto" w:val="clear"/>
+            <w:tcMar>
+              <w:top w:type="dxa" w:w="40"/>
+              <w:left w:type="dxa" w:w="70"/>
+              <w:bottom w:type="dxa" w:w="40"/>
+              <w:right w:type="dxa" w:w="70"/>
+            </w:tcMar>
+          </w:tcPr>
+          <w:p>
+            <w:pPr>
+              <w:spacing w:after="0"/>
+            </w:pPr>
+            <w:r>
+              <w:rPr>
+                <w:sz w:val="17"/>
+                <w:szCs w:val="17"/>
+              </w:rPr>
+              <w:t xml:space="preserve">not tracked</w:t>
+            </w:r>
+          </w:p>
+        </w:tc>
+      </w:tr>
+      <w:tr>
+        <w:tc>
+          <w:tcPr>
+            <w:tcW w:type="dxa" w:w="2700"/>
+            <w:shd w:fill="F2F5F9" w:color="auto" w:val="clear"/>
+            <w:tcMar>
+              <w:top w:type="dxa" w:w="40"/>
+              <w:left w:type="dxa" w:w="70"/>
+              <w:bottom w:type="dxa" w:w="40"/>
+              <w:right w:type="dxa" w:w="70"/>
+            </w:tcMar>
+          </w:tcPr>
+          <w:p>
+            <w:pPr>
+              <w:spacing w:after="0"/>
+            </w:pPr>
+            <w:r>
+              <w:rPr>
+                <w:sz w:val="17"/>
+                <w:szCs w:val="17"/>
+              </w:rPr>
+              <w:t xml:space="preserve">bamboo sheets full</w:t>
+            </w:r>
+          </w:p>
+        </w:tc>
+        <w:tc>
+          <w:tcPr>
+            <w:tcW w:type="dxa" w:w="1500"/>
+            <w:shd w:fill="F2F5F9" w:color="auto" w:val="clear"/>
+            <w:tcMar>
+              <w:top w:type="dxa" w:w="40"/>
+              <w:left w:type="dxa" w:w="70"/>
+              <w:bottom w:type="dxa" w:w="40"/>
+              <w:right w:type="dxa" w:w="70"/>
+            </w:tcMar>
+          </w:tcPr>
+          <w:p>
+            <w:pPr>
+              <w:spacing w:after="0"/>
+            </w:pPr>
+            <w:r>
+              <w:rPr>
+                <w:sz w:val="17"/>
+                <w:szCs w:val="17"/>
+              </w:rPr>
+              <w:t xml:space="preserve">496</w:t>
+            </w:r>
+          </w:p>
+        </w:tc>
+        <w:tc>
+          <w:tcPr>
+            <w:tcW w:type="dxa" w:w="3200"/>
+            <w:shd w:fill="F2F5F9" w:color="auto" w:val="clear"/>
+            <w:tcMar>
+              <w:top w:type="dxa" w:w="40"/>
+              <w:left w:type="dxa" w:w="70"/>
+              <w:bottom w:type="dxa" w:w="40"/>
+              <w:right w:type="dxa" w:w="70"/>
+            </w:tcMar>
+          </w:tcPr>
+          <w:p>
+            <w:pPr>
+              <w:spacing w:after="0"/>
+            </w:pPr>
+            <w:r>
+              <w:rPr>
+                <w:sz w:val="17"/>
+                <w:szCs w:val="17"/>
+              </w:rPr>
+              <w:t xml:space="preserve">127 (7 Sep) → 43 → 13</w:t>
+            </w:r>
+          </w:p>
+        </w:tc>
+        <w:tc>
+          <w:tcPr>
+            <w:tcW w:type="dxa" w:w="2572"/>
+            <w:shd w:fill="F2F5F9" w:color="auto" w:val="clear"/>
+            <w:tcMar>
+              <w:top w:type="dxa" w:w="40"/>
+              <w:left w:type="dxa" w:w="70"/>
+              <w:bottom w:type="dxa" w:w="40"/>
+              <w:right w:type="dxa" w:w="70"/>
+            </w:tcMar>
+          </w:tcPr>
+          <w:p>
+            <w:pPr>
+              <w:spacing w:after="0"/>
+            </w:pPr>
+            <w:r>
+              <w:rPr>
+                <w:sz w:val="17"/>
+                <w:szCs w:val="17"/>
+              </w:rPr>
+              <w:t xml:space="preserve">18</w:t>
+            </w:r>
+          </w:p>
+        </w:tc>
+      </w:tr>
+      <w:tr>
+        <w:tc>
+          <w:tcPr>
+            <w:tcW w:type="dxa" w:w="2700"/>
+            <w:shd w:fill="FFFFFF" w:color="auto" w:val="clear"/>
+            <w:tcMar>
+              <w:top w:type="dxa" w:w="40"/>
+              <w:left w:type="dxa" w:w="70"/>
+              <w:bottom w:type="dxa" w:w="40"/>
+              <w:right w:type="dxa" w:w="70"/>
+            </w:tcMar>
+          </w:tcPr>
+          <w:p>
+            <w:pPr>
+              <w:spacing w:after="0"/>
+            </w:pPr>
+            <w:r>
+              <w:rPr>
+                <w:sz w:val="17"/>
+                <w:szCs w:val="17"/>
+              </w:rPr>
+              <w:t xml:space="preserve">bamboo cooling sheets</w:t>
+            </w:r>
+          </w:p>
+        </w:tc>
+        <w:tc>
+          <w:tcPr>
+            <w:tcW w:type="dxa" w:w="1500"/>
+            <w:shd w:fill="FFFFFF" w:color="auto" w:val="clear"/>
+            <w:tcMar>
+              <w:top w:type="dxa" w:w="40"/>
+              <w:left w:type="dxa" w:w="70"/>
+              <w:bottom w:type="dxa" w:w="40"/>
+              <w:right w:type="dxa" w:w="70"/>
+            </w:tcMar>
+          </w:tcPr>
+          <w:p>
+            <w:pPr>
+              <w:spacing w:after="0"/>
+            </w:pPr>
+            <w:r>
+              <w:rPr>
+                <w:sz w:val="17"/>
+                <w:szCs w:val="17"/>
+              </w:rPr>
+              <w:t xml:space="preserve">494</w:t>
+            </w:r>
+          </w:p>
+        </w:tc>
+        <w:tc>
+          <w:tcPr>
+            <w:tcW w:type="dxa" w:w="3200"/>
+            <w:shd w:fill="FFFFFF" w:color="auto" w:val="clear"/>
+            <w:tcMar>
+              <w:top w:type="dxa" w:w="40"/>
+              <w:left w:type="dxa" w:w="70"/>
+              <w:bottom w:type="dxa" w:w="40"/>
+              <w:right w:type="dxa" w:w="70"/>
+            </w:tcMar>
+          </w:tcPr>
+          <w:p>
+            <w:pPr>
+              <w:spacing w:after="0"/>
+            </w:pPr>
+            <w:r>
+              <w:rPr>
+                <w:sz w:val="17"/>
+                <w:szCs w:val="17"/>
+              </w:rPr>
+              <w:t xml:space="preserve">85 → 58 → 29</w:t>
+            </w:r>
+          </w:p>
+        </w:tc>
+        <w:tc>
+          <w:tcPr>
+            <w:tcW w:type="dxa" w:w="2572"/>
+            <w:shd w:fill="FFFFFF" w:color="auto" w:val="clear"/>
+            <w:tcMar>
+              <w:top w:type="dxa" w:w="40"/>
+              <w:left w:type="dxa" w:w="70"/>
+              <w:bottom w:type="dxa" w:w="40"/>
+              <w:right w:type="dxa" w:w="70"/>
+            </w:tcMar>
+          </w:tcPr>
+          <w:p>
+            <w:pPr>
+              <w:spacing w:after="0"/>
+            </w:pPr>
+            <w:r>
+              <w:rPr>
+                <w:sz w:val="17"/>
+                <w:szCs w:val="17"/>
+              </w:rPr>
+              <w:t xml:space="preserve">20</w:t>
+            </w:r>
+          </w:p>
+        </w:tc>
+      </w:tr>
+      <w:tr>
+        <w:tc>
+          <w:tcPr>
+            <w:tcW w:type="dxa" w:w="2700"/>
+            <w:shd w:fill="F2F5F9" w:color="auto" w:val="clear"/>
+            <w:tcMar>
+              <w:top w:type="dxa" w:w="40"/>
+              <w:left w:type="dxa" w:w="70"/>
+              <w:bottom w:type="dxa" w:w="40"/>
+              <w:right w:type="dxa" w:w="70"/>
+            </w:tcMar>
+          </w:tcPr>
+          <w:p>
+            <w:pPr>
+              <w:spacing w:after="0"/>
+            </w:pPr>
+            <w:r>
+              <w:rPr>
+                <w:sz w:val="17"/>
+                <w:szCs w:val="17"/>
+              </w:rPr>
+              <w:t xml:space="preserve">queen bamboo sheet set</w:t>
+            </w:r>
+          </w:p>
+        </w:tc>
+        <w:tc>
+          <w:tcPr>
+            <w:tcW w:type="dxa" w:w="1500"/>
+            <w:shd w:fill="F2F5F9" w:color="auto" w:val="clear"/>
+            <w:tcMar>
+              <w:top w:type="dxa" w:w="40"/>
+              <w:left w:type="dxa" w:w="70"/>
+              <w:bottom w:type="dxa" w:w="40"/>
+              <w:right w:type="dxa" w:w="70"/>
+            </w:tcMar>
+          </w:tcPr>
+          <w:p>
+            <w:pPr>
+              <w:spacing w:after="0"/>
+            </w:pPr>
+            <w:r>
+              <w:rPr>
+                <w:sz w:val="17"/>
+                <w:szCs w:val="17"/>
+              </w:rPr>
+              <w:t xml:space="preserve">476</w:t>
+            </w:r>
+          </w:p>
+        </w:tc>
+        <w:tc>
+          <w:tcPr>
+            <w:tcW w:type="dxa" w:w="3200"/>
+            <w:shd w:fill="F2F5F9" w:color="auto" w:val="clear"/>
+            <w:tcMar>
+              <w:top w:type="dxa" w:w="40"/>
+              <w:left w:type="dxa" w:w="70"/>
+              <w:bottom w:type="dxa" w:w="40"/>
+              <w:right w:type="dxa" w:w="70"/>
+            </w:tcMar>
+          </w:tcPr>
+          <w:p>
+            <w:pPr>
+              <w:spacing w:after="0"/>
+            </w:pPr>
+            <w:r>
+              <w:rPr>
+                <w:sz w:val="17"/>
+                <w:szCs w:val="17"/>
+              </w:rPr>
+              <w:t xml:space="preserve">67 → 46 → 2</w:t>
+            </w:r>
+          </w:p>
+        </w:tc>
+        <w:tc>
+          <w:tcPr>
+            <w:tcW w:type="dxa" w:w="2572"/>
+            <w:shd w:fill="F2F5F9" w:color="auto" w:val="clear"/>
+            <w:tcMar>
+              <w:top w:type="dxa" w:w="40"/>
+              <w:left w:type="dxa" w:w="70"/>
+              <w:bottom w:type="dxa" w:w="40"/>
+              <w:right w:type="dxa" w:w="70"/>
+            </w:tcMar>
+          </w:tcPr>
+          <w:p>
+            <w:pPr>
+              <w:spacing w:after="0"/>
+            </w:pPr>
+            <w:r>
+              <w:rPr>
+                <w:sz w:val="17"/>
+                <w:szCs w:val="17"/>
+              </w:rPr>
+              <w:t xml:space="preserve">25</w:t>
+            </w:r>
+          </w:p>
+        </w:tc>
+      </w:tr>
+      <w:tr>
+        <w:tc>
+          <w:tcPr>
+            <w:tcW w:type="dxa" w:w="2700"/>
+            <w:shd w:fill="FFFFFF" w:color="auto" w:val="clear"/>
+            <w:tcMar>
+              <w:top w:type="dxa" w:w="40"/>
+              <w:left w:type="dxa" w:w="70"/>
+              <w:bottom w:type="dxa" w:w="40"/>
+              <w:right w:type="dxa" w:w="70"/>
+            </w:tcMar>
+          </w:tcPr>
+          <w:p>
+            <w:pPr>
+              <w:spacing w:after="0"/>
+            </w:pPr>
+            <w:r>
+              <w:rPr>
+                <w:sz w:val="17"/>
+                <w:szCs w:val="17"/>
+              </w:rPr>
+              <w:t xml:space="preserve">bamboo sheets king</w:t>
+            </w:r>
+          </w:p>
+        </w:tc>
+        <w:tc>
+          <w:tcPr>
+            <w:tcW w:type="dxa" w:w="1500"/>
+            <w:shd w:fill="FFFFFF" w:color="auto" w:val="clear"/>
+            <w:tcMar>
+              <w:top w:type="dxa" w:w="40"/>
+              <w:left w:type="dxa" w:w="70"/>
+              <w:bottom w:type="dxa" w:w="40"/>
+              <w:right w:type="dxa" w:w="70"/>
+            </w:tcMar>
+          </w:tcPr>
+          <w:p>
+            <w:pPr>
+              <w:spacing w:after="0"/>
+            </w:pPr>
+            <w:r>
+              <w:rPr>
+                <w:sz w:val="17"/>
+                <w:szCs w:val="17"/>
+              </w:rPr>
+              <w:t xml:space="preserve">475</w:t>
+            </w:r>
+          </w:p>
+        </w:tc>
+        <w:tc>
+          <w:tcPr>
+            <w:tcW w:type="dxa" w:w="3200"/>
+            <w:shd w:fill="FFFFFF" w:color="auto" w:val="clear"/>
+            <w:tcMar>
+              <w:top w:type="dxa" w:w="40"/>
+              <w:left w:type="dxa" w:w="70"/>
+              <w:bottom w:type="dxa" w:w="40"/>
+              <w:right w:type="dxa" w:w="70"/>
+            </w:tcMar>
+          </w:tcPr>
+          <w:p>
+            <w:pPr>
+              <w:spacing w:after="0"/>
+            </w:pPr>
+            <w:r>
+              <w:rPr>
+                <w:sz w:val="17"/>
+                <w:szCs w:val="17"/>
+              </w:rPr>
+              <w:t xml:space="preserve">88 → 80 → 9</w:t>
+            </w:r>
+          </w:p>
+        </w:tc>
+        <w:tc>
+          <w:tcPr>
+            <w:tcW w:type="dxa" w:w="2572"/>
+            <w:shd w:fill="FFFFFF" w:color="auto" w:val="clear"/>
+            <w:tcMar>
+              <w:top w:type="dxa" w:w="40"/>
+              <w:left w:type="dxa" w:w="70"/>
+              <w:bottom w:type="dxa" w:w="40"/>
+              <w:right w:type="dxa" w:w="70"/>
+            </w:tcMar>
+          </w:tcPr>
+          <w:p>
+            <w:pPr>
+              <w:spacing w:after="0"/>
+            </w:pPr>
+            <w:r>
+              <w:rPr>
+                <w:sz w:val="17"/>
+                <w:szCs w:val="17"/>
+              </w:rPr>
+              <w:t xml:space="preserve">19</w:t>
+            </w:r>
+          </w:p>
+        </w:tc>
+      </w:tr>
+    </w:tbl>
+    <w:p>
+      <w:pPr>
+        <w:spacing w:after="120"/>
+      </w:pPr>
+      <w:r>
+        <w:rPr>
+          <w:i/>
+          <w:iCs/>
+          <w:color w:val="555555"/>
+          <w:sz w:val="17"/>
+          <w:szCs w:val="17"/>
+        </w:rPr>
+        <w:t xml:space="preserve">ASinsight rank and keyword sales for B0HD7R5L1D; B6 ranks from our daily rank crawl. Whether True Bamboo ran a deal in this window is not known.</w:t>
+      </w:r>
+    </w:p>
+    <w:p>
+      <w:pPr>
+        <w:spacing w:after="100"/>
+      </w:pPr>
+      <w:r>
+        <w:t xml:space="preserve">On “bamboo sheets king size”, ASinsight’s hourly view shows True Bamboo’s organic rank going from about 50 on 21 September to 4 by 25 September, while its sponsored rank sat at the top most hours of every day. What this means for B6:</w:t>
+      </w:r>
+    </w:p>
+    <w:p>
+      <w:pPr>
+        <w:pStyle w:val="ListParagraph"/>
+        <w:numPr>
+          <w:ilvl w:val="0"/>
+          <w:numId w:val="3"/>
+        </w:numPr>
+        <w:spacing w:after="60"/>
+      </w:pPr>
+      <w:r>
+        <w:t xml:space="preserve">Rank moves in days, not months, when the ad holds the top slot all day with enough clicks. The audit’s targets run to 26 November and later.</w:t>
+      </w:r>
+    </w:p>
+    <w:p>
+      <w:pPr>
+        <w:pStyle w:val="ListParagraph"/>
+        <w:numPr>
+          <w:ilvl w:val="0"/>
+          <w:numId w:val="3"/>
+        </w:numPr>
+        <w:spacing w:after="60"/>
+      </w:pPr>
+      <w:r>
+        <w:t xml:space="preserve">Our click-through and conversion at the top already beat the market on these terms (Section 5.4), so the listing is not the main blocker; volume at the top is. “bamboo sheets” gets 7 of the 69 top-of-search clicks a day its plan needs, “bamboo sheets queen size” under 1 of 44, and “bamboo sheets king size” almost none of 24.</w:t>
+      </w:r>
+    </w:p>
+    <w:p>
+      <w:pPr>
+        <w:pStyle w:val="ListParagraph"/>
+        <w:numPr>
+          <w:ilvl w:val="0"/>
+          <w:numId w:val="3"/>
+        </w:numPr>
+        <w:spacing w:after="60"/>
+      </w:pPr>
+      <w:r>
+        <w:t xml:space="preserve">The earlier version of these corrections was still too cautious in two places: one 30% step a week, and fixing the mix before pushing. Both now happen together, with daily steps.</w:t>
+      </w:r>
+    </w:p>
+    <w:p>
+      <w:pPr>
+        <w:pStyle w:val="ListParagraph"/>
+        <w:numPr>
+          <w:ilvl w:val="0"/>
+          <w:numId w:val="3"/>
+        </w:numPr>
+        <w:spacing w:after="60"/>
+      </w:pPr>
+      <w:r>
+        <w:t xml:space="preserve">Check the listing against True Bamboo on the push terms anyway (main image, title, price and coupon, reviews), so the extra clicks convert.</w:t>
+      </w:r>
+    </w:p>
+    <w:p>
+      <w:pPr>
+        <w:pStyle w:val="Heading2"/>
+      </w:pPr>
+      <w:r>
+        <w:t xml:space="preserve">5.3 The push plan</w:t>
+      </w:r>
+    </w:p>
+    <w:p>
+      <w:pPr>
+        <w:spacing w:after="100"/>
+      </w:pPr>
+      <w:r>
+        <w:t xml:space="preserve">Eight terms get pushed now, and two more once they are tracked. Each has a plan for clicks, orders and budget a day, tuned weekly on results:</w:t>
+      </w:r>
+    </w:p>
+    <w:tbl>
+      <w:tblPr>
+        <w:tblW w:type="dxa" w:w="9972"/>
+        <w:tblBorders>
+          <w:top w:val="single" w:color="auto" w:sz="4"/>
+          <w:left w:val="single" w:color="auto" w:sz="4"/>
+          <w:bottom w:val="single" w:color="auto" w:sz="4"/>
+          <w:right w:val="single" w:color="auto" w:sz="4"/>
+          <w:insideH w:val="single" w:color="auto" w:sz="4"/>
+          <w:insideV w:val="single" w:color="auto" w:sz="4"/>
+        </w:tblBorders>
+      </w:tblPr>
+      <w:tblGrid>
+        <w:gridCol w:w="2300"/>
+        <w:gridCol w:w="1100"/>
+        <w:gridCol w:w="1300"/>
+        <w:gridCol w:w="1000"/>
+        <w:gridCol w:w="1000"/>
+        <w:gridCol w:w="1500"/>
+        <w:gridCol w:w="1772"/>
+      </w:tblGrid>
+      <w:tr>
+        <w:trPr>
+          <w:tblHeader/>
+        </w:trPr>
+        <w:tc>
+          <w:tcPr>
+            <w:tcW w:type="dxa" w:w="2300"/>
+            <w:shd w:fill="1F3A5F" w:color="auto" w:val="clear"/>
+            <w:tcMar>
+              <w:top w:type="dxa" w:w="40"/>
+              <w:left w:type="dxa" w:w="70"/>
+              <w:bottom w:type="dxa" w:w="40"/>
+              <w:right w:type="dxa" w:w="70"/>
+            </w:tcMar>
+          </w:tcPr>
+          <w:p>
+            <w:pPr>
+              <w:spacing w:after="0"/>
+            </w:pPr>
+            <w:r>
+              <w:rPr>
+                <w:b/>
+                <w:bCs/>
+                <w:color w:val="FFFFFF"/>
+                <w:sz w:val="17"/>
+                <w:szCs w:val="17"/>
+              </w:rPr>
+              <w:t xml:space="preserve">Term</w:t>
+            </w:r>
+          </w:p>
+        </w:tc>
+        <w:tc>
+          <w:tcPr>
+            <w:tcW w:type="dxa" w:w="1100"/>
+            <w:shd w:fill="1F3A5F" w:color="auto" w:val="clear"/>
+            <w:tcMar>
+              <w:top w:type="dxa" w:w="40"/>
+              <w:left w:type="dxa" w:w="70"/>
+              <w:bottom w:type="dxa" w:w="40"/>
+              <w:right w:type="dxa" w:w="70"/>
+            </w:tcMar>
+          </w:tcPr>
+          <w:p>
+            <w:pPr>
+              <w:spacing w:after="0"/>
+            </w:pPr>
+            <w:r>
+              <w:rPr>
+                <w:b/>
+                <w:bCs/>
+                <w:color w:val="FFFFFF"/>
+                <w:sz w:val="17"/>
+                <w:szCs w:val="17"/>
+              </w:rPr>
+              <w:t xml:space="preserve">Rank now → target</w:t>
+            </w:r>
+          </w:p>
+        </w:tc>
+        <w:tc>
+          <w:tcPr>
+            <w:tcW w:type="dxa" w:w="1300"/>
+            <w:shd w:fill="1F3A5F" w:color="auto" w:val="clear"/>
+            <w:tcMar>
+              <w:top w:type="dxa" w:w="40"/>
+              <w:left w:type="dxa" w:w="70"/>
+              <w:bottom w:type="dxa" w:w="40"/>
+              <w:right w:type="dxa" w:w="70"/>
+            </w:tcMar>
+          </w:tcPr>
+          <w:p>
+            <w:pPr>
+              <w:spacing w:after="0"/>
+            </w:pPr>
+            <w:r>
+              <w:rPr>
+                <w:b/>
+                <w:bCs/>
+                <w:color w:val="FFFFFF"/>
+                <w:sz w:val="17"/>
+                <w:szCs w:val="17"/>
+              </w:rPr>
+              <w:t xml:space="preserve">Top-of-search clicks a day: plan · today</w:t>
+            </w:r>
+          </w:p>
+        </w:tc>
+        <w:tc>
+          <w:tcPr>
+            <w:tcW w:type="dxa" w:w="1000"/>
+            <w:shd w:fill="1F3A5F" w:color="auto" w:val="clear"/>
+            <w:tcMar>
+              <w:top w:type="dxa" w:w="40"/>
+              <w:left w:type="dxa" w:w="70"/>
+              <w:bottom w:type="dxa" w:w="40"/>
+              <w:right w:type="dxa" w:w="70"/>
+            </w:tcMar>
+          </w:tcPr>
+          <w:p>
+            <w:pPr>
+              <w:spacing w:after="0"/>
+            </w:pPr>
+            <w:r>
+              <w:rPr>
+                <w:b/>
+                <w:bCs/>
+                <w:color w:val="FFFFFF"/>
+                <w:sz w:val="17"/>
+                <w:szCs w:val="17"/>
+              </w:rPr>
+              <w:t xml:space="preserve">Top-of-search conversion</w:t>
+            </w:r>
+          </w:p>
+        </w:tc>
+        <w:tc>
+          <w:tcPr>
+            <w:tcW w:type="dxa" w:w="1000"/>
+            <w:shd w:fill="1F3A5F" w:color="auto" w:val="clear"/>
+            <w:tcMar>
+              <w:top w:type="dxa" w:w="40"/>
+              <w:left w:type="dxa" w:w="70"/>
+              <w:bottom w:type="dxa" w:w="40"/>
+              <w:right w:type="dxa" w:w="70"/>
+            </w:tcMar>
+          </w:tcPr>
+          <w:p>
+            <w:pPr>
+              <w:spacing w:after="0"/>
+            </w:pPr>
+            <w:r>
+              <w:rPr>
+                <w:b/>
+                <w:bCs/>
+                <w:color w:val="FFFFFF"/>
+                <w:sz w:val="17"/>
+                <w:szCs w:val="17"/>
+              </w:rPr>
+              <w:t xml:space="preserve">Orders a day expected</w:t>
+            </w:r>
+          </w:p>
+        </w:tc>
+        <w:tc>
+          <w:tcPr>
+            <w:tcW w:type="dxa" w:w="1500"/>
+            <w:shd w:fill="1F3A5F" w:color="auto" w:val="clear"/>
+            <w:tcMar>
+              <w:top w:type="dxa" w:w="40"/>
+              <w:left w:type="dxa" w:w="70"/>
+              <w:bottom w:type="dxa" w:w="40"/>
+              <w:right w:type="dxa" w:w="70"/>
+            </w:tcMar>
+          </w:tcPr>
+          <w:p>
+            <w:pPr>
+              <w:spacing w:after="0"/>
+            </w:pPr>
+            <w:r>
+              <w:rPr>
+                <w:b/>
+                <w:bCs/>
+                <w:color w:val="FFFFFF"/>
+                <w:sz w:val="17"/>
+                <w:szCs w:val="17"/>
+              </w:rPr>
+              <w:t xml:space="preserve">Top-of-search price this week (ceiling)</w:t>
+            </w:r>
+          </w:p>
+        </w:tc>
+        <w:tc>
+          <w:tcPr>
+            <w:tcW w:type="dxa" w:w="1772"/>
+            <w:shd w:fill="1F3A5F" w:color="auto" w:val="clear"/>
+            <w:tcMar>
+              <w:top w:type="dxa" w:w="40"/>
+              <w:left w:type="dxa" w:w="70"/>
+              <w:bottom w:type="dxa" w:w="40"/>
+              <w:right w:type="dxa" w:w="70"/>
+            </w:tcMar>
+          </w:tcPr>
+          <w:p>
+            <w:pPr>
+              <w:spacing w:after="0"/>
+            </w:pPr>
+            <w:r>
+              <w:rPr>
+                <w:b/>
+                <w:bCs/>
+                <w:color w:val="FFFFFF"/>
+                <w:sz w:val="17"/>
+                <w:szCs w:val="17"/>
+              </w:rPr>
+              <w:t xml:space="preserve">Budget a day</w:t>
+            </w:r>
+          </w:p>
+        </w:tc>
+      </w:tr>
+      <w:tr>
+        <w:tc>
+          <w:tcPr>
+            <w:tcW w:type="dxa" w:w="2300"/>
+            <w:shd w:fill="FFFFFF" w:color="auto" w:val="clear"/>
+            <w:tcMar>
+              <w:top w:type="dxa" w:w="40"/>
+              <w:left w:type="dxa" w:w="70"/>
+              <w:bottom w:type="dxa" w:w="40"/>
+              <w:right w:type="dxa" w:w="70"/>
+            </w:tcMar>
+          </w:tcPr>
+          <w:p>
+            <w:pPr>
+              <w:spacing w:after="0"/>
+            </w:pPr>
+            <w:r>
+              <w:rPr>
+                <w:sz w:val="17"/>
+                <w:szCs w:val="17"/>
+              </w:rPr>
+              <w:t xml:space="preserve">bamboo sheets</w:t>
+            </w:r>
+          </w:p>
+        </w:tc>
+        <w:tc>
+          <w:tcPr>
+            <w:tcW w:type="dxa" w:w="1100"/>
+            <w:shd w:fill="FFFFFF" w:color="auto" w:val="clear"/>
+            <w:tcMar>
+              <w:top w:type="dxa" w:w="40"/>
+              <w:left w:type="dxa" w:w="70"/>
+              <w:bottom w:type="dxa" w:w="40"/>
+              <w:right w:type="dxa" w:w="70"/>
+            </w:tcMar>
+          </w:tcPr>
+          <w:p>
+            <w:pPr>
+              <w:spacing w:after="0"/>
+            </w:pPr>
+            <w:r>
+              <w:rPr>
+                <w:sz w:val="17"/>
+                <w:szCs w:val="17"/>
+              </w:rPr>
+              <w:t xml:space="preserve">29 → 9</w:t>
+            </w:r>
+          </w:p>
+        </w:tc>
+        <w:tc>
+          <w:tcPr>
+            <w:tcW w:type="dxa" w:w="1300"/>
+            <w:shd w:fill="FFFFFF" w:color="auto" w:val="clear"/>
+            <w:tcMar>
+              <w:top w:type="dxa" w:w="40"/>
+              <w:left w:type="dxa" w:w="70"/>
+              <w:bottom w:type="dxa" w:w="40"/>
+              <w:right w:type="dxa" w:w="70"/>
+            </w:tcMar>
+          </w:tcPr>
+          <w:p>
+            <w:pPr>
+              <w:spacing w:after="0"/>
+            </w:pPr>
+            <w:r>
+              <w:rPr>
+                <w:sz w:val="17"/>
+                <w:szCs w:val="17"/>
+              </w:rPr>
+              <w:t xml:space="preserve">69 · 7</w:t>
+            </w:r>
+          </w:p>
+        </w:tc>
+        <w:tc>
+          <w:tcPr>
+            <w:tcW w:type="dxa" w:w="1000"/>
+            <w:shd w:fill="FFFFFF" w:color="auto" w:val="clear"/>
+            <w:tcMar>
+              <w:top w:type="dxa" w:w="40"/>
+              <w:left w:type="dxa" w:w="70"/>
+              <w:bottom w:type="dxa" w:w="40"/>
+              <w:right w:type="dxa" w:w="70"/>
+            </w:tcMar>
+          </w:tcPr>
+          <w:p>
+            <w:pPr>
+              <w:spacing w:after="0"/>
+            </w:pPr>
+            <w:r>
+              <w:rPr>
+                <w:sz w:val="17"/>
+                <w:szCs w:val="17"/>
+              </w:rPr>
+              <w:t xml:space="preserve">19.3%</w:t>
+            </w:r>
+          </w:p>
+        </w:tc>
+        <w:tc>
+          <w:tcPr>
+            <w:tcW w:type="dxa" w:w="1000"/>
+            <w:shd w:fill="FFFFFF" w:color="auto" w:val="clear"/>
+            <w:tcMar>
+              <w:top w:type="dxa" w:w="40"/>
+              <w:left w:type="dxa" w:w="70"/>
+              <w:bottom w:type="dxa" w:w="40"/>
+              <w:right w:type="dxa" w:w="70"/>
+            </w:tcMar>
+          </w:tcPr>
+          <w:p>
+            <w:pPr>
+              <w:spacing w:after="0"/>
+            </w:pPr>
+            <w:r>
+              <w:rPr>
+                <w:sz w:val="17"/>
+                <w:szCs w:val="17"/>
+              </w:rPr>
+              <w:t xml:space="preserve">13.3</w:t>
+            </w:r>
+          </w:p>
+        </w:tc>
+        <w:tc>
+          <w:tcPr>
+            <w:tcW w:type="dxa" w:w="1500"/>
+            <w:shd w:fill="FFFFFF" w:color="auto" w:val="clear"/>
+            <w:tcMar>
+              <w:top w:type="dxa" w:w="40"/>
+              <w:left w:type="dxa" w:w="70"/>
+              <w:bottom w:type="dxa" w:w="40"/>
+              <w:right w:type="dxa" w:w="70"/>
+            </w:tcMar>
+          </w:tcPr>
+          <w:p>
+            <w:pPr>
+              <w:spacing w:after="0"/>
+            </w:pPr>
+            <w:r>
+              <w:rPr>
+                <w:sz w:val="17"/>
+                <w:szCs w:val="17"/>
+              </w:rPr>
+              <w:t xml:space="preserve">$6.16 ($6.16)</w:t>
+            </w:r>
+          </w:p>
+        </w:tc>
+        <w:tc>
+          <w:tcPr>
+            <w:tcW w:type="dxa" w:w="1772"/>
+            <w:shd w:fill="FFFFFF" w:color="auto" w:val="clear"/>
+            <w:tcMar>
+              <w:top w:type="dxa" w:w="40"/>
+              <w:left w:type="dxa" w:w="70"/>
+              <w:bottom w:type="dxa" w:w="40"/>
+              <w:right w:type="dxa" w:w="70"/>
+            </w:tcMar>
+          </w:tcPr>
+          <w:p>
+            <w:pPr>
+              <w:spacing w:after="0"/>
+            </w:pPr>
+            <w:r>
+              <w:rPr>
+                <w:sz w:val="17"/>
+                <w:szCs w:val="17"/>
+              </w:rPr>
+              <w:t xml:space="preserve">$425</w:t>
+            </w:r>
+          </w:p>
+        </w:tc>
+      </w:tr>
+      <w:tr>
+        <w:tc>
+          <w:tcPr>
+            <w:tcW w:type="dxa" w:w="2300"/>
+            <w:shd w:fill="F2F5F9" w:color="auto" w:val="clear"/>
+            <w:tcMar>
+              <w:top w:type="dxa" w:w="40"/>
+              <w:left w:type="dxa" w:w="70"/>
+              <w:bottom w:type="dxa" w:w="40"/>
+              <w:right w:type="dxa" w:w="70"/>
+            </w:tcMar>
+          </w:tcPr>
+          <w:p>
+            <w:pPr>
+              <w:spacing w:after="0"/>
+            </w:pPr>
+            <w:r>
+              <w:rPr>
+                <w:sz w:val="17"/>
+                <w:szCs w:val="17"/>
+              </w:rPr>
+              <w:t xml:space="preserve">bamboo sheets queen size</w:t>
+            </w:r>
+          </w:p>
+        </w:tc>
+        <w:tc>
+          <w:tcPr>
+            <w:tcW w:type="dxa" w:w="1100"/>
+            <w:shd w:fill="F2F5F9" w:color="auto" w:val="clear"/>
+            <w:tcMar>
+              <w:top w:type="dxa" w:w="40"/>
+              <w:left w:type="dxa" w:w="70"/>
+              <w:bottom w:type="dxa" w:w="40"/>
+              <w:right w:type="dxa" w:w="70"/>
+            </w:tcMar>
+          </w:tcPr>
+          <w:p>
+            <w:pPr>
+              <w:spacing w:after="0"/>
+            </w:pPr>
+            <w:r>
+              <w:rPr>
+                <w:sz w:val="17"/>
+                <w:szCs w:val="17"/>
+              </w:rPr>
+              <w:t xml:space="preserve">21 → 5</w:t>
+            </w:r>
+          </w:p>
+        </w:tc>
+        <w:tc>
+          <w:tcPr>
+            <w:tcW w:type="dxa" w:w="1300"/>
+            <w:shd w:fill="F2F5F9" w:color="auto" w:val="clear"/>
+            <w:tcMar>
+              <w:top w:type="dxa" w:w="40"/>
+              <w:left w:type="dxa" w:w="70"/>
+              <w:bottom w:type="dxa" w:w="40"/>
+              <w:right w:type="dxa" w:w="70"/>
+            </w:tcMar>
+          </w:tcPr>
+          <w:p>
+            <w:pPr>
+              <w:spacing w:after="0"/>
+            </w:pPr>
+            <w:r>
+              <w:rPr>
+                <w:sz w:val="17"/>
+                <w:szCs w:val="17"/>
+              </w:rPr>
+              <w:t xml:space="preserve">44 · 0.8</w:t>
+            </w:r>
+          </w:p>
+        </w:tc>
+        <w:tc>
+          <w:tcPr>
+            <w:tcW w:type="dxa" w:w="1000"/>
+            <w:shd w:fill="F2F5F9" w:color="auto" w:val="clear"/>
+            <w:tcMar>
+              <w:top w:type="dxa" w:w="40"/>
+              <w:left w:type="dxa" w:w="70"/>
+              <w:bottom w:type="dxa" w:w="40"/>
+              <w:right w:type="dxa" w:w="70"/>
+            </w:tcMar>
+          </w:tcPr>
+          <w:p>
+            <w:pPr>
+              <w:spacing w:after="0"/>
+            </w:pPr>
+            <w:r>
+              <w:rPr>
+                <w:sz w:val="17"/>
+                <w:szCs w:val="17"/>
+              </w:rPr>
+              <w:t xml:space="preserve">22.7%</w:t>
+            </w:r>
+          </w:p>
+        </w:tc>
+        <w:tc>
+          <w:tcPr>
+            <w:tcW w:type="dxa" w:w="1000"/>
+            <w:shd w:fill="F2F5F9" w:color="auto" w:val="clear"/>
+            <w:tcMar>
+              <w:top w:type="dxa" w:w="40"/>
+              <w:left w:type="dxa" w:w="70"/>
+              <w:bottom w:type="dxa" w:w="40"/>
+              <w:right w:type="dxa" w:w="70"/>
+            </w:tcMar>
+          </w:tcPr>
+          <w:p>
+            <w:pPr>
+              <w:spacing w:after="0"/>
+            </w:pPr>
+            <w:r>
+              <w:rPr>
+                <w:sz w:val="17"/>
+                <w:szCs w:val="17"/>
+              </w:rPr>
+              <w:t xml:space="preserve">10.0</w:t>
+            </w:r>
+          </w:p>
+        </w:tc>
+        <w:tc>
+          <w:tcPr>
+            <w:tcW w:type="dxa" w:w="1500"/>
+            <w:shd w:fill="F2F5F9" w:color="auto" w:val="clear"/>
+            <w:tcMar>
+              <w:top w:type="dxa" w:w="40"/>
+              <w:left w:type="dxa" w:w="70"/>
+              <w:bottom w:type="dxa" w:w="40"/>
+              <w:right w:type="dxa" w:w="70"/>
+            </w:tcMar>
+          </w:tcPr>
+          <w:p>
+            <w:pPr>
+              <w:spacing w:after="0"/>
+            </w:pPr>
+            <w:r>
+              <w:rPr>
+                <w:sz w:val="17"/>
+                <w:szCs w:val="17"/>
+              </w:rPr>
+              <w:t xml:space="preserve">$7.71 ($8.86)</w:t>
+            </w:r>
+          </w:p>
+        </w:tc>
+        <w:tc>
+          <w:tcPr>
+            <w:tcW w:type="dxa" w:w="1772"/>
+            <w:shd w:fill="F2F5F9" w:color="auto" w:val="clear"/>
+            <w:tcMar>
+              <w:top w:type="dxa" w:w="40"/>
+              <w:left w:type="dxa" w:w="70"/>
+              <w:bottom w:type="dxa" w:w="40"/>
+              <w:right w:type="dxa" w:w="70"/>
+            </w:tcMar>
+          </w:tcPr>
+          <w:p>
+            <w:pPr>
+              <w:spacing w:after="0"/>
+            </w:pPr>
+            <w:r>
+              <w:rPr>
+                <w:sz w:val="17"/>
+                <w:szCs w:val="17"/>
+              </w:rPr>
+              <w:t xml:space="preserve">$339</w:t>
+            </w:r>
+          </w:p>
+        </w:tc>
+      </w:tr>
+      <w:tr>
+        <w:tc>
+          <w:tcPr>
+            <w:tcW w:type="dxa" w:w="2300"/>
+            <w:shd w:fill="FFFFFF" w:color="auto" w:val="clear"/>
+            <w:tcMar>
+              <w:top w:type="dxa" w:w="40"/>
+              <w:left w:type="dxa" w:w="70"/>
+              <w:bottom w:type="dxa" w:w="40"/>
+              <w:right w:type="dxa" w:w="70"/>
+            </w:tcMar>
+          </w:tcPr>
+          <w:p>
+            <w:pPr>
+              <w:spacing w:after="0"/>
+            </w:pPr>
+            <w:r>
+              <w:rPr>
+                <w:sz w:val="17"/>
+                <w:szCs w:val="17"/>
+              </w:rPr>
+              <w:t xml:space="preserve">bamboo sheets king size</w:t>
+            </w:r>
+          </w:p>
+        </w:tc>
+        <w:tc>
+          <w:tcPr>
+            <w:tcW w:type="dxa" w:w="1100"/>
+            <w:shd w:fill="FFFFFF" w:color="auto" w:val="clear"/>
+            <w:tcMar>
+              <w:top w:type="dxa" w:w="40"/>
+              <w:left w:type="dxa" w:w="70"/>
+              <w:bottom w:type="dxa" w:w="40"/>
+              <w:right w:type="dxa" w:w="70"/>
+            </w:tcMar>
+          </w:tcPr>
+          <w:p>
+            <w:pPr>
+              <w:spacing w:after="0"/>
+            </w:pPr>
+            <w:r>
+              <w:rPr>
+                <w:sz w:val="17"/>
+                <w:szCs w:val="17"/>
+              </w:rPr>
+              <w:t xml:space="preserve">27 → 10</w:t>
+            </w:r>
+          </w:p>
+        </w:tc>
+        <w:tc>
+          <w:tcPr>
+            <w:tcW w:type="dxa" w:w="1300"/>
+            <w:shd w:fill="FFFFFF" w:color="auto" w:val="clear"/>
+            <w:tcMar>
+              <w:top w:type="dxa" w:w="40"/>
+              <w:left w:type="dxa" w:w="70"/>
+              <w:bottom w:type="dxa" w:w="40"/>
+              <w:right w:type="dxa" w:w="70"/>
+            </w:tcMar>
+          </w:tcPr>
+          <w:p>
+            <w:pPr>
+              <w:spacing w:after="0"/>
+            </w:pPr>
+            <w:r>
+              <w:rPr>
+                <w:sz w:val="17"/>
+                <w:szCs w:val="17"/>
+              </w:rPr>
+              <w:t xml:space="preserve">24 · 0.1</w:t>
+            </w:r>
+          </w:p>
+        </w:tc>
+        <w:tc>
+          <w:tcPr>
+            <w:tcW w:type="dxa" w:w="1000"/>
+            <w:shd w:fill="FFFFFF" w:color="auto" w:val="clear"/>
+            <w:tcMar>
+              <w:top w:type="dxa" w:w="40"/>
+              <w:left w:type="dxa" w:w="70"/>
+              <w:bottom w:type="dxa" w:w="40"/>
+              <w:right w:type="dxa" w:w="70"/>
+            </w:tcMar>
+          </w:tcPr>
+          <w:p>
+            <w:pPr>
+              <w:spacing w:after="0"/>
+            </w:pPr>
+            <w:r>
+              <w:rPr>
+                <w:sz w:val="17"/>
+                <w:szCs w:val="17"/>
+              </w:rPr>
+              <w:t xml:space="preserve">17.9%*</w:t>
+            </w:r>
+          </w:p>
+        </w:tc>
+        <w:tc>
+          <w:tcPr>
+            <w:tcW w:type="dxa" w:w="1000"/>
+            <w:shd w:fill="FFFFFF" w:color="auto" w:val="clear"/>
+            <w:tcMar>
+              <w:top w:type="dxa" w:w="40"/>
+              <w:left w:type="dxa" w:w="70"/>
+              <w:bottom w:type="dxa" w:w="40"/>
+              <w:right w:type="dxa" w:w="70"/>
+            </w:tcMar>
+          </w:tcPr>
+          <w:p>
+            <w:pPr>
+              <w:spacing w:after="0"/>
+            </w:pPr>
+            <w:r>
+              <w:rPr>
+                <w:sz w:val="17"/>
+                <w:szCs w:val="17"/>
+              </w:rPr>
+              <w:t xml:space="preserve">4.3</w:t>
+            </w:r>
+          </w:p>
+        </w:tc>
+        <w:tc>
+          <w:tcPr>
+            <w:tcW w:type="dxa" w:w="1500"/>
+            <w:shd w:fill="FFFFFF" w:color="auto" w:val="clear"/>
+            <w:tcMar>
+              <w:top w:type="dxa" w:w="40"/>
+              <w:left w:type="dxa" w:w="70"/>
+              <w:bottom w:type="dxa" w:w="40"/>
+              <w:right w:type="dxa" w:w="70"/>
+            </w:tcMar>
+          </w:tcPr>
+          <w:p>
+            <w:pPr>
+              <w:spacing w:after="0"/>
+            </w:pPr>
+            <w:r>
+              <w:rPr>
+                <w:sz w:val="17"/>
+                <w:szCs w:val="17"/>
+              </w:rPr>
+              <w:t xml:space="preserve">$5.29 ($5.72)</w:t>
+            </w:r>
+          </w:p>
+        </w:tc>
+        <w:tc>
+          <w:tcPr>
+            <w:tcW w:type="dxa" w:w="1772"/>
+            <w:shd w:fill="FFFFFF" w:color="auto" w:val="clear"/>
+            <w:tcMar>
+              <w:top w:type="dxa" w:w="40"/>
+              <w:left w:type="dxa" w:w="70"/>
+              <w:bottom w:type="dxa" w:w="40"/>
+              <w:right w:type="dxa" w:w="70"/>
+            </w:tcMar>
+          </w:tcPr>
+          <w:p>
+            <w:pPr>
+              <w:spacing w:after="0"/>
+            </w:pPr>
+            <w:r>
+              <w:rPr>
+                <w:sz w:val="17"/>
+                <w:szCs w:val="17"/>
+              </w:rPr>
+              <w:t xml:space="preserve">$127</w:t>
+            </w:r>
+          </w:p>
+        </w:tc>
+      </w:tr>
+      <w:tr>
+        <w:tc>
+          <w:tcPr>
+            <w:tcW w:type="dxa" w:w="2300"/>
+            <w:shd w:fill="F2F5F9" w:color="auto" w:val="clear"/>
+            <w:tcMar>
+              <w:top w:type="dxa" w:w="40"/>
+              <w:left w:type="dxa" w:w="70"/>
+              <w:bottom w:type="dxa" w:w="40"/>
+              <w:right w:type="dxa" w:w="70"/>
+            </w:tcMar>
+          </w:tcPr>
+          <w:p>
+            <w:pPr>
+              <w:spacing w:after="0"/>
+            </w:pPr>
+            <w:r>
+              <w:rPr>
+                <w:sz w:val="17"/>
+                <w:szCs w:val="17"/>
+              </w:rPr>
+              <w:t xml:space="preserve">bamboo sheets full</w:t>
+            </w:r>
+          </w:p>
+        </w:tc>
+        <w:tc>
+          <w:tcPr>
+            <w:tcW w:type="dxa" w:w="1100"/>
+            <w:shd w:fill="F2F5F9" w:color="auto" w:val="clear"/>
+            <w:tcMar>
+              <w:top w:type="dxa" w:w="40"/>
+              <w:left w:type="dxa" w:w="70"/>
+              <w:bottom w:type="dxa" w:w="40"/>
+              <w:right w:type="dxa" w:w="70"/>
+            </w:tcMar>
+          </w:tcPr>
+          <w:p>
+            <w:pPr>
+              <w:spacing w:after="0"/>
+            </w:pPr>
+            <w:r>
+              <w:rPr>
+                <w:sz w:val="17"/>
+                <w:szCs w:val="17"/>
+              </w:rPr>
+              <w:t xml:space="preserve">18 → 2</w:t>
+            </w:r>
+          </w:p>
+        </w:tc>
+        <w:tc>
+          <w:tcPr>
+            <w:tcW w:type="dxa" w:w="1300"/>
+            <w:shd w:fill="F2F5F9" w:color="auto" w:val="clear"/>
+            <w:tcMar>
+              <w:top w:type="dxa" w:w="40"/>
+              <w:left w:type="dxa" w:w="70"/>
+              <w:bottom w:type="dxa" w:w="40"/>
+              <w:right w:type="dxa" w:w="70"/>
+            </w:tcMar>
+          </w:tcPr>
+          <w:p>
+            <w:pPr>
+              <w:spacing w:after="0"/>
+            </w:pPr>
+            <w:r>
+              <w:rPr>
+                <w:sz w:val="17"/>
+                <w:szCs w:val="17"/>
+              </w:rPr>
+              <w:t xml:space="preserve">22 · 0 (paused)</w:t>
+            </w:r>
+          </w:p>
+        </w:tc>
+        <w:tc>
+          <w:tcPr>
+            <w:tcW w:type="dxa" w:w="1000"/>
+            <w:shd w:fill="F2F5F9" w:color="auto" w:val="clear"/>
+            <w:tcMar>
+              <w:top w:type="dxa" w:w="40"/>
+              <w:left w:type="dxa" w:w="70"/>
+              <w:bottom w:type="dxa" w:w="40"/>
+              <w:right w:type="dxa" w:w="70"/>
+            </w:tcMar>
+          </w:tcPr>
+          <w:p>
+            <w:pPr>
+              <w:spacing w:after="0"/>
+            </w:pPr>
+            <w:r>
+              <w:rPr>
+                <w:sz w:val="17"/>
+                <w:szCs w:val="17"/>
+              </w:rPr>
+              <w:t xml:space="preserve">12.5%*</w:t>
+            </w:r>
+          </w:p>
+        </w:tc>
+        <w:tc>
+          <w:tcPr>
+            <w:tcW w:type="dxa" w:w="1000"/>
+            <w:shd w:fill="F2F5F9" w:color="auto" w:val="clear"/>
+            <w:tcMar>
+              <w:top w:type="dxa" w:w="40"/>
+              <w:left w:type="dxa" w:w="70"/>
+              <w:bottom w:type="dxa" w:w="40"/>
+              <w:right w:type="dxa" w:w="70"/>
+            </w:tcMar>
+          </w:tcPr>
+          <w:p>
+            <w:pPr>
+              <w:spacing w:after="0"/>
+            </w:pPr>
+            <w:r>
+              <w:rPr>
+                <w:sz w:val="17"/>
+                <w:szCs w:val="17"/>
+              </w:rPr>
+              <w:t xml:space="preserve">2.7</w:t>
+            </w:r>
+          </w:p>
+        </w:tc>
+        <w:tc>
+          <w:tcPr>
+            <w:tcW w:type="dxa" w:w="1500"/>
+            <w:shd w:fill="F2F5F9" w:color="auto" w:val="clear"/>
+            <w:tcMar>
+              <w:top w:type="dxa" w:w="40"/>
+              <w:left w:type="dxa" w:w="70"/>
+              <w:bottom w:type="dxa" w:w="40"/>
+              <w:right w:type="dxa" w:w="70"/>
+            </w:tcMar>
+          </w:tcPr>
+          <w:p>
+            <w:pPr>
+              <w:spacing w:after="0"/>
+            </w:pPr>
+            <w:r>
+              <w:rPr>
+                <w:sz w:val="17"/>
+                <w:szCs w:val="17"/>
+              </w:rPr>
+              <w:t xml:space="preserve">$5.52 ($5.52)</w:t>
+            </w:r>
+          </w:p>
+        </w:tc>
+        <w:tc>
+          <w:tcPr>
+            <w:tcW w:type="dxa" w:w="1772"/>
+            <w:shd w:fill="F2F5F9" w:color="auto" w:val="clear"/>
+            <w:tcMar>
+              <w:top w:type="dxa" w:w="40"/>
+              <w:left w:type="dxa" w:w="70"/>
+              <w:bottom w:type="dxa" w:w="40"/>
+              <w:right w:type="dxa" w:w="70"/>
+            </w:tcMar>
+          </w:tcPr>
+          <w:p>
+            <w:pPr>
+              <w:spacing w:after="0"/>
+            </w:pPr>
+            <w:r>
+              <w:rPr>
+                <w:sz w:val="17"/>
+                <w:szCs w:val="17"/>
+              </w:rPr>
+              <w:t xml:space="preserve">$121</w:t>
+            </w:r>
+          </w:p>
+        </w:tc>
+      </w:tr>
+      <w:tr>
+        <w:tc>
+          <w:tcPr>
+            <w:tcW w:type="dxa" w:w="2300"/>
+            <w:shd w:fill="FFFFFF" w:color="auto" w:val="clear"/>
+            <w:tcMar>
+              <w:top w:type="dxa" w:w="40"/>
+              <w:left w:type="dxa" w:w="70"/>
+              <w:bottom w:type="dxa" w:w="40"/>
+              <w:right w:type="dxa" w:w="70"/>
+            </w:tcMar>
+          </w:tcPr>
+          <w:p>
+            <w:pPr>
+              <w:spacing w:after="0"/>
+            </w:pPr>
+            <w:r>
+              <w:rPr>
+                <w:sz w:val="17"/>
+                <w:szCs w:val="17"/>
+              </w:rPr>
+              <w:t xml:space="preserve">bamboo cooling sheets</w:t>
+            </w:r>
+          </w:p>
+        </w:tc>
+        <w:tc>
+          <w:tcPr>
+            <w:tcW w:type="dxa" w:w="1100"/>
+            <w:shd w:fill="FFFFFF" w:color="auto" w:val="clear"/>
+            <w:tcMar>
+              <w:top w:type="dxa" w:w="40"/>
+              <w:left w:type="dxa" w:w="70"/>
+              <w:bottom w:type="dxa" w:w="40"/>
+              <w:right w:type="dxa" w:w="70"/>
+            </w:tcMar>
+          </w:tcPr>
+          <w:p>
+            <w:pPr>
+              <w:spacing w:after="0"/>
+            </w:pPr>
+            <w:r>
+              <w:rPr>
+                <w:sz w:val="17"/>
+                <w:szCs w:val="17"/>
+              </w:rPr>
+              <w:t xml:space="preserve">20 → 5</w:t>
+            </w:r>
+          </w:p>
+        </w:tc>
+        <w:tc>
+          <w:tcPr>
+            <w:tcW w:type="dxa" w:w="1300"/>
+            <w:shd w:fill="FFFFFF" w:color="auto" w:val="clear"/>
+            <w:tcMar>
+              <w:top w:type="dxa" w:w="40"/>
+              <w:left w:type="dxa" w:w="70"/>
+              <w:bottom w:type="dxa" w:w="40"/>
+              <w:right w:type="dxa" w:w="70"/>
+            </w:tcMar>
+          </w:tcPr>
+          <w:p>
+            <w:pPr>
+              <w:spacing w:after="0"/>
+            </w:pPr>
+            <w:r>
+              <w:rPr>
+                <w:sz w:val="17"/>
+                <w:szCs w:val="17"/>
+              </w:rPr>
+              <w:t xml:space="preserve">20 · 0.1</w:t>
+            </w:r>
+          </w:p>
+        </w:tc>
+        <w:tc>
+          <w:tcPr>
+            <w:tcW w:type="dxa" w:w="1000"/>
+            <w:shd w:fill="FFFFFF" w:color="auto" w:val="clear"/>
+            <w:tcMar>
+              <w:top w:type="dxa" w:w="40"/>
+              <w:left w:type="dxa" w:w="70"/>
+              <w:bottom w:type="dxa" w:w="40"/>
+              <w:right w:type="dxa" w:w="70"/>
+            </w:tcMar>
+          </w:tcPr>
+          <w:p>
+            <w:pPr>
+              <w:spacing w:after="0"/>
+            </w:pPr>
+            <w:r>
+              <w:rPr>
+                <w:sz w:val="17"/>
+                <w:szCs w:val="17"/>
+              </w:rPr>
+              <w:t xml:space="preserve">11.5%*</w:t>
+            </w:r>
+          </w:p>
+        </w:tc>
+        <w:tc>
+          <w:tcPr>
+            <w:tcW w:type="dxa" w:w="1000"/>
+            <w:shd w:fill="FFFFFF" w:color="auto" w:val="clear"/>
+            <w:tcMar>
+              <w:top w:type="dxa" w:w="40"/>
+              <w:left w:type="dxa" w:w="70"/>
+              <w:bottom w:type="dxa" w:w="40"/>
+              <w:right w:type="dxa" w:w="70"/>
+            </w:tcMar>
+          </w:tcPr>
+          <w:p>
+            <w:pPr>
+              <w:spacing w:after="0"/>
+            </w:pPr>
+            <w:r>
+              <w:rPr>
+                <w:sz w:val="17"/>
+                <w:szCs w:val="17"/>
+              </w:rPr>
+              <w:t xml:space="preserve">2.3</w:t>
+            </w:r>
+          </w:p>
+        </w:tc>
+        <w:tc>
+          <w:tcPr>
+            <w:tcW w:type="dxa" w:w="1500"/>
+            <w:shd w:fill="FFFFFF" w:color="auto" w:val="clear"/>
+            <w:tcMar>
+              <w:top w:type="dxa" w:w="40"/>
+              <w:left w:type="dxa" w:w="70"/>
+              <w:bottom w:type="dxa" w:w="40"/>
+              <w:right w:type="dxa" w:w="70"/>
+            </w:tcMar>
+          </w:tcPr>
+          <w:p>
+            <w:pPr>
+              <w:spacing w:after="0"/>
+            </w:pPr>
+            <w:r>
+              <w:rPr>
+                <w:sz w:val="17"/>
+                <w:szCs w:val="17"/>
+              </w:rPr>
+              <w:t xml:space="preserve">$4.11 ($4.49)</w:t>
+            </w:r>
+          </w:p>
+        </w:tc>
+        <w:tc>
+          <w:tcPr>
+            <w:tcW w:type="dxa" w:w="1772"/>
+            <w:shd w:fill="FFFFFF" w:color="auto" w:val="clear"/>
+            <w:tcMar>
+              <w:top w:type="dxa" w:w="40"/>
+              <w:left w:type="dxa" w:w="70"/>
+              <w:bottom w:type="dxa" w:w="40"/>
+              <w:right w:type="dxa" w:w="70"/>
+            </w:tcMar>
+          </w:tcPr>
+          <w:p>
+            <w:pPr>
+              <w:spacing w:after="0"/>
+            </w:pPr>
+            <w:r>
+              <w:rPr>
+                <w:sz w:val="17"/>
+                <w:szCs w:val="17"/>
+              </w:rPr>
+              <w:t xml:space="preserve">$82</w:t>
+            </w:r>
+          </w:p>
+        </w:tc>
+      </w:tr>
+      <w:tr>
+        <w:tc>
+          <w:tcPr>
+            <w:tcW w:type="dxa" w:w="2300"/>
+            <w:shd w:fill="F2F5F9" w:color="auto" w:val="clear"/>
+            <w:tcMar>
+              <w:top w:type="dxa" w:w="40"/>
+              <w:left w:type="dxa" w:w="70"/>
+              <w:bottom w:type="dxa" w:w="40"/>
+              <w:right w:type="dxa" w:w="70"/>
+            </w:tcMar>
+          </w:tcPr>
+          <w:p>
+            <w:pPr>
+              <w:spacing w:after="0"/>
+            </w:pPr>
+            <w:r>
+              <w:rPr>
+                <w:sz w:val="17"/>
+                <w:szCs w:val="17"/>
+              </w:rPr>
+              <w:t xml:space="preserve">queen bamboo sheet set</w:t>
+            </w:r>
+          </w:p>
+        </w:tc>
+        <w:tc>
+          <w:tcPr>
+            <w:tcW w:type="dxa" w:w="1100"/>
+            <w:shd w:fill="F2F5F9" w:color="auto" w:val="clear"/>
+            <w:tcMar>
+              <w:top w:type="dxa" w:w="40"/>
+              <w:left w:type="dxa" w:w="70"/>
+              <w:bottom w:type="dxa" w:w="40"/>
+              <w:right w:type="dxa" w:w="70"/>
+            </w:tcMar>
+          </w:tcPr>
+          <w:p>
+            <w:pPr>
+              <w:spacing w:after="0"/>
+            </w:pPr>
+            <w:r>
+              <w:rPr>
+                <w:sz w:val="17"/>
+                <w:szCs w:val="17"/>
+              </w:rPr>
+              <w:t xml:space="preserve">25 → 6</w:t>
+            </w:r>
+          </w:p>
+        </w:tc>
+        <w:tc>
+          <w:tcPr>
+            <w:tcW w:type="dxa" w:w="1300"/>
+            <w:shd w:fill="F2F5F9" w:color="auto" w:val="clear"/>
+            <w:tcMar>
+              <w:top w:type="dxa" w:w="40"/>
+              <w:left w:type="dxa" w:w="70"/>
+              <w:bottom w:type="dxa" w:w="40"/>
+              <w:right w:type="dxa" w:w="70"/>
+            </w:tcMar>
+          </w:tcPr>
+          <w:p>
+            <w:pPr>
+              <w:spacing w:after="0"/>
+            </w:pPr>
+            <w:r>
+              <w:rPr>
+                <w:sz w:val="17"/>
+                <w:szCs w:val="17"/>
+              </w:rPr>
+              <w:t xml:space="preserve">5 · 0.9</w:t>
+            </w:r>
+          </w:p>
+        </w:tc>
+        <w:tc>
+          <w:tcPr>
+            <w:tcW w:type="dxa" w:w="1000"/>
+            <w:shd w:fill="F2F5F9" w:color="auto" w:val="clear"/>
+            <w:tcMar>
+              <w:top w:type="dxa" w:w="40"/>
+              <w:left w:type="dxa" w:w="70"/>
+              <w:bottom w:type="dxa" w:w="40"/>
+              <w:right w:type="dxa" w:w="70"/>
+            </w:tcMar>
+          </w:tcPr>
+          <w:p>
+            <w:pPr>
+              <w:spacing w:after="0"/>
+            </w:pPr>
+            <w:r>
+              <w:rPr>
+                <w:sz w:val="17"/>
+                <w:szCs w:val="17"/>
+              </w:rPr>
+              <w:t xml:space="preserve">21.1%</w:t>
+            </w:r>
+          </w:p>
+        </w:tc>
+        <w:tc>
+          <w:tcPr>
+            <w:tcW w:type="dxa" w:w="1000"/>
+            <w:shd w:fill="F2F5F9" w:color="auto" w:val="clear"/>
+            <w:tcMar>
+              <w:top w:type="dxa" w:w="40"/>
+              <w:left w:type="dxa" w:w="70"/>
+              <w:bottom w:type="dxa" w:w="40"/>
+              <w:right w:type="dxa" w:w="70"/>
+            </w:tcMar>
+          </w:tcPr>
+          <w:p>
+            <w:pPr>
+              <w:spacing w:after="0"/>
+            </w:pPr>
+            <w:r>
+              <w:rPr>
+                <w:sz w:val="17"/>
+                <w:szCs w:val="17"/>
+              </w:rPr>
+              <w:t xml:space="preserve">1.1</w:t>
+            </w:r>
+          </w:p>
+        </w:tc>
+        <w:tc>
+          <w:tcPr>
+            <w:tcW w:type="dxa" w:w="1500"/>
+            <w:shd w:fill="F2F5F9" w:color="auto" w:val="clear"/>
+            <w:tcMar>
+              <w:top w:type="dxa" w:w="40"/>
+              <w:left w:type="dxa" w:w="70"/>
+              <w:bottom w:type="dxa" w:w="40"/>
+              <w:right w:type="dxa" w:w="70"/>
+            </w:tcMar>
+          </w:tcPr>
+          <w:p>
+            <w:pPr>
+              <w:spacing w:after="0"/>
+            </w:pPr>
+            <w:r>
+              <w:rPr>
+                <w:sz w:val="17"/>
+                <w:szCs w:val="17"/>
+              </w:rPr>
+              <w:t xml:space="preserve">$7.10 ($7.10)</w:t>
+            </w:r>
+          </w:p>
+        </w:tc>
+        <w:tc>
+          <w:tcPr>
+            <w:tcW w:type="dxa" w:w="1772"/>
+            <w:shd w:fill="F2F5F9" w:color="auto" w:val="clear"/>
+            <w:tcMar>
+              <w:top w:type="dxa" w:w="40"/>
+              <w:left w:type="dxa" w:w="70"/>
+              <w:bottom w:type="dxa" w:w="40"/>
+              <w:right w:type="dxa" w:w="70"/>
+            </w:tcMar>
+          </w:tcPr>
+          <w:p>
+            <w:pPr>
+              <w:spacing w:after="0"/>
+            </w:pPr>
+            <w:r>
+              <w:rPr>
+                <w:sz w:val="17"/>
+                <w:szCs w:val="17"/>
+              </w:rPr>
+              <w:t xml:space="preserve">$36</w:t>
+            </w:r>
+          </w:p>
+        </w:tc>
+      </w:tr>
+      <w:tr>
+        <w:tc>
+          <w:tcPr>
+            <w:tcW w:type="dxa" w:w="2300"/>
+            <w:shd w:fill="FFFFFF" w:color="auto" w:val="clear"/>
+            <w:tcMar>
+              <w:top w:type="dxa" w:w="40"/>
+              <w:left w:type="dxa" w:w="70"/>
+              <w:bottom w:type="dxa" w:w="40"/>
+              <w:right w:type="dxa" w:w="70"/>
+            </w:tcMar>
+          </w:tcPr>
+          <w:p>
+            <w:pPr>
+              <w:spacing w:after="0"/>
+            </w:pPr>
+            <w:r>
+              <w:rPr>
+                <w:sz w:val="17"/>
+                <w:szCs w:val="17"/>
+              </w:rPr>
+              <w:t xml:space="preserve">bamboo sheets king</w:t>
+            </w:r>
+          </w:p>
+        </w:tc>
+        <w:tc>
+          <w:tcPr>
+            <w:tcW w:type="dxa" w:w="1100"/>
+            <w:shd w:fill="FFFFFF" w:color="auto" w:val="clear"/>
+            <w:tcMar>
+              <w:top w:type="dxa" w:w="40"/>
+              <w:left w:type="dxa" w:w="70"/>
+              <w:bottom w:type="dxa" w:w="40"/>
+              <w:right w:type="dxa" w:w="70"/>
+            </w:tcMar>
+          </w:tcPr>
+          <w:p>
+            <w:pPr>
+              <w:spacing w:after="0"/>
+            </w:pPr>
+            <w:r>
+              <w:rPr>
+                <w:sz w:val="17"/>
+                <w:szCs w:val="17"/>
+              </w:rPr>
+              <w:t xml:space="preserve">19 → 9</w:t>
+            </w:r>
+          </w:p>
+        </w:tc>
+        <w:tc>
+          <w:tcPr>
+            <w:tcW w:type="dxa" w:w="1300"/>
+            <w:shd w:fill="FFFFFF" w:color="auto" w:val="clear"/>
+            <w:tcMar>
+              <w:top w:type="dxa" w:w="40"/>
+              <w:left w:type="dxa" w:w="70"/>
+              <w:bottom w:type="dxa" w:w="40"/>
+              <w:right w:type="dxa" w:w="70"/>
+            </w:tcMar>
+          </w:tcPr>
+          <w:p>
+            <w:pPr>
+              <w:spacing w:after="0"/>
+            </w:pPr>
+            <w:r>
+              <w:rPr>
+                <w:sz w:val="17"/>
+                <w:szCs w:val="17"/>
+              </w:rPr>
+              <w:t xml:space="preserve">11 · —</w:t>
+            </w:r>
+          </w:p>
+        </w:tc>
+        <w:tc>
+          <w:tcPr>
+            <w:tcW w:type="dxa" w:w="1000"/>
+            <w:shd w:fill="FFFFFF" w:color="auto" w:val="clear"/>
+            <w:tcMar>
+              <w:top w:type="dxa" w:w="40"/>
+              <w:left w:type="dxa" w:w="70"/>
+              <w:bottom w:type="dxa" w:w="40"/>
+              <w:right w:type="dxa" w:w="70"/>
+            </w:tcMar>
+          </w:tcPr>
+          <w:p>
+            <w:pPr>
+              <w:spacing w:after="0"/>
+            </w:pPr>
+            <w:r>
+              <w:rPr>
+                <w:sz w:val="17"/>
+                <w:szCs w:val="17"/>
+              </w:rPr>
+              <w:t xml:space="preserve">12.1%*</w:t>
+            </w:r>
+          </w:p>
+        </w:tc>
+        <w:tc>
+          <w:tcPr>
+            <w:tcW w:type="dxa" w:w="1000"/>
+            <w:shd w:fill="FFFFFF" w:color="auto" w:val="clear"/>
+            <w:tcMar>
+              <w:top w:type="dxa" w:w="40"/>
+              <w:left w:type="dxa" w:w="70"/>
+              <w:bottom w:type="dxa" w:w="40"/>
+              <w:right w:type="dxa" w:w="70"/>
+            </w:tcMar>
+          </w:tcPr>
+          <w:p>
+            <w:pPr>
+              <w:spacing w:after="0"/>
+            </w:pPr>
+            <w:r>
+              <w:rPr>
+                <w:sz w:val="17"/>
+                <w:szCs w:val="17"/>
+              </w:rPr>
+              <w:t xml:space="preserve">1.3</w:t>
+            </w:r>
+          </w:p>
+        </w:tc>
+        <w:tc>
+          <w:tcPr>
+            <w:tcW w:type="dxa" w:w="1500"/>
+            <w:shd w:fill="FFFFFF" w:color="auto" w:val="clear"/>
+            <w:tcMar>
+              <w:top w:type="dxa" w:w="40"/>
+              <w:left w:type="dxa" w:w="70"/>
+              <w:bottom w:type="dxa" w:w="40"/>
+              <w:right w:type="dxa" w:w="70"/>
+            </w:tcMar>
+          </w:tcPr>
+          <w:p>
+            <w:pPr>
+              <w:spacing w:after="0"/>
+            </w:pPr>
+            <w:r>
+              <w:rPr>
+                <w:sz w:val="17"/>
+                <w:szCs w:val="17"/>
+              </w:rPr>
+              <w:t xml:space="preserve">$3.09 ($3.86)</w:t>
+            </w:r>
+          </w:p>
+        </w:tc>
+        <w:tc>
+          <w:tcPr>
+            <w:tcW w:type="dxa" w:w="1772"/>
+            <w:shd w:fill="FFFFFF" w:color="auto" w:val="clear"/>
+            <w:tcMar>
+              <w:top w:type="dxa" w:w="40"/>
+              <w:left w:type="dxa" w:w="70"/>
+              <w:bottom w:type="dxa" w:w="40"/>
+              <w:right w:type="dxa" w:w="70"/>
+            </w:tcMar>
+          </w:tcPr>
+          <w:p>
+            <w:pPr>
+              <w:spacing w:after="0"/>
+            </w:pPr>
+            <w:r>
+              <w:rPr>
+                <w:sz w:val="17"/>
+                <w:szCs w:val="17"/>
+              </w:rPr>
+              <w:t xml:space="preserve">$34</w:t>
+            </w:r>
+          </w:p>
+        </w:tc>
+      </w:tr>
+      <w:tr>
+        <w:tc>
+          <w:tcPr>
+            <w:tcW w:type="dxa" w:w="2300"/>
+            <w:shd w:fill="F2F5F9" w:color="auto" w:val="clear"/>
+            <w:tcMar>
+              <w:top w:type="dxa" w:w="40"/>
+              <w:left w:type="dxa" w:w="70"/>
+              <w:bottom w:type="dxa" w:w="40"/>
+              <w:right w:type="dxa" w:w="70"/>
+            </w:tcMar>
+          </w:tcPr>
+          <w:p>
+            <w:pPr>
+              <w:spacing w:after="0"/>
+            </w:pPr>
+            <w:r>
+              <w:rPr>
+                <w:sz w:val="17"/>
+                <w:szCs w:val="17"/>
+              </w:rPr>
+              <w:t xml:space="preserve">full size bamboo sheets</w:t>
+            </w:r>
+          </w:p>
+        </w:tc>
+        <w:tc>
+          <w:tcPr>
+            <w:tcW w:type="dxa" w:w="1100"/>
+            <w:shd w:fill="F2F5F9" w:color="auto" w:val="clear"/>
+            <w:tcMar>
+              <w:top w:type="dxa" w:w="40"/>
+              <w:left w:type="dxa" w:w="70"/>
+              <w:bottom w:type="dxa" w:w="40"/>
+              <w:right w:type="dxa" w:w="70"/>
+            </w:tcMar>
+          </w:tcPr>
+          <w:p>
+            <w:pPr>
+              <w:spacing w:after="0"/>
+            </w:pPr>
+            <w:r>
+              <w:rPr>
+                <w:sz w:val="17"/>
+                <w:szCs w:val="17"/>
+              </w:rPr>
+              <w:t xml:space="preserve">23 → 10</w:t>
+            </w:r>
+          </w:p>
+        </w:tc>
+        <w:tc>
+          <w:tcPr>
+            <w:tcW w:type="dxa" w:w="1300"/>
+            <w:shd w:fill="F2F5F9" w:color="auto" w:val="clear"/>
+            <w:tcMar>
+              <w:top w:type="dxa" w:w="40"/>
+              <w:left w:type="dxa" w:w="70"/>
+              <w:bottom w:type="dxa" w:w="40"/>
+              <w:right w:type="dxa" w:w="70"/>
+            </w:tcMar>
+          </w:tcPr>
+          <w:p>
+            <w:pPr>
+              <w:spacing w:after="0"/>
+            </w:pPr>
+            <w:r>
+              <w:rPr>
+                <w:sz w:val="17"/>
+                <w:szCs w:val="17"/>
+              </w:rPr>
+              <w:t xml:space="preserve">7 · 1.4</w:t>
+            </w:r>
+          </w:p>
+        </w:tc>
+        <w:tc>
+          <w:tcPr>
+            <w:tcW w:type="dxa" w:w="1000"/>
+            <w:shd w:fill="F2F5F9" w:color="auto" w:val="clear"/>
+            <w:tcMar>
+              <w:top w:type="dxa" w:w="40"/>
+              <w:left w:type="dxa" w:w="70"/>
+              <w:bottom w:type="dxa" w:w="40"/>
+              <w:right w:type="dxa" w:w="70"/>
+            </w:tcMar>
+          </w:tcPr>
+          <w:p>
+            <w:pPr>
+              <w:spacing w:after="0"/>
+            </w:pPr>
+            <w:r>
+              <w:rPr>
+                <w:sz w:val="17"/>
+                <w:szCs w:val="17"/>
+              </w:rPr>
+              <w:t xml:space="preserve">12.5%</w:t>
+            </w:r>
+          </w:p>
+        </w:tc>
+        <w:tc>
+          <w:tcPr>
+            <w:tcW w:type="dxa" w:w="1000"/>
+            <w:shd w:fill="F2F5F9" w:color="auto" w:val="clear"/>
+            <w:tcMar>
+              <w:top w:type="dxa" w:w="40"/>
+              <w:left w:type="dxa" w:w="70"/>
+              <w:bottom w:type="dxa" w:w="40"/>
+              <w:right w:type="dxa" w:w="70"/>
+            </w:tcMar>
+          </w:tcPr>
+          <w:p>
+            <w:pPr>
+              <w:spacing w:after="0"/>
+            </w:pPr>
+            <w:r>
+              <w:rPr>
+                <w:sz w:val="17"/>
+                <w:szCs w:val="17"/>
+              </w:rPr>
+              <w:t xml:space="preserve">0.8</w:t>
+            </w:r>
+          </w:p>
+        </w:tc>
+        <w:tc>
+          <w:tcPr>
+            <w:tcW w:type="dxa" w:w="1500"/>
+            <w:shd w:fill="F2F5F9" w:color="auto" w:val="clear"/>
+            <w:tcMar>
+              <w:top w:type="dxa" w:w="40"/>
+              <w:left w:type="dxa" w:w="70"/>
+              <w:bottom w:type="dxa" w:w="40"/>
+              <w:right w:type="dxa" w:w="70"/>
+            </w:tcMar>
+          </w:tcPr>
+          <w:p>
+            <w:pPr>
+              <w:spacing w:after="0"/>
+            </w:pPr>
+            <w:r>
+              <w:rPr>
+                <w:sz w:val="17"/>
+                <w:szCs w:val="17"/>
+              </w:rPr>
+              <w:t xml:space="preserve">$5.28 ($6.40)</w:t>
+            </w:r>
+          </w:p>
+        </w:tc>
+        <w:tc>
+          <w:tcPr>
+            <w:tcW w:type="dxa" w:w="1772"/>
+            <w:shd w:fill="F2F5F9" w:color="auto" w:val="clear"/>
+            <w:tcMar>
+              <w:top w:type="dxa" w:w="40"/>
+              <w:left w:type="dxa" w:w="70"/>
+              <w:bottom w:type="dxa" w:w="40"/>
+              <w:right w:type="dxa" w:w="70"/>
+            </w:tcMar>
+          </w:tcPr>
+          <w:p>
+            <w:pPr>
+              <w:spacing w:after="0"/>
+            </w:pPr>
+            <w:r>
+              <w:rPr>
+                <w:sz w:val="17"/>
+                <w:szCs w:val="17"/>
+              </w:rPr>
+              <w:t xml:space="preserve">$35</w:t>
+            </w:r>
+          </w:p>
+        </w:tc>
+      </w:tr>
+      <w:tr>
+        <w:tc>
+          <w:tcPr>
+            <w:tcW w:type="dxa" w:w="2300"/>
+            <w:shd w:fill="FFFFFF" w:color="auto" w:val="clear"/>
+            <w:tcMar>
+              <w:top w:type="dxa" w:w="40"/>
+              <w:left w:type="dxa" w:w="70"/>
+              <w:bottom w:type="dxa" w:w="40"/>
+              <w:right w:type="dxa" w:w="70"/>
+            </w:tcMar>
+          </w:tcPr>
+          <w:p>
+            <w:pPr>
+              <w:spacing w:after="0"/>
+            </w:pPr>
+            <w:r>
+              <w:rPr>
+                <w:sz w:val="17"/>
+                <w:szCs w:val="17"/>
+              </w:rPr>
+              <w:t xml:space="preserve">Total</w:t>
+            </w:r>
+          </w:p>
+        </w:tc>
+        <w:tc>
+          <w:tcPr>
+            <w:tcW w:type="dxa" w:w="1100"/>
+            <w:shd w:fill="FFFFFF" w:color="auto" w:val="clear"/>
+            <w:tcMar>
+              <w:top w:type="dxa" w:w="40"/>
+              <w:left w:type="dxa" w:w="70"/>
+              <w:bottom w:type="dxa" w:w="40"/>
+              <w:right w:type="dxa" w:w="70"/>
+            </w:tcMar>
+          </w:tcPr>
+          <w:p>
+            <w:pPr>
+              <w:spacing w:after="0"/>
+            </w:pPr>
+            <w:r>
+              <w:rPr>
+                <w:sz w:val="17"/>
+                <w:szCs w:val="17"/>
+              </w:rPr>
+              <w:t xml:space="preserve"/>
+            </w:r>
+          </w:p>
+        </w:tc>
+        <w:tc>
+          <w:tcPr>
+            <w:tcW w:type="dxa" w:w="1300"/>
+            <w:shd w:fill="FFFFFF" w:color="auto" w:val="clear"/>
+            <w:tcMar>
+              <w:top w:type="dxa" w:w="40"/>
+              <w:left w:type="dxa" w:w="70"/>
+              <w:bottom w:type="dxa" w:w="40"/>
+              <w:right w:type="dxa" w:w="70"/>
+            </w:tcMar>
+          </w:tcPr>
+          <w:p>
+            <w:pPr>
+              <w:spacing w:after="0"/>
+            </w:pPr>
+            <w:r>
+              <w:rPr>
+                <w:sz w:val="17"/>
+                <w:szCs w:val="17"/>
+              </w:rPr>
+              <w:t xml:space="preserve">202</w:t>
+            </w:r>
+          </w:p>
+        </w:tc>
+        <w:tc>
+          <w:tcPr>
+            <w:tcW w:type="dxa" w:w="1000"/>
+            <w:shd w:fill="FFFFFF" w:color="auto" w:val="clear"/>
+            <w:tcMar>
+              <w:top w:type="dxa" w:w="40"/>
+              <w:left w:type="dxa" w:w="70"/>
+              <w:bottom w:type="dxa" w:w="40"/>
+              <w:right w:type="dxa" w:w="70"/>
+            </w:tcMar>
+          </w:tcPr>
+          <w:p>
+            <w:pPr>
+              <w:spacing w:after="0"/>
+            </w:pPr>
+            <w:r>
+              <w:rPr>
+                <w:sz w:val="17"/>
+                <w:szCs w:val="17"/>
+              </w:rPr>
+              <w:t xml:space="preserve"/>
+            </w:r>
+          </w:p>
+        </w:tc>
+        <w:tc>
+          <w:tcPr>
+            <w:tcW w:type="dxa" w:w="1000"/>
+            <w:shd w:fill="FFFFFF" w:color="auto" w:val="clear"/>
+            <w:tcMar>
+              <w:top w:type="dxa" w:w="40"/>
+              <w:left w:type="dxa" w:w="70"/>
+              <w:bottom w:type="dxa" w:w="40"/>
+              <w:right w:type="dxa" w:w="70"/>
+            </w:tcMar>
+          </w:tcPr>
+          <w:p>
+            <w:pPr>
+              <w:spacing w:after="0"/>
+            </w:pPr>
+            <w:r>
+              <w:rPr>
+                <w:sz w:val="17"/>
+                <w:szCs w:val="17"/>
+              </w:rPr>
+              <w:t xml:space="preserve">36</w:t>
+            </w:r>
+          </w:p>
+        </w:tc>
+        <w:tc>
+          <w:tcPr>
+            <w:tcW w:type="dxa" w:w="1500"/>
+            <w:shd w:fill="FFFFFF" w:color="auto" w:val="clear"/>
+            <w:tcMar>
+              <w:top w:type="dxa" w:w="40"/>
+              <w:left w:type="dxa" w:w="70"/>
+              <w:bottom w:type="dxa" w:w="40"/>
+              <w:right w:type="dxa" w:w="70"/>
+            </w:tcMar>
+          </w:tcPr>
+          <w:p>
+            <w:pPr>
+              <w:spacing w:after="0"/>
+            </w:pPr>
+            <w:r>
+              <w:rPr>
+                <w:sz w:val="17"/>
+                <w:szCs w:val="17"/>
+              </w:rPr>
+              <w:t xml:space="preserve"/>
+            </w:r>
+          </w:p>
+        </w:tc>
+        <w:tc>
+          <w:tcPr>
+            <w:tcW w:type="dxa" w:w="1772"/>
+            <w:shd w:fill="FFFFFF" w:color="auto" w:val="clear"/>
+            <w:tcMar>
+              <w:top w:type="dxa" w:w="40"/>
+              <w:left w:type="dxa" w:w="70"/>
+              <w:bottom w:type="dxa" w:w="40"/>
+              <w:right w:type="dxa" w:w="70"/>
+            </w:tcMar>
+          </w:tcPr>
+          <w:p>
+            <w:pPr>
+              <w:spacing w:after="0"/>
+            </w:pPr>
+            <w:r>
+              <w:rPr>
+                <w:sz w:val="17"/>
+                <w:szCs w:val="17"/>
+              </w:rPr>
+              <w:t xml:space="preserve">$1,199</w:t>
+            </w:r>
+          </w:p>
+        </w:tc>
+      </w:tr>
+    </w:tbl>
+    <w:p>
+      <w:pPr>
+        <w:spacing w:after="120"/>
+      </w:pPr>
+      <w:r>
+        <w:rPr>
+          <w:i/>
+          <w:iCs/>
+          <w:color w:val="555555"/>
+          <w:sz w:val="17"/>
+          <w:szCs w:val="17"/>
+        </w:rPr>
+        <w:t xml:space="preserve">Plan clicks = the audit’s plan for the target rank (units the rank sells ÷ conversion), before the overlap scaling in Section 12. * The campaign’s overall conversion, which beats the market. These terms have barely been shown at the top, which is the problem the push fixes. Budget = plan clicks × this week’s price; add the product-page clicks the base still buys. Ceiling = twice break-even.</w:t>
+      </w:r>
+    </w:p>
+    <w:p>
+      <w:pPr>
+        <w:spacing w:after="100"/>
+      </w:pPr>
+      <w:r>
+        <w:t xml:space="preserve">At the full plan this costs about $1,200 a day and should bring about 36 orders a day at about 41% ACoS. The terms share shoppers, so the real total will be lower. Scaled for that overlap (×0.62, Section 12), it is about $750 a day and 22 orders. Either way it is a deliberate, time-boxed investment: three weeks from 29 September, tuned weekly.</w:t>
+      </w:r>
+    </w:p>
+    <w:p>
+      <w:pPr>
+        <w:spacing w:after="100"/>
+      </w:pPr>
+      <w:r>
+        <w:t xml:space="preserve">Set up next: “cooling sheets king size” (1,468 sales a month; True Bamboo 14th; plan 34 clicks a day) and “cooling sheets queen” (2,277; True Bamboo 19th; plan 9 a day). Add both to the rank tracker and confirm each has one live exact campaign on White. Push them once they are tracked.</w:t>
+      </w:r>
+    </w:p>
+    <w:p>
+      <w:pPr>
+        <w:pStyle w:val="ListParagraph"/>
+        <w:numPr>
+          <w:ilvl w:val="0"/>
+          <w:numId w:val="3"/>
+        </w:numPr>
+        <w:spacing w:after="60"/>
+      </w:pPr>
+      <w:r>
+        <w:rPr>
+          <w:b/>
+          <w:bCs/>
+        </w:rPr>
+        <w:t xml:space="preserve">Daily: </w:t>
+      </w:r>
+      <w:r>
+        <w:t xml:space="preserve">step each price up by up to 30% until the term holds a top-3 sponsored position most hours and at least 30% of top-of-search impressions, never above its ceiling.</w:t>
+      </w:r>
+    </w:p>
+    <w:p>
+      <w:pPr>
+        <w:pStyle w:val="ListParagraph"/>
+        <w:numPr>
+          <w:ilvl w:val="0"/>
+          <w:numId w:val="3"/>
+        </w:numPr>
+        <w:spacing w:after="60"/>
+      </w:pPr>
+      <w:r>
+        <w:rPr>
+          <w:b/>
+          <w:bCs/>
+        </w:rPr>
+        <w:t xml:space="preserve">At the ceiling for 3 days without holding the top: </w:t>
+      </w:r>
+      <w:r>
+        <w:t xml:space="preserve">bring it to you, to raise that term’s ceiling for a set time or swap the term.</w:t>
+      </w:r>
+    </w:p>
+    <w:p>
+      <w:pPr>
+        <w:pStyle w:val="ListParagraph"/>
+        <w:numPr>
+          <w:ilvl w:val="0"/>
+          <w:numId w:val="3"/>
+        </w:numPr>
+        <w:spacing w:after="60"/>
+      </w:pPr>
+      <w:r>
+        <w:rPr>
+          <w:b/>
+          <w:bCs/>
+        </w:rPr>
+        <w:t xml:space="preserve">Weekly: </w:t>
+      </w:r>
+      <w:r>
+        <w:t xml:space="preserve">keep funding what moves; for a term that held the top for a week without moving, check the listing, stock and conversion before spending more.</w:t>
+      </w:r>
+    </w:p>
+    <w:p>
+      <w:pPr>
+        <w:pStyle w:val="ListParagraph"/>
+        <w:numPr>
+          <w:ilvl w:val="0"/>
+          <w:numId w:val="3"/>
+        </w:numPr>
+        <w:spacing w:after="60"/>
+      </w:pPr>
+      <w:r>
+        <w:rPr>
+          <w:b/>
+          <w:bCs/>
+        </w:rPr>
+        <w:t xml:space="preserve">Stop: </w:t>
+      </w:r>
+      <w:r>
+        <w:t xml:space="preserve">a term whose top-of-search conversion falls below the market on 50+ clicks.</w:t>
+      </w:r>
+    </w:p>
+    <w:p>
+      <w:pPr>
+        <w:spacing w:after="100"/>
+      </w:pPr>
+      <w:r>
+        <w:rPr>
+          <w:b/>
+          <w:bCs/>
+          <w:color w:val="1F3A5F"/>
+        </w:rPr>
+        <w:t xml:space="preserve">Your decision. </w:t>
+      </w:r>
+      <w:r>
+        <w:t xml:space="preserve">Approve the push budget for three weeks: the full plan (about $1,200 a day) or the overlap-adjusted plan (about $750 a day).</w:t>
+      </w:r>
+    </w:p>
+    <w:p>
+      <w:pPr>
+        <w:pStyle w:val="Heading2"/>
+      </w:pPr>
+      <w:r>
+        <w:t xml:space="preserve">5.4 Which terms qualify</w:t>
+      </w:r>
+    </w:p>
+    <w:p>
+      <w:pPr>
+        <w:spacing w:after="100"/>
+      </w:pPr>
+      <w:r>
+        <w:t xml:space="preserve">Nine B6 terms beat the market at top of search on both click-through and conversion and have 7+ days of Available stock. Most also leak to product pages, so the base cut goes in the same write as the push price.</w:t>
       </w:r>
     </w:p>
     <w:tbl>
@@ -2714,7 +5708,7 @@
                 <w:sz w:val="17"/>
                 <w:szCs w:val="17"/>
               </w:rPr>
-              <w:t xml:space="preserve">no — your decision</w:t>
+              <w:t xml:space="preserve">added to the push</w:t>
             </w:r>
           </w:p>
         </w:tc>
@@ -2786,7 +5780,7 @@
                 <w:sz w:val="17"/>
                 <w:szCs w:val="17"/>
               </w:rPr>
-              <w:t xml:space="preserve">Push (Section 5.4)</w:t>
+              <w:t xml:space="preserve">Push (Section 5.6)</w:t>
             </w:r>
           </w:p>
         </w:tc>
@@ -2932,7 +5926,7 @@
                 <w:sz w:val="17"/>
                 <w:szCs w:val="17"/>
               </w:rPr>
-              <w:t xml:space="preserve">Mix first (product pages 64%), then push</w:t>
+              <w:t xml:space="preserve">Push; base cut in the same write (product pages 64%)</w:t>
             </w:r>
           </w:p>
         </w:tc>
@@ -3224,7 +6218,7 @@
                 <w:sz w:val="17"/>
                 <w:szCs w:val="17"/>
               </w:rPr>
-              <w:t xml:space="preserve">Mix first (52%); move to Queen White</w:t>
+              <w:t xml:space="preserve">Push on Queen White; base cut in the same write (52%)</w:t>
             </w:r>
           </w:p>
         </w:tc>
@@ -3980,7 +6974,7 @@
         <w:pStyle w:val="Heading2"/>
       </w:pPr>
       <w:r>
-        <w:t xml:space="preserve">5.3 How the correct price is worked out — examples</w:t>
+        <w:t xml:space="preserve">5.5 How the correct price is worked out — examples</w:t>
       </w:r>
     </w:p>
     <w:tbl>
@@ -4603,7 +7597,7 @@
                 <w:sz w:val="17"/>
                 <w:szCs w:val="17"/>
               </w:rPr>
-              <w:t xml:space="preserve">Move the ad to Queen White and fix the mix (base $1.70 → $1.28), then $7.10</w:t>
+              <w:t xml:space="preserve">Move the ad to Queen White, cut the base $1.70 → $1.28 and set $7.10, in one write</w:t>
             </w:r>
           </w:p>
         </w:tc>
@@ -4749,7 +7743,7 @@
                 <w:sz w:val="17"/>
                 <w:szCs w:val="17"/>
               </w:rPr>
-              <w:t xml:space="preserve">Mix first: base $1.37 → $1.03, boost to hold $5.93. Climb +30% a step toward $8.86 once 70% of clicks are at the top. Stay on White (the audit moves it to Olive).</w:t>
+              <w:t xml:space="preserve">Base $1.37 → $1.03 and top of search +30% to $7.71, in one write. Then up to 30% a day toward $8.86 until it holds the top. Stay on White (the audit moves it to Olive).</w:t>
             </w:r>
           </w:p>
         </w:tc>
@@ -4945,7 +7939,7 @@
                 <w:sz w:val="17"/>
                 <w:szCs w:val="17"/>
               </w:rPr>
-              <w:t xml:space="preserve">in the register</w:t>
+              <w:t xml:space="preserve">$2.24 once on Queen White = $19.51 × 11.5%</w:t>
             </w:r>
           </w:p>
         </w:tc>
@@ -4993,7 +7987,7 @@
                 <w:sz w:val="17"/>
                 <w:szCs w:val="17"/>
               </w:rPr>
-              <w:t xml:space="preserve">none until it shows at the top</w:t>
+              <w:t xml:space="preserve">$5.61, capped at 2× = $4.49</w:t>
             </w:r>
           </w:p>
         </w:tc>
@@ -5041,7 +8035,7 @@
                 <w:sz w:val="17"/>
                 <w:szCs w:val="17"/>
               </w:rPr>
-              <w:t xml:space="preserve">Mix first: base $1.58 → $1.19, boost to hold $3.16 (not $5.53); move the ad to Queen White; push once the mix is fixed</w:t>
+              <w:t xml:space="preserve">Move the ad to Queen White, cut the base $1.58 → $1.19 and set $4.11 (+30%), in one write; then up to 30% a day toward $4.49</w:t>
             </w:r>
           </w:p>
         </w:tc>
@@ -5059,7 +8053,7 @@
           <w:sz w:val="17"/>
           <w:szCs w:val="17"/>
         </w:rPr>
-        <w:t xml:space="preserve">Premium = (rank now ÷ target − 1) × 50%, or +25% when the ratio is 1.5 or less; the push price never exceeds twice break-even. Break-even = the advertised colour’s Sellerboard margin × the campaign’s top-of-search conversion; where the ad moves to White, it is priced on White’s margin. “Now · audit” = today’s top-of-search price and what the audit writes.</w:t>
+        <w:t xml:space="preserve">Premium = (rank now ÷ target − 1) × 50%, or +25% when the ratio is 1.5 or less; the push price never exceeds twice break-even and steps up by at most 30% a day. Break-even = the advertised colour’s Sellerboard margin × the campaign’s top-of-search conversion; where the ad moves to White, it is priced on White’s margin. “Now · audit” = today’s top-of-search price and what the audit writes.</w:t>
       </w:r>
     </w:p>
     <w:p>
@@ -5067,7 +8061,7 @@
         <w:pStyle w:val="Heading2"/>
       </w:pPr>
       <w:r>
-        <w:t xml:space="preserve">5.4 “bamboo sheets”</w:t>
+        <w:t xml:space="preserve">5.6 “bamboo sheets”</w:t>
       </w:r>
     </w:p>
     <w:p>
@@ -5138,7 +8132,7 @@
         <w:spacing w:after="100"/>
       </w:pPr>
       <w:r>
-        <w:t xml:space="preserve">It buys too little at the top: 39% of its clicks, against 57% on product pages, and 1.5% of the top-of-search impressions. After the reach and sum checks (Section 12), it needs about 40 top-of-search clicks a day and gets 7. The fix is the mix and fixed bidding more than a higher price:</w:t>
+        <w:t xml:space="preserve">It buys too little at the top: 39% of its clicks, against 57% on product pages, and 1.5% of the top-of-search impressions. The plan asks for 69 top-of-search clicks a day (about 40 after the overlap scaling in Section 12); it gets 7. The fix is the mix and fixed bidding more than a higher price:</w:t>
       </w:r>
     </w:p>
     <w:p>
@@ -5203,10 +8197,10 @@
           <w:bCs/>
           <w:color w:val="1F3A5F"/>
         </w:rPr>
-        <w:t xml:space="preserve">Your decision. </w:t>
-      </w:r>
-      <w:r>
-        <w:t xml:space="preserve">Whether “bamboo sheets” joins the push. About 40 top-of-search clicks a day at $6.16 is roughly $250 a day, plus the product-page clicks the base still buys.</w:t>
+        <w:t xml:space="preserve">In the push plan. </w:t>
+      </w:r>
+      <w:r>
+        <w:t xml:space="preserve">69 top-of-search clicks a day at $6.16 is about $425 a day and should bring about 13 orders a day (Section 5.3).</w:t>
       </w:r>
     </w:p>
     <w:p>
@@ -5214,7 +8208,7 @@
         <w:pStyle w:val="Heading2"/>
       </w:pPr>
       <w:r>
-        <w:t xml:space="preserve">5.5 Every focus campaign gets a move this week</w:t>
+        <w:t xml:space="preserve">5.7 Every focus campaign gets a move this week</w:t>
       </w:r>
     </w:p>
     <w:p>
@@ -5242,7 +8236,7 @@
         <w:t xml:space="preserve">Push </w:t>
       </w:r>
       <w:r>
-        <w:t xml:space="preserve">where it qualifies: fixed bidding, the push price, the mix fixed, and a budget for its required clicks.</w:t>
+        <w:t xml:space="preserve">where it is in the plan: fixed bidding, the base cut and push price in one write, daily steps until it holds the top, and a budget for its planned clicks.</w:t>
       </w:r>
     </w:p>
     <w:p>
@@ -5290,7 +8284,7 @@
         <w:pStyle w:val="Heading2"/>
       </w:pPr>
       <w:r>
-        <w:t xml:space="preserve">5.6 How the push is paid for</w:t>
+        <w:t xml:space="preserve">5.8 How the push is paid for</w:t>
       </w:r>
     </w:p>
     <w:p>
@@ -5298,7 +8292,7 @@
         <w:spacing w:after="100"/>
       </w:pPr>
       <w:r>
-        <w:t xml:space="preserve">The money moves rather than grows. It comes from:</w:t>
+        <w:t xml:space="preserve">The push grows spend on purpose; that is what buys rank at the speed True Bamboo showed. Part of it is paid for by:</w:t>
       </w:r>
     </w:p>
     <w:p>
@@ -5351,6 +8345,14 @@
       </w:pPr>
       <w:r>
         <w:t xml:space="preserve">No 75% jumps.</w:t>
+      </w:r>
+    </w:p>
+    <w:p>
+      <w:pPr>
+        <w:spacing w:after="100"/>
+      </w:pPr>
+      <w:r>
+        <w:t xml:space="preserve">The rest is new money. That is why the push budget is approved separately, for three weeks, and tuned weekly on rank movement.</w:t>
       </w:r>
     </w:p>
     <w:p>
@@ -8179,7 +11181,7 @@
         <w:t xml:space="preserve">Count only the units a term doesn’t already sell, and check the total against the product. </w:t>
       </w:r>
       <w:r>
-        <w:t xml:space="preserve">B6’s terms add up to 117 extra units a day against 72 sold in total, so every requirement is scaled to 0.62.</w:t>
+        <w:t xml:space="preserve">B6’s terms add up to 117 extra units a day against 72 sold in total, so every requirement is scaled to 0.62. The push plan (Section 5.3) shows the cost at both the full and the scaled volume.</w:t>
       </w:r>
     </w:p>
     <w:p>
@@ -8549,7 +11551,7 @@
         <w:spacing w:after="60"/>
       </w:pPr>
       <w:r>
-        <w:t xml:space="preserve">Today: agree the goals for the deal days and after, and decide on “bamboo sheets”.</w:t>
+        <w:t xml:space="preserve">Today: agree the goals for the deal days and after, and approve the push budget.</w:t>
       </w:r>
     </w:p>
     <w:p>
@@ -8575,7 +11577,7 @@
         <w:spacing w:after="60"/>
       </w:pPr>
       <w:r>
-        <w:t xml:space="preserve">Fixed bidding and the mix fix on the push campaigns, and push prices on the qualifying terms.</w:t>
+        <w:t xml:space="preserve">On the push terms: fixed bidding, the base cut and the push price in one write, budgets by hand, and daily steps until each holds the top.</w:t>
       </w:r>
     </w:p>
     <w:p>
@@ -8588,7 +11590,7 @@
         <w:spacing w:after="60"/>
       </w:pPr>
       <w:r>
-        <w:t xml:space="preserve">Restart “bamboo sheets full”, and set the push budgets by hand.</w:t>
+        <w:t xml:space="preserve">Restart “bamboo sheets full”. Add “cooling sheets king size” and “cooling sheets queen” to the rank tracker, and start hourly tracking of sponsored and organic rank for B6 and True Bamboo on the push terms.</w:t>
       </w:r>
     </w:p>
     <w:p>
@@ -8692,7 +11694,7 @@
         <w:spacing w:after="60"/>
       </w:pPr>
       <w:r>
-        <w:t xml:space="preserve">8–14 October: first clean read, and the next push steps where rank moved.</w:t>
+        <w:t xml:space="preserve">5, 12 and 19 October: tune the push plan. Fund what moves; fix or swap what doesn’t.</w:t>
       </w:r>
     </w:p>
     <w:p>
@@ -8896,6 +11898,32 @@
       </w:pPr>
       <w:r>
         <w:t xml:space="preserve">It has no current rank for 38 of its 40 target terms.</w:t>
+      </w:r>
+    </w:p>
+    <w:p>
+      <w:pPr>
+        <w:pStyle w:val="ListParagraph"/>
+        <w:numPr>
+          <w:ilvl w:val="0"/>
+          <w:numId w:val="3"/>
+        </w:numPr>
+        <w:spacing w:after="60"/>
+      </w:pPr>
+      <w:r>
+        <w:t xml:space="preserve">It sets rank timelines in months when a competitor shows top-5 moves in days. It should use competitor hourly sponsored and organic rank and traffic estimates to size clicks and timelines.</w:t>
+      </w:r>
+    </w:p>
+    <w:p>
+      <w:pPr>
+        <w:pStyle w:val="ListParagraph"/>
+        <w:numPr>
+          <w:ilvl w:val="0"/>
+          <w:numId w:val="3"/>
+        </w:numPr>
+        <w:spacing w:after="60"/>
+      </w:pPr>
+      <w:r>
+        <w:t xml:space="preserve">It spreads the push across hundreds of campaigns instead of a tactical set of terms with a costed click plan.</w:t>
       </w:r>
     </w:p>
     <w:p>

</xml_diff>

<commit_message>
Expand DBS6 push plan to 16 terms and push cooling terms now
Adds selection criteria, size/set, near-top and cooling term groups,
new exact campaigns for the cooling terms, and a left-out list.

Co-Authored-By: Claude Opus 5.5 <noreply@anthropic.com>
Claude-Session: https://claude.ai/code/session_01LY7A1KPDoE1cQtWdmceR2R
</commit_message>
<xml_diff>
--- a/docs/DBS6_Audit_Corrections_20260928.docx
+++ b/docs/DBS6_Audit_Corrections_20260928.docx
@@ -79,7 +79,7 @@
         <w:t xml:space="preserve">Push harder at top of search, on a tactical set of terms, with a costed plan. </w:t>
       </w:r>
       <w:r>
-        <w:t xml:space="preserve">A competitor with 129 reviews, True Bamboo, climbed from about 110 to the top 5 on three of our main terms in about 9 days by holding the top ad slot. Our click-through and conversion already beat the market on these terms; what’s missing is volume at the top. Eight terms get a plan for clicks, orders and budget (Section 5.3). Fixed bidding, the base cut and the push price go in one write. Prices then step up daily until each term holds the top slot, never above twice break-even. The audit’s 18 jumps of 75% go.</w:t>
+        <w:t xml:space="preserve">A competitor with 129 reviews, True Bamboo, climbed from about 110 to the top 5 on three of our main terms in about 9 days by holding the top ad slot. Our click-through and conversion already beat the market on these terms; what’s missing is volume at the top. Sixteen terms get a plan for clicks, orders and budget (Section 5.3). Fixed bidding, the base cut and the push price go in one write. Prices then step up daily until each term holds the top slot, never above twice break-even. The audit’s 18 jumps of 75% go.</w:t>
       </w:r>
     </w:p>
     <w:p>
@@ -308,7 +308,7 @@
         <w:t xml:space="preserve">Decisions needed from you today: </w:t>
       </w:r>
       <w:r>
-        <w:t xml:space="preserve">the goals for the deal days and after (Section 3), and the push budget for three weeks: about $1,200 a day at the full plan, or $750 adjusted for overlap between terms (Section 5.3).</w:t>
+        <w:t xml:space="preserve">the goals for the deal days and after (Section 3), and the push budget for three weeks: about $1,530 a day at the full plan, or $950 adjusted for overlap between terms (Section 5.3).</w:t>
       </w:r>
     </w:p>
     <w:p>
@@ -3560,7 +3560,67 @@
         <w:spacing w:after="100"/>
       </w:pPr>
       <w:r>
-        <w:t xml:space="preserve">Eight terms get pushed now, and two more once they are tracked. Each has a plan for clicks, orders and budget a day, tuned weekly on results:</w:t>
+        <w:t xml:space="preserve">A term is in the push when four things hold:</w:t>
+      </w:r>
+    </w:p>
+    <w:p>
+      <w:pPr>
+        <w:pStyle w:val="ListParagraph"/>
+        <w:numPr>
+          <w:ilvl w:val="0"/>
+          <w:numId w:val="3"/>
+        </w:numPr>
+        <w:spacing w:after="60"/>
+      </w:pPr>
+      <w:r>
+        <w:t xml:space="preserve">It has real demand.</w:t>
+      </w:r>
+    </w:p>
+    <w:p>
+      <w:pPr>
+        <w:pStyle w:val="ListParagraph"/>
+        <w:numPr>
+          <w:ilvl w:val="0"/>
+          <w:numId w:val="3"/>
+        </w:numPr>
+        <w:spacing w:after="60"/>
+      </w:pPr>
+      <w:r>
+        <w:t xml:space="preserve">It converts above the market: at the top, or overall where it has barely been shown there.</w:t>
+      </w:r>
+    </w:p>
+    <w:p>
+      <w:pPr>
+        <w:pStyle w:val="ListParagraph"/>
+        <w:numPr>
+          <w:ilvl w:val="0"/>
+          <w:numId w:val="3"/>
+        </w:numPr>
+        <w:spacing w:after="60"/>
+      </w:pPr>
+      <w:r>
+        <w:t xml:space="preserve">White is in stock.</w:t>
+      </w:r>
+    </w:p>
+    <w:p>
+      <w:pPr>
+        <w:pStyle w:val="ListParagraph"/>
+        <w:numPr>
+          <w:ilvl w:val="0"/>
+          <w:numId w:val="3"/>
+        </w:numPr>
+        <w:spacing w:after="60"/>
+      </w:pPr>
+      <w:r>
+        <w:t xml:space="preserve">It is within reach: we, or True Bamboo, rank inside about 30 places.</w:t>
+      </w:r>
+    </w:p>
+    <w:p>
+      <w:pPr>
+        <w:spacing w:after="100"/>
+      </w:pPr>
+      <w:r>
+        <w:t xml:space="preserve">That gives 16 terms now, in four groups. Each has a plan for clicks, orders and budget a day, tuned weekly on results:</w:t>
       </w:r>
     </w:p>
     <w:tbl>
@@ -3799,7 +3859,7 @@
                 <w:sz w:val="17"/>
                 <w:szCs w:val="17"/>
               </w:rPr>
-              <w:t xml:space="preserve">bamboo sheets</w:t>
+              <w:t xml:space="preserve">Head terms</w:t>
             </w:r>
           </w:p>
         </w:tc>
@@ -3823,7 +3883,7 @@
                 <w:sz w:val="17"/>
                 <w:szCs w:val="17"/>
               </w:rPr>
-              <w:t xml:space="preserve">29 → 9</w:t>
+              <w:t xml:space="preserve"/>
             </w:r>
           </w:p>
         </w:tc>
@@ -3847,7 +3907,7 @@
                 <w:sz w:val="17"/>
                 <w:szCs w:val="17"/>
               </w:rPr>
-              <w:t xml:space="preserve">69 · 7</w:t>
+              <w:t xml:space="preserve"/>
             </w:r>
           </w:p>
         </w:tc>
@@ -3871,7 +3931,7 @@
                 <w:sz w:val="17"/>
                 <w:szCs w:val="17"/>
               </w:rPr>
-              <w:t xml:space="preserve">19.3%</w:t>
+              <w:t xml:space="preserve"/>
             </w:r>
           </w:p>
         </w:tc>
@@ -3895,7 +3955,7 @@
                 <w:sz w:val="17"/>
                 <w:szCs w:val="17"/>
               </w:rPr>
-              <w:t xml:space="preserve">13.3</w:t>
+              <w:t xml:space="preserve"/>
             </w:r>
           </w:p>
         </w:tc>
@@ -3919,7 +3979,7 @@
                 <w:sz w:val="17"/>
                 <w:szCs w:val="17"/>
               </w:rPr>
-              <w:t xml:space="preserve">$6.16 ($6.16)</w:t>
+              <w:t xml:space="preserve"/>
             </w:r>
           </w:p>
         </w:tc>
@@ -3943,7 +4003,7 @@
                 <w:sz w:val="17"/>
                 <w:szCs w:val="17"/>
               </w:rPr>
-              <w:t xml:space="preserve">$425</w:t>
+              <w:t xml:space="preserve"/>
             </w:r>
           </w:p>
         </w:tc>
@@ -3969,7 +4029,7 @@
                 <w:sz w:val="17"/>
                 <w:szCs w:val="17"/>
               </w:rPr>
-              <w:t xml:space="preserve">bamboo sheets queen size</w:t>
+              <w:t xml:space="preserve">bamboo sheets</w:t>
             </w:r>
           </w:p>
         </w:tc>
@@ -3993,7 +4053,7 @@
                 <w:sz w:val="17"/>
                 <w:szCs w:val="17"/>
               </w:rPr>
-              <w:t xml:space="preserve">21 → 5</w:t>
+              <w:t xml:space="preserve">29 → 9</w:t>
             </w:r>
           </w:p>
         </w:tc>
@@ -4017,7 +4077,7 @@
                 <w:sz w:val="17"/>
                 <w:szCs w:val="17"/>
               </w:rPr>
-              <w:t xml:space="preserve">44 · 0.8</w:t>
+              <w:t xml:space="preserve">69 · 7</w:t>
             </w:r>
           </w:p>
         </w:tc>
@@ -4041,7 +4101,7 @@
                 <w:sz w:val="17"/>
                 <w:szCs w:val="17"/>
               </w:rPr>
-              <w:t xml:space="preserve">22.7%</w:t>
+              <w:t xml:space="preserve">19.3%</w:t>
             </w:r>
           </w:p>
         </w:tc>
@@ -4065,7 +4125,7 @@
                 <w:sz w:val="17"/>
                 <w:szCs w:val="17"/>
               </w:rPr>
-              <w:t xml:space="preserve">10.0</w:t>
+              <w:t xml:space="preserve">13.3</w:t>
             </w:r>
           </w:p>
         </w:tc>
@@ -4089,7 +4149,7 @@
                 <w:sz w:val="17"/>
                 <w:szCs w:val="17"/>
               </w:rPr>
-              <w:t xml:space="preserve">$7.71 ($8.86)</w:t>
+              <w:t xml:space="preserve">$6.16 ($6.16)</w:t>
             </w:r>
           </w:p>
         </w:tc>
@@ -4113,7 +4173,7 @@
                 <w:sz w:val="17"/>
                 <w:szCs w:val="17"/>
               </w:rPr>
-              <w:t xml:space="preserve">$339</w:t>
+              <w:t xml:space="preserve">$425</w:t>
             </w:r>
           </w:p>
         </w:tc>
@@ -4139,7 +4199,7 @@
                 <w:sz w:val="17"/>
                 <w:szCs w:val="17"/>
               </w:rPr>
-              <w:t xml:space="preserve">bamboo sheets king size</w:t>
+              <w:t xml:space="preserve">bamboo sheets queen size</w:t>
             </w:r>
           </w:p>
         </w:tc>
@@ -4163,7 +4223,7 @@
                 <w:sz w:val="17"/>
                 <w:szCs w:val="17"/>
               </w:rPr>
-              <w:t xml:space="preserve">27 → 10</w:t>
+              <w:t xml:space="preserve">21 → 5</w:t>
             </w:r>
           </w:p>
         </w:tc>
@@ -4187,7 +4247,7 @@
                 <w:sz w:val="17"/>
                 <w:szCs w:val="17"/>
               </w:rPr>
-              <w:t xml:space="preserve">24 · 0.1</w:t>
+              <w:t xml:space="preserve">44 · 0.8</w:t>
             </w:r>
           </w:p>
         </w:tc>
@@ -4211,7 +4271,7 @@
                 <w:sz w:val="17"/>
                 <w:szCs w:val="17"/>
               </w:rPr>
-              <w:t xml:space="preserve">17.9%*</w:t>
+              <w:t xml:space="preserve">22.7%</w:t>
             </w:r>
           </w:p>
         </w:tc>
@@ -4235,7 +4295,7 @@
                 <w:sz w:val="17"/>
                 <w:szCs w:val="17"/>
               </w:rPr>
-              <w:t xml:space="preserve">4.3</w:t>
+              <w:t xml:space="preserve">10.0</w:t>
             </w:r>
           </w:p>
         </w:tc>
@@ -4259,7 +4319,7 @@
                 <w:sz w:val="17"/>
                 <w:szCs w:val="17"/>
               </w:rPr>
-              <w:t xml:space="preserve">$5.29 ($5.72)</w:t>
+              <w:t xml:space="preserve">$7.71 ($8.86)</w:t>
             </w:r>
           </w:p>
         </w:tc>
@@ -4283,7 +4343,7 @@
                 <w:sz w:val="17"/>
                 <w:szCs w:val="17"/>
               </w:rPr>
-              <w:t xml:space="preserve">$127</w:t>
+              <w:t xml:space="preserve">$339</w:t>
             </w:r>
           </w:p>
         </w:tc>
@@ -4309,7 +4369,7 @@
                 <w:sz w:val="17"/>
                 <w:szCs w:val="17"/>
               </w:rPr>
-              <w:t xml:space="preserve">bamboo sheets full</w:t>
+              <w:t xml:space="preserve">bamboo sheets king size</w:t>
             </w:r>
           </w:p>
         </w:tc>
@@ -4333,7 +4393,7 @@
                 <w:sz w:val="17"/>
                 <w:szCs w:val="17"/>
               </w:rPr>
-              <w:t xml:space="preserve">18 → 2</w:t>
+              <w:t xml:space="preserve">27 → 10</w:t>
             </w:r>
           </w:p>
         </w:tc>
@@ -4357,7 +4417,7 @@
                 <w:sz w:val="17"/>
                 <w:szCs w:val="17"/>
               </w:rPr>
-              <w:t xml:space="preserve">22 · 0 (paused)</w:t>
+              <w:t xml:space="preserve">24 · 0.1</w:t>
             </w:r>
           </w:p>
         </w:tc>
@@ -4381,7 +4441,7 @@
                 <w:sz w:val="17"/>
                 <w:szCs w:val="17"/>
               </w:rPr>
-              <w:t xml:space="preserve">12.5%*</w:t>
+              <w:t xml:space="preserve">17.9%*</w:t>
             </w:r>
           </w:p>
         </w:tc>
@@ -4405,7 +4465,7 @@
                 <w:sz w:val="17"/>
                 <w:szCs w:val="17"/>
               </w:rPr>
-              <w:t xml:space="preserve">2.7</w:t>
+              <w:t xml:space="preserve">4.3</w:t>
             </w:r>
           </w:p>
         </w:tc>
@@ -4429,7 +4489,7 @@
                 <w:sz w:val="17"/>
                 <w:szCs w:val="17"/>
               </w:rPr>
-              <w:t xml:space="preserve">$5.52 ($5.52)</w:t>
+              <w:t xml:space="preserve">$5.29 ($5.72)</w:t>
             </w:r>
           </w:p>
         </w:tc>
@@ -4453,7 +4513,7 @@
                 <w:sz w:val="17"/>
                 <w:szCs w:val="17"/>
               </w:rPr>
-              <w:t xml:space="preserve">$121</w:t>
+              <w:t xml:space="preserve">$127</w:t>
             </w:r>
           </w:p>
         </w:tc>
@@ -4479,7 +4539,7 @@
                 <w:sz w:val="17"/>
                 <w:szCs w:val="17"/>
               </w:rPr>
-              <w:t xml:space="preserve">bamboo cooling sheets</w:t>
+              <w:t xml:space="preserve">bamboo sheets full</w:t>
             </w:r>
           </w:p>
         </w:tc>
@@ -4503,7 +4563,7 @@
                 <w:sz w:val="17"/>
                 <w:szCs w:val="17"/>
               </w:rPr>
-              <w:t xml:space="preserve">20 → 5</w:t>
+              <w:t xml:space="preserve">18 → 2</w:t>
             </w:r>
           </w:p>
         </w:tc>
@@ -4527,7 +4587,7 @@
                 <w:sz w:val="17"/>
                 <w:szCs w:val="17"/>
               </w:rPr>
-              <w:t xml:space="preserve">20 · 0.1</w:t>
+              <w:t xml:space="preserve">22 · 0 (paused)</w:t>
             </w:r>
           </w:p>
         </w:tc>
@@ -4551,7 +4611,7 @@
                 <w:sz w:val="17"/>
                 <w:szCs w:val="17"/>
               </w:rPr>
-              <w:t xml:space="preserve">11.5%*</w:t>
+              <w:t xml:space="preserve">12.5%*</w:t>
             </w:r>
           </w:p>
         </w:tc>
@@ -4575,7 +4635,7 @@
                 <w:sz w:val="17"/>
                 <w:szCs w:val="17"/>
               </w:rPr>
-              <w:t xml:space="preserve">2.3</w:t>
+              <w:t xml:space="preserve">2.7</w:t>
             </w:r>
           </w:p>
         </w:tc>
@@ -4599,7 +4659,7 @@
                 <w:sz w:val="17"/>
                 <w:szCs w:val="17"/>
               </w:rPr>
-              <w:t xml:space="preserve">$4.11 ($4.49)</w:t>
+              <w:t xml:space="preserve">$5.52 ($5.52)</w:t>
             </w:r>
           </w:p>
         </w:tc>
@@ -4623,7 +4683,7 @@
                 <w:sz w:val="17"/>
                 <w:szCs w:val="17"/>
               </w:rPr>
-              <w:t xml:space="preserve">$82</w:t>
+              <w:t xml:space="preserve">$121</w:t>
             </w:r>
           </w:p>
         </w:tc>
@@ -4649,7 +4709,7 @@
                 <w:sz w:val="17"/>
                 <w:szCs w:val="17"/>
               </w:rPr>
-              <w:t xml:space="preserve">queen bamboo sheet set</w:t>
+              <w:t xml:space="preserve">bamboo cooling sheets</w:t>
             </w:r>
           </w:p>
         </w:tc>
@@ -4673,7 +4733,7 @@
                 <w:sz w:val="17"/>
                 <w:szCs w:val="17"/>
               </w:rPr>
-              <w:t xml:space="preserve">25 → 6</w:t>
+              <w:t xml:space="preserve">20 → 5</w:t>
             </w:r>
           </w:p>
         </w:tc>
@@ -4697,7 +4757,7 @@
                 <w:sz w:val="17"/>
                 <w:szCs w:val="17"/>
               </w:rPr>
-              <w:t xml:space="preserve">5 · 0.9</w:t>
+              <w:t xml:space="preserve">20 · 0.1</w:t>
             </w:r>
           </w:p>
         </w:tc>
@@ -4721,7 +4781,7 @@
                 <w:sz w:val="17"/>
                 <w:szCs w:val="17"/>
               </w:rPr>
-              <w:t xml:space="preserve">21.1%</w:t>
+              <w:t xml:space="preserve">11.5%*</w:t>
             </w:r>
           </w:p>
         </w:tc>
@@ -4745,7 +4805,7 @@
                 <w:sz w:val="17"/>
                 <w:szCs w:val="17"/>
               </w:rPr>
-              <w:t xml:space="preserve">1.1</w:t>
+              <w:t xml:space="preserve">2.3</w:t>
             </w:r>
           </w:p>
         </w:tc>
@@ -4769,7 +4829,7 @@
                 <w:sz w:val="17"/>
                 <w:szCs w:val="17"/>
               </w:rPr>
-              <w:t xml:space="preserve">$7.10 ($7.10)</w:t>
+              <w:t xml:space="preserve">$4.11 ($4.49)</w:t>
             </w:r>
           </w:p>
         </w:tc>
@@ -4793,7 +4853,7 @@
                 <w:sz w:val="17"/>
                 <w:szCs w:val="17"/>
               </w:rPr>
-              <w:t xml:space="preserve">$36</w:t>
+              <w:t xml:space="preserve">$82</w:t>
             </w:r>
           </w:p>
         </w:tc>
@@ -4819,7 +4879,7 @@
                 <w:sz w:val="17"/>
                 <w:szCs w:val="17"/>
               </w:rPr>
-              <w:t xml:space="preserve">bamboo sheets king</w:t>
+              <w:t xml:space="preserve">Size and set terms</w:t>
             </w:r>
           </w:p>
         </w:tc>
@@ -4843,7 +4903,7 @@
                 <w:sz w:val="17"/>
                 <w:szCs w:val="17"/>
               </w:rPr>
-              <w:t xml:space="preserve">19 → 9</w:t>
+              <w:t xml:space="preserve"/>
             </w:r>
           </w:p>
         </w:tc>
@@ -4867,7 +4927,7 @@
                 <w:sz w:val="17"/>
                 <w:szCs w:val="17"/>
               </w:rPr>
-              <w:t xml:space="preserve">11 · —</w:t>
+              <w:t xml:space="preserve"/>
             </w:r>
           </w:p>
         </w:tc>
@@ -4891,7 +4951,7 @@
                 <w:sz w:val="17"/>
                 <w:szCs w:val="17"/>
               </w:rPr>
-              <w:t xml:space="preserve">12.1%*</w:t>
+              <w:t xml:space="preserve"/>
             </w:r>
           </w:p>
         </w:tc>
@@ -4915,7 +4975,7 @@
                 <w:sz w:val="17"/>
                 <w:szCs w:val="17"/>
               </w:rPr>
-              <w:t xml:space="preserve">1.3</w:t>
+              <w:t xml:space="preserve"/>
             </w:r>
           </w:p>
         </w:tc>
@@ -4939,7 +4999,7 @@
                 <w:sz w:val="17"/>
                 <w:szCs w:val="17"/>
               </w:rPr>
-              <w:t xml:space="preserve">$3.09 ($3.86)</w:t>
+              <w:t xml:space="preserve"/>
             </w:r>
           </w:p>
         </w:tc>
@@ -4963,7 +5023,7 @@
                 <w:sz w:val="17"/>
                 <w:szCs w:val="17"/>
               </w:rPr>
-              <w:t xml:space="preserve">$34</w:t>
+              <w:t xml:space="preserve"/>
             </w:r>
           </w:p>
         </w:tc>
@@ -4989,7 +5049,7 @@
                 <w:sz w:val="17"/>
                 <w:szCs w:val="17"/>
               </w:rPr>
-              <w:t xml:space="preserve">full size bamboo sheets</w:t>
+              <w:t xml:space="preserve">bamboo sheets king</w:t>
             </w:r>
           </w:p>
         </w:tc>
@@ -5013,7 +5073,7 @@
                 <w:sz w:val="17"/>
                 <w:szCs w:val="17"/>
               </w:rPr>
-              <w:t xml:space="preserve">23 → 10</w:t>
+              <w:t xml:space="preserve">19 → 9</w:t>
             </w:r>
           </w:p>
         </w:tc>
@@ -5037,7 +5097,7 @@
                 <w:sz w:val="17"/>
                 <w:szCs w:val="17"/>
               </w:rPr>
-              <w:t xml:space="preserve">7 · 1.4</w:t>
+              <w:t xml:space="preserve">11 · —</w:t>
             </w:r>
           </w:p>
         </w:tc>
@@ -5061,7 +5121,7 @@
                 <w:sz w:val="17"/>
                 <w:szCs w:val="17"/>
               </w:rPr>
-              <w:t xml:space="preserve">12.5%</w:t>
+              <w:t xml:space="preserve">12.1%*</w:t>
             </w:r>
           </w:p>
         </w:tc>
@@ -5085,7 +5145,7 @@
                 <w:sz w:val="17"/>
                 <w:szCs w:val="17"/>
               </w:rPr>
-              <w:t xml:space="preserve">0.8</w:t>
+              <w:t xml:space="preserve">1.3</w:t>
             </w:r>
           </w:p>
         </w:tc>
@@ -5109,7 +5169,7 @@
                 <w:sz w:val="17"/>
                 <w:szCs w:val="17"/>
               </w:rPr>
-              <w:t xml:space="preserve">$5.28 ($6.40)</w:t>
+              <w:t xml:space="preserve">$3.09 ($3.86)</w:t>
             </w:r>
           </w:p>
         </w:tc>
@@ -5133,7 +5193,7 @@
                 <w:sz w:val="17"/>
                 <w:szCs w:val="17"/>
               </w:rPr>
-              <w:t xml:space="preserve">$35</w:t>
+              <w:t xml:space="preserve">$34</w:t>
             </w:r>
           </w:p>
         </w:tc>
@@ -5159,7 +5219,7 @@
                 <w:sz w:val="17"/>
                 <w:szCs w:val="17"/>
               </w:rPr>
-              <w:t xml:space="preserve">Total</w:t>
+              <w:t xml:space="preserve">bamboo bed sheets</w:t>
             </w:r>
           </w:p>
         </w:tc>
@@ -5183,6 +5243,856 @@
                 <w:sz w:val="17"/>
                 <w:szCs w:val="17"/>
               </w:rPr>
+              <w:t xml:space="preserve">23 → 6</w:t>
+            </w:r>
+          </w:p>
+        </w:tc>
+        <w:tc>
+          <w:tcPr>
+            <w:tcW w:type="dxa" w:w="1300"/>
+            <w:shd w:fill="FFFFFF" w:color="auto" w:val="clear"/>
+            <w:tcMar>
+              <w:top w:type="dxa" w:w="40"/>
+              <w:left w:type="dxa" w:w="70"/>
+              <w:bottom w:type="dxa" w:w="40"/>
+              <w:right w:type="dxa" w:w="70"/>
+            </w:tcMar>
+          </w:tcPr>
+          <w:p>
+            <w:pPr>
+              <w:spacing w:after="0"/>
+            </w:pPr>
+            <w:r>
+              <w:rPr>
+                <w:sz w:val="17"/>
+                <w:szCs w:val="17"/>
+              </w:rPr>
+              <w:t xml:space="preserve">7.7 · 0.9</w:t>
+            </w:r>
+          </w:p>
+        </w:tc>
+        <w:tc>
+          <w:tcPr>
+            <w:tcW w:type="dxa" w:w="1000"/>
+            <w:shd w:fill="FFFFFF" w:color="auto" w:val="clear"/>
+            <w:tcMar>
+              <w:top w:type="dxa" w:w="40"/>
+              <w:left w:type="dxa" w:w="70"/>
+              <w:bottom w:type="dxa" w:w="40"/>
+              <w:right w:type="dxa" w:w="70"/>
+            </w:tcMar>
+          </w:tcPr>
+          <w:p>
+            <w:pPr>
+              <w:spacing w:after="0"/>
+            </w:pPr>
+            <w:r>
+              <w:rPr>
+                <w:sz w:val="17"/>
+                <w:szCs w:val="17"/>
+              </w:rPr>
+              <w:t xml:space="preserve">21.7%</w:t>
+            </w:r>
+          </w:p>
+        </w:tc>
+        <w:tc>
+          <w:tcPr>
+            <w:tcW w:type="dxa" w:w="1000"/>
+            <w:shd w:fill="FFFFFF" w:color="auto" w:val="clear"/>
+            <w:tcMar>
+              <w:top w:type="dxa" w:w="40"/>
+              <w:left w:type="dxa" w:w="70"/>
+              <w:bottom w:type="dxa" w:w="40"/>
+              <w:right w:type="dxa" w:w="70"/>
+            </w:tcMar>
+          </w:tcPr>
+          <w:p>
+            <w:pPr>
+              <w:spacing w:after="0"/>
+            </w:pPr>
+            <w:r>
+              <w:rPr>
+                <w:sz w:val="17"/>
+                <w:szCs w:val="17"/>
+              </w:rPr>
+              <w:t xml:space="preserve">1.7</w:t>
+            </w:r>
+          </w:p>
+        </w:tc>
+        <w:tc>
+          <w:tcPr>
+            <w:tcW w:type="dxa" w:w="1500"/>
+            <w:shd w:fill="FFFFFF" w:color="auto" w:val="clear"/>
+            <w:tcMar>
+              <w:top w:type="dxa" w:w="40"/>
+              <w:left w:type="dxa" w:w="70"/>
+              <w:bottom w:type="dxa" w:w="40"/>
+              <w:right w:type="dxa" w:w="70"/>
+            </w:tcMar>
+          </w:tcPr>
+          <w:p>
+            <w:pPr>
+              <w:spacing w:after="0"/>
+            </w:pPr>
+            <w:r>
+              <w:rPr>
+                <w:sz w:val="17"/>
+                <w:szCs w:val="17"/>
+              </w:rPr>
+              <w:t xml:space="preserve">$6.93 ($6.93)</w:t>
+            </w:r>
+          </w:p>
+        </w:tc>
+        <w:tc>
+          <w:tcPr>
+            <w:tcW w:type="dxa" w:w="1772"/>
+            <w:shd w:fill="FFFFFF" w:color="auto" w:val="clear"/>
+            <w:tcMar>
+              <w:top w:type="dxa" w:w="40"/>
+              <w:left w:type="dxa" w:w="70"/>
+              <w:bottom w:type="dxa" w:w="40"/>
+              <w:right w:type="dxa" w:w="70"/>
+            </w:tcMar>
+          </w:tcPr>
+          <w:p>
+            <w:pPr>
+              <w:spacing w:after="0"/>
+            </w:pPr>
+            <w:r>
+              <w:rPr>
+                <w:sz w:val="17"/>
+                <w:szCs w:val="17"/>
+              </w:rPr>
+              <w:t xml:space="preserve">$53</w:t>
+            </w:r>
+          </w:p>
+        </w:tc>
+      </w:tr>
+      <w:tr>
+        <w:tc>
+          <w:tcPr>
+            <w:tcW w:type="dxa" w:w="2300"/>
+            <w:shd w:fill="F2F5F9" w:color="auto" w:val="clear"/>
+            <w:tcMar>
+              <w:top w:type="dxa" w:w="40"/>
+              <w:left w:type="dxa" w:w="70"/>
+              <w:bottom w:type="dxa" w:w="40"/>
+              <w:right w:type="dxa" w:w="70"/>
+            </w:tcMar>
+          </w:tcPr>
+          <w:p>
+            <w:pPr>
+              <w:spacing w:after="0"/>
+            </w:pPr>
+            <w:r>
+              <w:rPr>
+                <w:sz w:val="17"/>
+                <w:szCs w:val="17"/>
+              </w:rPr>
+              <w:t xml:space="preserve">full size bamboo sheets</w:t>
+            </w:r>
+          </w:p>
+        </w:tc>
+        <w:tc>
+          <w:tcPr>
+            <w:tcW w:type="dxa" w:w="1100"/>
+            <w:shd w:fill="F2F5F9" w:color="auto" w:val="clear"/>
+            <w:tcMar>
+              <w:top w:type="dxa" w:w="40"/>
+              <w:left w:type="dxa" w:w="70"/>
+              <w:bottom w:type="dxa" w:w="40"/>
+              <w:right w:type="dxa" w:w="70"/>
+            </w:tcMar>
+          </w:tcPr>
+          <w:p>
+            <w:pPr>
+              <w:spacing w:after="0"/>
+            </w:pPr>
+            <w:r>
+              <w:rPr>
+                <w:sz w:val="17"/>
+                <w:szCs w:val="17"/>
+              </w:rPr>
+              <w:t xml:space="preserve">23 → 10</w:t>
+            </w:r>
+          </w:p>
+        </w:tc>
+        <w:tc>
+          <w:tcPr>
+            <w:tcW w:type="dxa" w:w="1300"/>
+            <w:shd w:fill="F2F5F9" w:color="auto" w:val="clear"/>
+            <w:tcMar>
+              <w:top w:type="dxa" w:w="40"/>
+              <w:left w:type="dxa" w:w="70"/>
+              <w:bottom w:type="dxa" w:w="40"/>
+              <w:right w:type="dxa" w:w="70"/>
+            </w:tcMar>
+          </w:tcPr>
+          <w:p>
+            <w:pPr>
+              <w:spacing w:after="0"/>
+            </w:pPr>
+            <w:r>
+              <w:rPr>
+                <w:sz w:val="17"/>
+                <w:szCs w:val="17"/>
+              </w:rPr>
+              <w:t xml:space="preserve">7 · 1.4</w:t>
+            </w:r>
+          </w:p>
+        </w:tc>
+        <w:tc>
+          <w:tcPr>
+            <w:tcW w:type="dxa" w:w="1000"/>
+            <w:shd w:fill="F2F5F9" w:color="auto" w:val="clear"/>
+            <w:tcMar>
+              <w:top w:type="dxa" w:w="40"/>
+              <w:left w:type="dxa" w:w="70"/>
+              <w:bottom w:type="dxa" w:w="40"/>
+              <w:right w:type="dxa" w:w="70"/>
+            </w:tcMar>
+          </w:tcPr>
+          <w:p>
+            <w:pPr>
+              <w:spacing w:after="0"/>
+            </w:pPr>
+            <w:r>
+              <w:rPr>
+                <w:sz w:val="17"/>
+                <w:szCs w:val="17"/>
+              </w:rPr>
+              <w:t xml:space="preserve">12.5%</w:t>
+            </w:r>
+          </w:p>
+        </w:tc>
+        <w:tc>
+          <w:tcPr>
+            <w:tcW w:type="dxa" w:w="1000"/>
+            <w:shd w:fill="F2F5F9" w:color="auto" w:val="clear"/>
+            <w:tcMar>
+              <w:top w:type="dxa" w:w="40"/>
+              <w:left w:type="dxa" w:w="70"/>
+              <w:bottom w:type="dxa" w:w="40"/>
+              <w:right w:type="dxa" w:w="70"/>
+            </w:tcMar>
+          </w:tcPr>
+          <w:p>
+            <w:pPr>
+              <w:spacing w:after="0"/>
+            </w:pPr>
+            <w:r>
+              <w:rPr>
+                <w:sz w:val="17"/>
+                <w:szCs w:val="17"/>
+              </w:rPr>
+              <w:t xml:space="preserve">0.8</w:t>
+            </w:r>
+          </w:p>
+        </w:tc>
+        <w:tc>
+          <w:tcPr>
+            <w:tcW w:type="dxa" w:w="1500"/>
+            <w:shd w:fill="F2F5F9" w:color="auto" w:val="clear"/>
+            <w:tcMar>
+              <w:top w:type="dxa" w:w="40"/>
+              <w:left w:type="dxa" w:w="70"/>
+              <w:bottom w:type="dxa" w:w="40"/>
+              <w:right w:type="dxa" w:w="70"/>
+            </w:tcMar>
+          </w:tcPr>
+          <w:p>
+            <w:pPr>
+              <w:spacing w:after="0"/>
+            </w:pPr>
+            <w:r>
+              <w:rPr>
+                <w:sz w:val="17"/>
+                <w:szCs w:val="17"/>
+              </w:rPr>
+              <w:t xml:space="preserve">$5.28 ($6.40)</w:t>
+            </w:r>
+          </w:p>
+        </w:tc>
+        <w:tc>
+          <w:tcPr>
+            <w:tcW w:type="dxa" w:w="1772"/>
+            <w:shd w:fill="F2F5F9" w:color="auto" w:val="clear"/>
+            <w:tcMar>
+              <w:top w:type="dxa" w:w="40"/>
+              <w:left w:type="dxa" w:w="70"/>
+              <w:bottom w:type="dxa" w:w="40"/>
+              <w:right w:type="dxa" w:w="70"/>
+            </w:tcMar>
+          </w:tcPr>
+          <w:p>
+            <w:pPr>
+              <w:spacing w:after="0"/>
+            </w:pPr>
+            <w:r>
+              <w:rPr>
+                <w:sz w:val="17"/>
+                <w:szCs w:val="17"/>
+              </w:rPr>
+              <w:t xml:space="preserve">$35</w:t>
+            </w:r>
+          </w:p>
+        </w:tc>
+      </w:tr>
+      <w:tr>
+        <w:tc>
+          <w:tcPr>
+            <w:tcW w:type="dxa" w:w="2300"/>
+            <w:shd w:fill="FFFFFF" w:color="auto" w:val="clear"/>
+            <w:tcMar>
+              <w:top w:type="dxa" w:w="40"/>
+              <w:left w:type="dxa" w:w="70"/>
+              <w:bottom w:type="dxa" w:w="40"/>
+              <w:right w:type="dxa" w:w="70"/>
+            </w:tcMar>
+          </w:tcPr>
+          <w:p>
+            <w:pPr>
+              <w:spacing w:after="0"/>
+            </w:pPr>
+            <w:r>
+              <w:rPr>
+                <w:sz w:val="17"/>
+                <w:szCs w:val="17"/>
+              </w:rPr>
+              <w:t xml:space="preserve">queen bamboo sheet set</w:t>
+            </w:r>
+          </w:p>
+        </w:tc>
+        <w:tc>
+          <w:tcPr>
+            <w:tcW w:type="dxa" w:w="1100"/>
+            <w:shd w:fill="FFFFFF" w:color="auto" w:val="clear"/>
+            <w:tcMar>
+              <w:top w:type="dxa" w:w="40"/>
+              <w:left w:type="dxa" w:w="70"/>
+              <w:bottom w:type="dxa" w:w="40"/>
+              <w:right w:type="dxa" w:w="70"/>
+            </w:tcMar>
+          </w:tcPr>
+          <w:p>
+            <w:pPr>
+              <w:spacing w:after="0"/>
+            </w:pPr>
+            <w:r>
+              <w:rPr>
+                <w:sz w:val="17"/>
+                <w:szCs w:val="17"/>
+              </w:rPr>
+              <w:t xml:space="preserve">25 → 6</w:t>
+            </w:r>
+          </w:p>
+        </w:tc>
+        <w:tc>
+          <w:tcPr>
+            <w:tcW w:type="dxa" w:w="1300"/>
+            <w:shd w:fill="FFFFFF" w:color="auto" w:val="clear"/>
+            <w:tcMar>
+              <w:top w:type="dxa" w:w="40"/>
+              <w:left w:type="dxa" w:w="70"/>
+              <w:bottom w:type="dxa" w:w="40"/>
+              <w:right w:type="dxa" w:w="70"/>
+            </w:tcMar>
+          </w:tcPr>
+          <w:p>
+            <w:pPr>
+              <w:spacing w:after="0"/>
+            </w:pPr>
+            <w:r>
+              <w:rPr>
+                <w:sz w:val="17"/>
+                <w:szCs w:val="17"/>
+              </w:rPr>
+              <w:t xml:space="preserve">5 · 0.9</w:t>
+            </w:r>
+          </w:p>
+        </w:tc>
+        <w:tc>
+          <w:tcPr>
+            <w:tcW w:type="dxa" w:w="1000"/>
+            <w:shd w:fill="FFFFFF" w:color="auto" w:val="clear"/>
+            <w:tcMar>
+              <w:top w:type="dxa" w:w="40"/>
+              <w:left w:type="dxa" w:w="70"/>
+              <w:bottom w:type="dxa" w:w="40"/>
+              <w:right w:type="dxa" w:w="70"/>
+            </w:tcMar>
+          </w:tcPr>
+          <w:p>
+            <w:pPr>
+              <w:spacing w:after="0"/>
+            </w:pPr>
+            <w:r>
+              <w:rPr>
+                <w:sz w:val="17"/>
+                <w:szCs w:val="17"/>
+              </w:rPr>
+              <w:t xml:space="preserve">21.1%</w:t>
+            </w:r>
+          </w:p>
+        </w:tc>
+        <w:tc>
+          <w:tcPr>
+            <w:tcW w:type="dxa" w:w="1000"/>
+            <w:shd w:fill="FFFFFF" w:color="auto" w:val="clear"/>
+            <w:tcMar>
+              <w:top w:type="dxa" w:w="40"/>
+              <w:left w:type="dxa" w:w="70"/>
+              <w:bottom w:type="dxa" w:w="40"/>
+              <w:right w:type="dxa" w:w="70"/>
+            </w:tcMar>
+          </w:tcPr>
+          <w:p>
+            <w:pPr>
+              <w:spacing w:after="0"/>
+            </w:pPr>
+            <w:r>
+              <w:rPr>
+                <w:sz w:val="17"/>
+                <w:szCs w:val="17"/>
+              </w:rPr>
+              <w:t xml:space="preserve">1.1</w:t>
+            </w:r>
+          </w:p>
+        </w:tc>
+        <w:tc>
+          <w:tcPr>
+            <w:tcW w:type="dxa" w:w="1500"/>
+            <w:shd w:fill="FFFFFF" w:color="auto" w:val="clear"/>
+            <w:tcMar>
+              <w:top w:type="dxa" w:w="40"/>
+              <w:left w:type="dxa" w:w="70"/>
+              <w:bottom w:type="dxa" w:w="40"/>
+              <w:right w:type="dxa" w:w="70"/>
+            </w:tcMar>
+          </w:tcPr>
+          <w:p>
+            <w:pPr>
+              <w:spacing w:after="0"/>
+            </w:pPr>
+            <w:r>
+              <w:rPr>
+                <w:sz w:val="17"/>
+                <w:szCs w:val="17"/>
+              </w:rPr>
+              <w:t xml:space="preserve">$7.10 ($7.10)</w:t>
+            </w:r>
+          </w:p>
+        </w:tc>
+        <w:tc>
+          <w:tcPr>
+            <w:tcW w:type="dxa" w:w="1772"/>
+            <w:shd w:fill="FFFFFF" w:color="auto" w:val="clear"/>
+            <w:tcMar>
+              <w:top w:type="dxa" w:w="40"/>
+              <w:left w:type="dxa" w:w="70"/>
+              <w:bottom w:type="dxa" w:w="40"/>
+              <w:right w:type="dxa" w:w="70"/>
+            </w:tcMar>
+          </w:tcPr>
+          <w:p>
+            <w:pPr>
+              <w:spacing w:after="0"/>
+            </w:pPr>
+            <w:r>
+              <w:rPr>
+                <w:sz w:val="17"/>
+                <w:szCs w:val="17"/>
+              </w:rPr>
+              <w:t xml:space="preserve">$36</w:t>
+            </w:r>
+          </w:p>
+        </w:tc>
+      </w:tr>
+      <w:tr>
+        <w:tc>
+          <w:tcPr>
+            <w:tcW w:type="dxa" w:w="2300"/>
+            <w:shd w:fill="F2F5F9" w:color="auto" w:val="clear"/>
+            <w:tcMar>
+              <w:top w:type="dxa" w:w="40"/>
+              <w:left w:type="dxa" w:w="70"/>
+              <w:bottom w:type="dxa" w:w="40"/>
+              <w:right w:type="dxa" w:w="70"/>
+            </w:tcMar>
+          </w:tcPr>
+          <w:p>
+            <w:pPr>
+              <w:spacing w:after="0"/>
+            </w:pPr>
+            <w:r>
+              <w:rPr>
+                <w:sz w:val="17"/>
+                <w:szCs w:val="17"/>
+              </w:rPr>
+              <w:t xml:space="preserve">king bamboo sheets</w:t>
+            </w:r>
+          </w:p>
+        </w:tc>
+        <w:tc>
+          <w:tcPr>
+            <w:tcW w:type="dxa" w:w="1100"/>
+            <w:shd w:fill="F2F5F9" w:color="auto" w:val="clear"/>
+            <w:tcMar>
+              <w:top w:type="dxa" w:w="40"/>
+              <w:left w:type="dxa" w:w="70"/>
+              <w:bottom w:type="dxa" w:w="40"/>
+              <w:right w:type="dxa" w:w="70"/>
+            </w:tcMar>
+          </w:tcPr>
+          <w:p>
+            <w:pPr>
+              <w:spacing w:after="0"/>
+            </w:pPr>
+            <w:r>
+              <w:rPr>
+                <w:sz w:val="17"/>
+                <w:szCs w:val="17"/>
+              </w:rPr>
+              <w:t xml:space="preserve">15 → 10</w:t>
+            </w:r>
+          </w:p>
+        </w:tc>
+        <w:tc>
+          <w:tcPr>
+            <w:tcW w:type="dxa" w:w="1300"/>
+            <w:shd w:fill="F2F5F9" w:color="auto" w:val="clear"/>
+            <w:tcMar>
+              <w:top w:type="dxa" w:w="40"/>
+              <w:left w:type="dxa" w:w="70"/>
+              <w:bottom w:type="dxa" w:w="40"/>
+              <w:right w:type="dxa" w:w="70"/>
+            </w:tcMar>
+          </w:tcPr>
+          <w:p>
+            <w:pPr>
+              <w:spacing w:after="0"/>
+            </w:pPr>
+            <w:r>
+              <w:rPr>
+                <w:sz w:val="17"/>
+                <w:szCs w:val="17"/>
+              </w:rPr>
+              <w:t xml:space="preserve">4.3 · 0</w:t>
+            </w:r>
+          </w:p>
+        </w:tc>
+        <w:tc>
+          <w:tcPr>
+            <w:tcW w:type="dxa" w:w="1000"/>
+            <w:shd w:fill="F2F5F9" w:color="auto" w:val="clear"/>
+            <w:tcMar>
+              <w:top w:type="dxa" w:w="40"/>
+              <w:left w:type="dxa" w:w="70"/>
+              <w:bottom w:type="dxa" w:w="40"/>
+              <w:right w:type="dxa" w:w="70"/>
+            </w:tcMar>
+          </w:tcPr>
+          <w:p>
+            <w:pPr>
+              <w:spacing w:after="0"/>
+            </w:pPr>
+            <w:r>
+              <w:rPr>
+                <w:sz w:val="17"/>
+                <w:szCs w:val="17"/>
+              </w:rPr>
+              <w:t xml:space="preserve">19.2%</w:t>
+            </w:r>
+          </w:p>
+        </w:tc>
+        <w:tc>
+          <w:tcPr>
+            <w:tcW w:type="dxa" w:w="1000"/>
+            <w:shd w:fill="F2F5F9" w:color="auto" w:val="clear"/>
+            <w:tcMar>
+              <w:top w:type="dxa" w:w="40"/>
+              <w:left w:type="dxa" w:w="70"/>
+              <w:bottom w:type="dxa" w:w="40"/>
+              <w:right w:type="dxa" w:w="70"/>
+            </w:tcMar>
+          </w:tcPr>
+          <w:p>
+            <w:pPr>
+              <w:spacing w:after="0"/>
+            </w:pPr>
+            <w:r>
+              <w:rPr>
+                <w:sz w:val="17"/>
+                <w:szCs w:val="17"/>
+              </w:rPr>
+              <w:t xml:space="preserve">0.8</w:t>
+            </w:r>
+          </w:p>
+        </w:tc>
+        <w:tc>
+          <w:tcPr>
+            <w:tcW w:type="dxa" w:w="1500"/>
+            <w:shd w:fill="F2F5F9" w:color="auto" w:val="clear"/>
+            <w:tcMar>
+              <w:top w:type="dxa" w:w="40"/>
+              <w:left w:type="dxa" w:w="70"/>
+              <w:bottom w:type="dxa" w:w="40"/>
+              <w:right w:type="dxa" w:w="70"/>
+            </w:tcMar>
+          </w:tcPr>
+          <w:p>
+            <w:pPr>
+              <w:spacing w:after="0"/>
+            </w:pPr>
+            <w:r>
+              <w:rPr>
+                <w:sz w:val="17"/>
+                <w:szCs w:val="17"/>
+              </w:rPr>
+              <w:t xml:space="preserve">$3.83 ($6.12)</w:t>
+            </w:r>
+          </w:p>
+        </w:tc>
+        <w:tc>
+          <w:tcPr>
+            <w:tcW w:type="dxa" w:w="1772"/>
+            <w:shd w:fill="F2F5F9" w:color="auto" w:val="clear"/>
+            <w:tcMar>
+              <w:top w:type="dxa" w:w="40"/>
+              <w:left w:type="dxa" w:w="70"/>
+              <w:bottom w:type="dxa" w:w="40"/>
+              <w:right w:type="dxa" w:w="70"/>
+            </w:tcMar>
+          </w:tcPr>
+          <w:p>
+            <w:pPr>
+              <w:spacing w:after="0"/>
+            </w:pPr>
+            <w:r>
+              <w:rPr>
+                <w:sz w:val="17"/>
+                <w:szCs w:val="17"/>
+              </w:rPr>
+              <w:t xml:space="preserve">$16</w:t>
+            </w:r>
+          </w:p>
+        </w:tc>
+      </w:tr>
+      <w:tr>
+        <w:tc>
+          <w:tcPr>
+            <w:tcW w:type="dxa" w:w="2300"/>
+            <w:shd w:fill="FFFFFF" w:color="auto" w:val="clear"/>
+            <w:tcMar>
+              <w:top w:type="dxa" w:w="40"/>
+              <w:left w:type="dxa" w:w="70"/>
+              <w:bottom w:type="dxa" w:w="40"/>
+              <w:right w:type="dxa" w:w="70"/>
+            </w:tcMar>
+          </w:tcPr>
+          <w:p>
+            <w:pPr>
+              <w:spacing w:after="0"/>
+            </w:pPr>
+            <w:r>
+              <w:rPr>
+                <w:sz w:val="17"/>
+                <w:szCs w:val="17"/>
+              </w:rPr>
+              <w:t xml:space="preserve">bamboo king sheets</w:t>
+            </w:r>
+          </w:p>
+        </w:tc>
+        <w:tc>
+          <w:tcPr>
+            <w:tcW w:type="dxa" w:w="1100"/>
+            <w:shd w:fill="FFFFFF" w:color="auto" w:val="clear"/>
+            <w:tcMar>
+              <w:top w:type="dxa" w:w="40"/>
+              <w:left w:type="dxa" w:w="70"/>
+              <w:bottom w:type="dxa" w:w="40"/>
+              <w:right w:type="dxa" w:w="70"/>
+            </w:tcMar>
+          </w:tcPr>
+          <w:p>
+            <w:pPr>
+              <w:spacing w:after="0"/>
+            </w:pPr>
+            <w:r>
+              <w:rPr>
+                <w:sz w:val="17"/>
+                <w:szCs w:val="17"/>
+              </w:rPr>
+              <w:t xml:space="preserve">23 → 9</w:t>
+            </w:r>
+          </w:p>
+        </w:tc>
+        <w:tc>
+          <w:tcPr>
+            <w:tcW w:type="dxa" w:w="1300"/>
+            <w:shd w:fill="FFFFFF" w:color="auto" w:val="clear"/>
+            <w:tcMar>
+              <w:top w:type="dxa" w:w="40"/>
+              <w:left w:type="dxa" w:w="70"/>
+              <w:bottom w:type="dxa" w:w="40"/>
+              <w:right w:type="dxa" w:w="70"/>
+            </w:tcMar>
+          </w:tcPr>
+          <w:p>
+            <w:pPr>
+              <w:spacing w:after="0"/>
+            </w:pPr>
+            <w:r>
+              <w:rPr>
+                <w:sz w:val="17"/>
+                <w:szCs w:val="17"/>
+              </w:rPr>
+              <w:t xml:space="preserve">3.9 · 0 (paused)</w:t>
+            </w:r>
+          </w:p>
+        </w:tc>
+        <w:tc>
+          <w:tcPr>
+            <w:tcW w:type="dxa" w:w="1000"/>
+            <w:shd w:fill="FFFFFF" w:color="auto" w:val="clear"/>
+            <w:tcMar>
+              <w:top w:type="dxa" w:w="40"/>
+              <w:left w:type="dxa" w:w="70"/>
+              <w:bottom w:type="dxa" w:w="40"/>
+              <w:right w:type="dxa" w:w="70"/>
+            </w:tcMar>
+          </w:tcPr>
+          <w:p>
+            <w:pPr>
+              <w:spacing w:after="0"/>
+            </w:pPr>
+            <w:r>
+              <w:rPr>
+                <w:sz w:val="17"/>
+                <w:szCs w:val="17"/>
+              </w:rPr>
+              <w:t xml:space="preserve">12.7%*</w:t>
+            </w:r>
+          </w:p>
+        </w:tc>
+        <w:tc>
+          <w:tcPr>
+            <w:tcW w:type="dxa" w:w="1000"/>
+            <w:shd w:fill="FFFFFF" w:color="auto" w:val="clear"/>
+            <w:tcMar>
+              <w:top w:type="dxa" w:w="40"/>
+              <w:left w:type="dxa" w:w="70"/>
+              <w:bottom w:type="dxa" w:w="40"/>
+              <w:right w:type="dxa" w:w="70"/>
+            </w:tcMar>
+          </w:tcPr>
+          <w:p>
+            <w:pPr>
+              <w:spacing w:after="0"/>
+            </w:pPr>
+            <w:r>
+              <w:rPr>
+                <w:sz w:val="17"/>
+                <w:szCs w:val="17"/>
+              </w:rPr>
+              <w:t xml:space="preserve">0.5</w:t>
+            </w:r>
+          </w:p>
+        </w:tc>
+        <w:tc>
+          <w:tcPr>
+            <w:tcW w:type="dxa" w:w="1500"/>
+            <w:shd w:fill="FFFFFF" w:color="auto" w:val="clear"/>
+            <w:tcMar>
+              <w:top w:type="dxa" w:w="40"/>
+              <w:left w:type="dxa" w:w="70"/>
+              <w:bottom w:type="dxa" w:w="40"/>
+              <w:right w:type="dxa" w:w="70"/>
+            </w:tcMar>
+          </w:tcPr>
+          <w:p>
+            <w:pPr>
+              <w:spacing w:after="0"/>
+            </w:pPr>
+            <w:r>
+              <w:rPr>
+                <w:sz w:val="17"/>
+                <w:szCs w:val="17"/>
+              </w:rPr>
+              <w:t xml:space="preserve">$3.61 ($4.06)</w:t>
+            </w:r>
+          </w:p>
+        </w:tc>
+        <w:tc>
+          <w:tcPr>
+            <w:tcW w:type="dxa" w:w="1772"/>
+            <w:shd w:fill="FFFFFF" w:color="auto" w:val="clear"/>
+            <w:tcMar>
+              <w:top w:type="dxa" w:w="40"/>
+              <w:left w:type="dxa" w:w="70"/>
+              <w:bottom w:type="dxa" w:w="40"/>
+              <w:right w:type="dxa" w:w="70"/>
+            </w:tcMar>
+          </w:tcPr>
+          <w:p>
+            <w:pPr>
+              <w:spacing w:after="0"/>
+            </w:pPr>
+            <w:r>
+              <w:rPr>
+                <w:sz w:val="17"/>
+                <w:szCs w:val="17"/>
+              </w:rPr>
+              <w:t xml:space="preserve">$14</w:t>
+            </w:r>
+          </w:p>
+        </w:tc>
+      </w:tr>
+      <w:tr>
+        <w:tc>
+          <w:tcPr>
+            <w:tcW w:type="dxa" w:w="2300"/>
+            <w:shd w:fill="F2F5F9" w:color="auto" w:val="clear"/>
+            <w:tcMar>
+              <w:top w:type="dxa" w:w="40"/>
+              <w:left w:type="dxa" w:w="70"/>
+              <w:bottom w:type="dxa" w:w="40"/>
+              <w:right w:type="dxa" w:w="70"/>
+            </w:tcMar>
+          </w:tcPr>
+          <w:p>
+            <w:pPr>
+              <w:spacing w:after="0"/>
+            </w:pPr>
+            <w:r>
+              <w:rPr>
+                <w:sz w:val="17"/>
+                <w:szCs w:val="17"/>
+              </w:rPr>
+              <w:t xml:space="preserve">Near the top</w:t>
+            </w:r>
+          </w:p>
+        </w:tc>
+        <w:tc>
+          <w:tcPr>
+            <w:tcW w:type="dxa" w:w="1100"/>
+            <w:shd w:fill="F2F5F9" w:color="auto" w:val="clear"/>
+            <w:tcMar>
+              <w:top w:type="dxa" w:w="40"/>
+              <w:left w:type="dxa" w:w="70"/>
+              <w:bottom w:type="dxa" w:w="40"/>
+              <w:right w:type="dxa" w:w="70"/>
+            </w:tcMar>
+          </w:tcPr>
+          <w:p>
+            <w:pPr>
+              <w:spacing w:after="0"/>
+            </w:pPr>
+            <w:r>
+              <w:rPr>
+                <w:sz w:val="17"/>
+                <w:szCs w:val="17"/>
+              </w:rPr>
               <w:t xml:space="preserve"/>
             </w:r>
           </w:p>
@@ -5190,31 +6100,31 @@
         <w:tc>
           <w:tcPr>
             <w:tcW w:type="dxa" w:w="1300"/>
-            <w:shd w:fill="FFFFFF" w:color="auto" w:val="clear"/>
-            <w:tcMar>
-              <w:top w:type="dxa" w:w="40"/>
-              <w:left w:type="dxa" w:w="70"/>
-              <w:bottom w:type="dxa" w:w="40"/>
-              <w:right w:type="dxa" w:w="70"/>
-            </w:tcMar>
-          </w:tcPr>
-          <w:p>
-            <w:pPr>
-              <w:spacing w:after="0"/>
-            </w:pPr>
-            <w:r>
-              <w:rPr>
-                <w:sz w:val="17"/>
-                <w:szCs w:val="17"/>
-              </w:rPr>
-              <w:t xml:space="preserve">202</w:t>
+            <w:shd w:fill="F2F5F9" w:color="auto" w:val="clear"/>
+            <w:tcMar>
+              <w:top w:type="dxa" w:w="40"/>
+              <w:left w:type="dxa" w:w="70"/>
+              <w:bottom w:type="dxa" w:w="40"/>
+              <w:right w:type="dxa" w:w="70"/>
+            </w:tcMar>
+          </w:tcPr>
+          <w:p>
+            <w:pPr>
+              <w:spacing w:after="0"/>
+            </w:pPr>
+            <w:r>
+              <w:rPr>
+                <w:sz w:val="17"/>
+                <w:szCs w:val="17"/>
+              </w:rPr>
+              <w:t xml:space="preserve"/>
             </w:r>
           </w:p>
         </w:tc>
         <w:tc>
           <w:tcPr>
             <w:tcW w:type="dxa" w:w="1000"/>
-            <w:shd w:fill="FFFFFF" w:color="auto" w:val="clear"/>
+            <w:shd w:fill="F2F5F9" w:color="auto" w:val="clear"/>
             <w:tcMar>
               <w:top w:type="dxa" w:w="40"/>
               <w:left w:type="dxa" w:w="70"/>
@@ -5238,31 +6148,31 @@
         <w:tc>
           <w:tcPr>
             <w:tcW w:type="dxa" w:w="1000"/>
-            <w:shd w:fill="FFFFFF" w:color="auto" w:val="clear"/>
-            <w:tcMar>
-              <w:top w:type="dxa" w:w="40"/>
-              <w:left w:type="dxa" w:w="70"/>
-              <w:bottom w:type="dxa" w:w="40"/>
-              <w:right w:type="dxa" w:w="70"/>
-            </w:tcMar>
-          </w:tcPr>
-          <w:p>
-            <w:pPr>
-              <w:spacing w:after="0"/>
-            </w:pPr>
-            <w:r>
-              <w:rPr>
-                <w:sz w:val="17"/>
-                <w:szCs w:val="17"/>
-              </w:rPr>
-              <w:t xml:space="preserve">36</w:t>
+            <w:shd w:fill="F2F5F9" w:color="auto" w:val="clear"/>
+            <w:tcMar>
+              <w:top w:type="dxa" w:w="40"/>
+              <w:left w:type="dxa" w:w="70"/>
+              <w:bottom w:type="dxa" w:w="40"/>
+              <w:right w:type="dxa" w:w="70"/>
+            </w:tcMar>
+          </w:tcPr>
+          <w:p>
+            <w:pPr>
+              <w:spacing w:after="0"/>
+            </w:pPr>
+            <w:r>
+              <w:rPr>
+                <w:sz w:val="17"/>
+                <w:szCs w:val="17"/>
+              </w:rPr>
+              <w:t xml:space="preserve"/>
             </w:r>
           </w:p>
         </w:tc>
         <w:tc>
           <w:tcPr>
             <w:tcW w:type="dxa" w:w="1500"/>
-            <w:shd w:fill="FFFFFF" w:color="auto" w:val="clear"/>
+            <w:shd w:fill="F2F5F9" w:color="auto" w:val="clear"/>
             <w:tcMar>
               <w:top w:type="dxa" w:w="40"/>
               <w:left w:type="dxa" w:w="70"/>
@@ -5286,24 +6196,1384 @@
         <w:tc>
           <w:tcPr>
             <w:tcW w:type="dxa" w:w="1772"/>
-            <w:shd w:fill="FFFFFF" w:color="auto" w:val="clear"/>
-            <w:tcMar>
-              <w:top w:type="dxa" w:w="40"/>
-              <w:left w:type="dxa" w:w="70"/>
-              <w:bottom w:type="dxa" w:w="40"/>
-              <w:right w:type="dxa" w:w="70"/>
-            </w:tcMar>
-          </w:tcPr>
-          <w:p>
-            <w:pPr>
-              <w:spacing w:after="0"/>
-            </w:pPr>
-            <w:r>
-              <w:rPr>
-                <w:sz w:val="17"/>
-                <w:szCs w:val="17"/>
-              </w:rPr>
-              <w:t xml:space="preserve">$1,199</w:t>
+            <w:shd w:fill="F2F5F9" w:color="auto" w:val="clear"/>
+            <w:tcMar>
+              <w:top w:type="dxa" w:w="40"/>
+              <w:left w:type="dxa" w:w="70"/>
+              <w:bottom w:type="dxa" w:w="40"/>
+              <w:right w:type="dxa" w:w="70"/>
+            </w:tcMar>
+          </w:tcPr>
+          <w:p>
+            <w:pPr>
+              <w:spacing w:after="0"/>
+            </w:pPr>
+            <w:r>
+              <w:rPr>
+                <w:sz w:val="17"/>
+                <w:szCs w:val="17"/>
+              </w:rPr>
+              <w:t xml:space="preserve"/>
+            </w:r>
+          </w:p>
+        </w:tc>
+      </w:tr>
+      <w:tr>
+        <w:tc>
+          <w:tcPr>
+            <w:tcW w:type="dxa" w:w="2300"/>
+            <w:shd w:fill="FFFFFF" w:color="auto" w:val="clear"/>
+            <w:tcMar>
+              <w:top w:type="dxa" w:w="40"/>
+              <w:left w:type="dxa" w:w="70"/>
+              <w:bottom w:type="dxa" w:w="40"/>
+              <w:right w:type="dxa" w:w="70"/>
+            </w:tcMar>
+          </w:tcPr>
+          <w:p>
+            <w:pPr>
+              <w:spacing w:after="0"/>
+            </w:pPr>
+            <w:r>
+              <w:rPr>
+                <w:sz w:val="17"/>
+                <w:szCs w:val="17"/>
+              </w:rPr>
+              <w:t xml:space="preserve">bamboo sheets with corner straps</w:t>
+            </w:r>
+          </w:p>
+        </w:tc>
+        <w:tc>
+          <w:tcPr>
+            <w:tcW w:type="dxa" w:w="1100"/>
+            <w:shd w:fill="FFFFFF" w:color="auto" w:val="clear"/>
+            <w:tcMar>
+              <w:top w:type="dxa" w:w="40"/>
+              <w:left w:type="dxa" w:w="70"/>
+              <w:bottom w:type="dxa" w:w="40"/>
+              <w:right w:type="dxa" w:w="70"/>
+            </w:tcMar>
+          </w:tcPr>
+          <w:p>
+            <w:pPr>
+              <w:spacing w:after="0"/>
+            </w:pPr>
+            <w:r>
+              <w:rPr>
+                <w:sz w:val="17"/>
+                <w:szCs w:val="17"/>
+              </w:rPr>
+              <w:t xml:space="preserve">7 → 1</w:t>
+            </w:r>
+          </w:p>
+        </w:tc>
+        <w:tc>
+          <w:tcPr>
+            <w:tcW w:type="dxa" w:w="1300"/>
+            <w:shd w:fill="FFFFFF" w:color="auto" w:val="clear"/>
+            <w:tcMar>
+              <w:top w:type="dxa" w:w="40"/>
+              <w:left w:type="dxa" w:w="70"/>
+              <w:bottom w:type="dxa" w:w="40"/>
+              <w:right w:type="dxa" w:w="70"/>
+            </w:tcMar>
+          </w:tcPr>
+          <w:p>
+            <w:pPr>
+              <w:spacing w:after="0"/>
+            </w:pPr>
+            <w:r>
+              <w:rPr>
+                <w:sz w:val="17"/>
+                <w:szCs w:val="17"/>
+              </w:rPr>
+              <w:t xml:space="preserve">2.4 · 0.4</w:t>
+            </w:r>
+          </w:p>
+        </w:tc>
+        <w:tc>
+          <w:tcPr>
+            <w:tcW w:type="dxa" w:w="1000"/>
+            <w:shd w:fill="FFFFFF" w:color="auto" w:val="clear"/>
+            <w:tcMar>
+              <w:top w:type="dxa" w:w="40"/>
+              <w:left w:type="dxa" w:w="70"/>
+              <w:bottom w:type="dxa" w:w="40"/>
+              <w:right w:type="dxa" w:w="70"/>
+            </w:tcMar>
+          </w:tcPr>
+          <w:p>
+            <w:pPr>
+              <w:spacing w:after="0"/>
+            </w:pPr>
+            <w:r>
+              <w:rPr>
+                <w:sz w:val="17"/>
+                <w:szCs w:val="17"/>
+              </w:rPr>
+              <w:t xml:space="preserve">22.0%</w:t>
+            </w:r>
+          </w:p>
+        </w:tc>
+        <w:tc>
+          <w:tcPr>
+            <w:tcW w:type="dxa" w:w="1000"/>
+            <w:shd w:fill="FFFFFF" w:color="auto" w:val="clear"/>
+            <w:tcMar>
+              <w:top w:type="dxa" w:w="40"/>
+              <w:left w:type="dxa" w:w="70"/>
+              <w:bottom w:type="dxa" w:w="40"/>
+              <w:right w:type="dxa" w:w="70"/>
+            </w:tcMar>
+          </w:tcPr>
+          <w:p>
+            <w:pPr>
+              <w:spacing w:after="0"/>
+            </w:pPr>
+            <w:r>
+              <w:rPr>
+                <w:sz w:val="17"/>
+                <w:szCs w:val="17"/>
+              </w:rPr>
+              <w:t xml:space="preserve">0.5</w:t>
+            </w:r>
+          </w:p>
+        </w:tc>
+        <w:tc>
+          <w:tcPr>
+            <w:tcW w:type="dxa" w:w="1500"/>
+            <w:shd w:fill="FFFFFF" w:color="auto" w:val="clear"/>
+            <w:tcMar>
+              <w:top w:type="dxa" w:w="40"/>
+              <w:left w:type="dxa" w:w="70"/>
+              <w:bottom w:type="dxa" w:w="40"/>
+              <w:right w:type="dxa" w:w="70"/>
+            </w:tcMar>
+          </w:tcPr>
+          <w:p>
+            <w:pPr>
+              <w:spacing w:after="0"/>
+            </w:pPr>
+            <w:r>
+              <w:rPr>
+                <w:sz w:val="17"/>
+                <w:szCs w:val="17"/>
+              </w:rPr>
+              <w:t xml:space="preserve">$7.03 ($7.03)</w:t>
+            </w:r>
+          </w:p>
+        </w:tc>
+        <w:tc>
+          <w:tcPr>
+            <w:tcW w:type="dxa" w:w="1772"/>
+            <w:shd w:fill="FFFFFF" w:color="auto" w:val="clear"/>
+            <w:tcMar>
+              <w:top w:type="dxa" w:w="40"/>
+              <w:left w:type="dxa" w:w="70"/>
+              <w:bottom w:type="dxa" w:w="40"/>
+              <w:right w:type="dxa" w:w="70"/>
+            </w:tcMar>
+          </w:tcPr>
+          <w:p>
+            <w:pPr>
+              <w:spacing w:after="0"/>
+            </w:pPr>
+            <w:r>
+              <w:rPr>
+                <w:sz w:val="17"/>
+                <w:szCs w:val="17"/>
+              </w:rPr>
+              <w:t xml:space="preserve">$17</w:t>
+            </w:r>
+          </w:p>
+        </w:tc>
+      </w:tr>
+      <w:tr>
+        <w:tc>
+          <w:tcPr>
+            <w:tcW w:type="dxa" w:w="2300"/>
+            <w:shd w:fill="F2F5F9" w:color="auto" w:val="clear"/>
+            <w:tcMar>
+              <w:top w:type="dxa" w:w="40"/>
+              <w:left w:type="dxa" w:w="70"/>
+              <w:bottom w:type="dxa" w:w="40"/>
+              <w:right w:type="dxa" w:w="70"/>
+            </w:tcMar>
+          </w:tcPr>
+          <w:p>
+            <w:pPr>
+              <w:spacing w:after="0"/>
+            </w:pPr>
+            <w:r>
+              <w:rPr>
+                <w:sz w:val="17"/>
+                <w:szCs w:val="17"/>
+              </w:rPr>
+              <w:t xml:space="preserve">viscose bamboo sheets</w:t>
+            </w:r>
+          </w:p>
+        </w:tc>
+        <w:tc>
+          <w:tcPr>
+            <w:tcW w:type="dxa" w:w="1100"/>
+            <w:shd w:fill="F2F5F9" w:color="auto" w:val="clear"/>
+            <w:tcMar>
+              <w:top w:type="dxa" w:w="40"/>
+              <w:left w:type="dxa" w:w="70"/>
+              <w:bottom w:type="dxa" w:w="40"/>
+              <w:right w:type="dxa" w:w="70"/>
+            </w:tcMar>
+          </w:tcPr>
+          <w:p>
+            <w:pPr>
+              <w:spacing w:after="0"/>
+            </w:pPr>
+            <w:r>
+              <w:rPr>
+                <w:sz w:val="17"/>
+                <w:szCs w:val="17"/>
+              </w:rPr>
+              <w:t xml:space="preserve">8 → 1</w:t>
+            </w:r>
+          </w:p>
+        </w:tc>
+        <w:tc>
+          <w:tcPr>
+            <w:tcW w:type="dxa" w:w="1300"/>
+            <w:shd w:fill="F2F5F9" w:color="auto" w:val="clear"/>
+            <w:tcMar>
+              <w:top w:type="dxa" w:w="40"/>
+              <w:left w:type="dxa" w:w="70"/>
+              <w:bottom w:type="dxa" w:w="40"/>
+              <w:right w:type="dxa" w:w="70"/>
+            </w:tcMar>
+          </w:tcPr>
+          <w:p>
+            <w:pPr>
+              <w:spacing w:after="0"/>
+            </w:pPr>
+            <w:r>
+              <w:rPr>
+                <w:sz w:val="17"/>
+                <w:szCs w:val="17"/>
+              </w:rPr>
+              <w:t xml:space="preserve">1.1 · 2.5</w:t>
+            </w:r>
+          </w:p>
+        </w:tc>
+        <w:tc>
+          <w:tcPr>
+            <w:tcW w:type="dxa" w:w="1000"/>
+            <w:shd w:fill="F2F5F9" w:color="auto" w:val="clear"/>
+            <w:tcMar>
+              <w:top w:type="dxa" w:w="40"/>
+              <w:left w:type="dxa" w:w="70"/>
+              <w:bottom w:type="dxa" w:w="40"/>
+              <w:right w:type="dxa" w:w="70"/>
+            </w:tcMar>
+          </w:tcPr>
+          <w:p>
+            <w:pPr>
+              <w:spacing w:after="0"/>
+            </w:pPr>
+            <w:r>
+              <w:rPr>
+                <w:sz w:val="17"/>
+                <w:szCs w:val="17"/>
+              </w:rPr>
+              <w:t xml:space="preserve">15.7%</w:t>
+            </w:r>
+          </w:p>
+        </w:tc>
+        <w:tc>
+          <w:tcPr>
+            <w:tcW w:type="dxa" w:w="1000"/>
+            <w:shd w:fill="F2F5F9" w:color="auto" w:val="clear"/>
+            <w:tcMar>
+              <w:top w:type="dxa" w:w="40"/>
+              <w:left w:type="dxa" w:w="70"/>
+              <w:bottom w:type="dxa" w:w="40"/>
+              <w:right w:type="dxa" w:w="70"/>
+            </w:tcMar>
+          </w:tcPr>
+          <w:p>
+            <w:pPr>
+              <w:spacing w:after="0"/>
+            </w:pPr>
+            <w:r>
+              <w:rPr>
+                <w:sz w:val="17"/>
+                <w:szCs w:val="17"/>
+              </w:rPr>
+              <w:t xml:space="preserve">0.2</w:t>
+            </w:r>
+          </w:p>
+        </w:tc>
+        <w:tc>
+          <w:tcPr>
+            <w:tcW w:type="dxa" w:w="1500"/>
+            <w:shd w:fill="F2F5F9" w:color="auto" w:val="clear"/>
+            <w:tcMar>
+              <w:top w:type="dxa" w:w="40"/>
+              <w:left w:type="dxa" w:w="70"/>
+              <w:bottom w:type="dxa" w:w="40"/>
+              <w:right w:type="dxa" w:w="70"/>
+            </w:tcMar>
+          </w:tcPr>
+          <w:p>
+            <w:pPr>
+              <w:spacing w:after="0"/>
+            </w:pPr>
+            <w:r>
+              <w:rPr>
+                <w:sz w:val="17"/>
+                <w:szCs w:val="17"/>
+              </w:rPr>
+              <w:t xml:space="preserve">$6.13 ($6.13)</w:t>
+            </w:r>
+          </w:p>
+        </w:tc>
+        <w:tc>
+          <w:tcPr>
+            <w:tcW w:type="dxa" w:w="1772"/>
+            <w:shd w:fill="F2F5F9" w:color="auto" w:val="clear"/>
+            <w:tcMar>
+              <w:top w:type="dxa" w:w="40"/>
+              <w:left w:type="dxa" w:w="70"/>
+              <w:bottom w:type="dxa" w:w="40"/>
+              <w:right w:type="dxa" w:w="70"/>
+            </w:tcMar>
+          </w:tcPr>
+          <w:p>
+            <w:pPr>
+              <w:spacing w:after="0"/>
+            </w:pPr>
+            <w:r>
+              <w:rPr>
+                <w:sz w:val="17"/>
+                <w:szCs w:val="17"/>
+              </w:rPr>
+              <w:t xml:space="preserve">$7</w:t>
+            </w:r>
+          </w:p>
+        </w:tc>
+      </w:tr>
+      <w:tr>
+        <w:tc>
+          <w:tcPr>
+            <w:tcW w:type="dxa" w:w="2300"/>
+            <w:shd w:fill="FFFFFF" w:color="auto" w:val="clear"/>
+            <w:tcMar>
+              <w:top w:type="dxa" w:w="40"/>
+              <w:left w:type="dxa" w:w="70"/>
+              <w:bottom w:type="dxa" w:w="40"/>
+              <w:right w:type="dxa" w:w="70"/>
+            </w:tcMar>
+          </w:tcPr>
+          <w:p>
+            <w:pPr>
+              <w:spacing w:after="0"/>
+            </w:pPr>
+            <w:r>
+              <w:rPr>
+                <w:sz w:val="17"/>
+                <w:szCs w:val="17"/>
+              </w:rPr>
+              <w:t xml:space="preserve">bamboo sheets queen (after the fix in Section 13)</w:t>
+            </w:r>
+          </w:p>
+        </w:tc>
+        <w:tc>
+          <w:tcPr>
+            <w:tcW w:type="dxa" w:w="1100"/>
+            <w:shd w:fill="FFFFFF" w:color="auto" w:val="clear"/>
+            <w:tcMar>
+              <w:top w:type="dxa" w:w="40"/>
+              <w:left w:type="dxa" w:w="70"/>
+              <w:bottom w:type="dxa" w:w="40"/>
+              <w:right w:type="dxa" w:w="70"/>
+            </w:tcMar>
+          </w:tcPr>
+          <w:p>
+            <w:pPr>
+              <w:spacing w:after="0"/>
+            </w:pPr>
+            <w:r>
+              <w:rPr>
+                <w:sz w:val="17"/>
+                <w:szCs w:val="17"/>
+              </w:rPr>
+              <w:t xml:space="preserve">58 → 5</w:t>
+            </w:r>
+          </w:p>
+        </w:tc>
+        <w:tc>
+          <w:tcPr>
+            <w:tcW w:type="dxa" w:w="1300"/>
+            <w:shd w:fill="FFFFFF" w:color="auto" w:val="clear"/>
+            <w:tcMar>
+              <w:top w:type="dxa" w:w="40"/>
+              <w:left w:type="dxa" w:w="70"/>
+              <w:bottom w:type="dxa" w:w="40"/>
+              <w:right w:type="dxa" w:w="70"/>
+            </w:tcMar>
+          </w:tcPr>
+          <w:p>
+            <w:pPr>
+              <w:spacing w:after="0"/>
+            </w:pPr>
+            <w:r>
+              <w:rPr>
+                <w:sz w:val="17"/>
+                <w:szCs w:val="17"/>
+              </w:rPr>
+              <w:t xml:space="preserve">1.8 · 0.4</w:t>
+            </w:r>
+          </w:p>
+        </w:tc>
+        <w:tc>
+          <w:tcPr>
+            <w:tcW w:type="dxa" w:w="1000"/>
+            <w:shd w:fill="FFFFFF" w:color="auto" w:val="clear"/>
+            <w:tcMar>
+              <w:top w:type="dxa" w:w="40"/>
+              <w:left w:type="dxa" w:w="70"/>
+              <w:bottom w:type="dxa" w:w="40"/>
+              <w:right w:type="dxa" w:w="70"/>
+            </w:tcMar>
+          </w:tcPr>
+          <w:p>
+            <w:pPr>
+              <w:spacing w:after="0"/>
+            </w:pPr>
+            <w:r>
+              <w:rPr>
+                <w:sz w:val="17"/>
+                <w:szCs w:val="17"/>
+              </w:rPr>
+              <w:t xml:space="preserve">25.4%</w:t>
+            </w:r>
+          </w:p>
+        </w:tc>
+        <w:tc>
+          <w:tcPr>
+            <w:tcW w:type="dxa" w:w="1000"/>
+            <w:shd w:fill="FFFFFF" w:color="auto" w:val="clear"/>
+            <w:tcMar>
+              <w:top w:type="dxa" w:w="40"/>
+              <w:left w:type="dxa" w:w="70"/>
+              <w:bottom w:type="dxa" w:w="40"/>
+              <w:right w:type="dxa" w:w="70"/>
+            </w:tcMar>
+          </w:tcPr>
+          <w:p>
+            <w:pPr>
+              <w:spacing w:after="0"/>
+            </w:pPr>
+            <w:r>
+              <w:rPr>
+                <w:sz w:val="17"/>
+                <w:szCs w:val="17"/>
+              </w:rPr>
+              <w:t xml:space="preserve">0.5</w:t>
+            </w:r>
+          </w:p>
+        </w:tc>
+        <w:tc>
+          <w:tcPr>
+            <w:tcW w:type="dxa" w:w="1500"/>
+            <w:shd w:fill="FFFFFF" w:color="auto" w:val="clear"/>
+            <w:tcMar>
+              <w:top w:type="dxa" w:w="40"/>
+              <w:left w:type="dxa" w:w="70"/>
+              <w:bottom w:type="dxa" w:w="40"/>
+              <w:right w:type="dxa" w:w="70"/>
+            </w:tcMar>
+          </w:tcPr>
+          <w:p>
+            <w:pPr>
+              <w:spacing w:after="0"/>
+            </w:pPr>
+            <w:r>
+              <w:rPr>
+                <w:sz w:val="17"/>
+                <w:szCs w:val="17"/>
+              </w:rPr>
+              <w:t xml:space="preserve">$4.18 ($9.92)</w:t>
+            </w:r>
+          </w:p>
+        </w:tc>
+        <w:tc>
+          <w:tcPr>
+            <w:tcW w:type="dxa" w:w="1772"/>
+            <w:shd w:fill="FFFFFF" w:color="auto" w:val="clear"/>
+            <w:tcMar>
+              <w:top w:type="dxa" w:w="40"/>
+              <w:left w:type="dxa" w:w="70"/>
+              <w:bottom w:type="dxa" w:w="40"/>
+              <w:right w:type="dxa" w:w="70"/>
+            </w:tcMar>
+          </w:tcPr>
+          <w:p>
+            <w:pPr>
+              <w:spacing w:after="0"/>
+            </w:pPr>
+            <w:r>
+              <w:rPr>
+                <w:sz w:val="17"/>
+                <w:szCs w:val="17"/>
+              </w:rPr>
+              <w:t xml:space="preserve">$8</w:t>
+            </w:r>
+          </w:p>
+        </w:tc>
+      </w:tr>
+      <w:tr>
+        <w:tc>
+          <w:tcPr>
+            <w:tcW w:type="dxa" w:w="2300"/>
+            <w:shd w:fill="F2F5F9" w:color="auto" w:val="clear"/>
+            <w:tcMar>
+              <w:top w:type="dxa" w:w="40"/>
+              <w:left w:type="dxa" w:w="70"/>
+              <w:bottom w:type="dxa" w:w="40"/>
+              <w:right w:type="dxa" w:w="70"/>
+            </w:tcMar>
+          </w:tcPr>
+          <w:p>
+            <w:pPr>
+              <w:spacing w:after="0"/>
+            </w:pPr>
+            <w:r>
+              <w:rPr>
+                <w:sz w:val="17"/>
+                <w:szCs w:val="17"/>
+              </w:rPr>
+              <w:t xml:space="preserve">Cooling terms: new exact campaigns on White</w:t>
+            </w:r>
+          </w:p>
+        </w:tc>
+        <w:tc>
+          <w:tcPr>
+            <w:tcW w:type="dxa" w:w="1100"/>
+            <w:shd w:fill="F2F5F9" w:color="auto" w:val="clear"/>
+            <w:tcMar>
+              <w:top w:type="dxa" w:w="40"/>
+              <w:left w:type="dxa" w:w="70"/>
+              <w:bottom w:type="dxa" w:w="40"/>
+              <w:right w:type="dxa" w:w="70"/>
+            </w:tcMar>
+          </w:tcPr>
+          <w:p>
+            <w:pPr>
+              <w:spacing w:after="0"/>
+            </w:pPr>
+            <w:r>
+              <w:rPr>
+                <w:sz w:val="17"/>
+                <w:szCs w:val="17"/>
+              </w:rPr>
+              <w:t xml:space="preserve"/>
+            </w:r>
+          </w:p>
+        </w:tc>
+        <w:tc>
+          <w:tcPr>
+            <w:tcW w:type="dxa" w:w="1300"/>
+            <w:shd w:fill="F2F5F9" w:color="auto" w:val="clear"/>
+            <w:tcMar>
+              <w:top w:type="dxa" w:w="40"/>
+              <w:left w:type="dxa" w:w="70"/>
+              <w:bottom w:type="dxa" w:w="40"/>
+              <w:right w:type="dxa" w:w="70"/>
+            </w:tcMar>
+          </w:tcPr>
+          <w:p>
+            <w:pPr>
+              <w:spacing w:after="0"/>
+            </w:pPr>
+            <w:r>
+              <w:rPr>
+                <w:sz w:val="17"/>
+                <w:szCs w:val="17"/>
+              </w:rPr>
+              <w:t xml:space="preserve"/>
+            </w:r>
+          </w:p>
+        </w:tc>
+        <w:tc>
+          <w:tcPr>
+            <w:tcW w:type="dxa" w:w="1000"/>
+            <w:shd w:fill="F2F5F9" w:color="auto" w:val="clear"/>
+            <w:tcMar>
+              <w:top w:type="dxa" w:w="40"/>
+              <w:left w:type="dxa" w:w="70"/>
+              <w:bottom w:type="dxa" w:w="40"/>
+              <w:right w:type="dxa" w:w="70"/>
+            </w:tcMar>
+          </w:tcPr>
+          <w:p>
+            <w:pPr>
+              <w:spacing w:after="0"/>
+            </w:pPr>
+            <w:r>
+              <w:rPr>
+                <w:sz w:val="17"/>
+                <w:szCs w:val="17"/>
+              </w:rPr>
+              <w:t xml:space="preserve"/>
+            </w:r>
+          </w:p>
+        </w:tc>
+        <w:tc>
+          <w:tcPr>
+            <w:tcW w:type="dxa" w:w="1000"/>
+            <w:shd w:fill="F2F5F9" w:color="auto" w:val="clear"/>
+            <w:tcMar>
+              <w:top w:type="dxa" w:w="40"/>
+              <w:left w:type="dxa" w:w="70"/>
+              <w:bottom w:type="dxa" w:w="40"/>
+              <w:right w:type="dxa" w:w="70"/>
+            </w:tcMar>
+          </w:tcPr>
+          <w:p>
+            <w:pPr>
+              <w:spacing w:after="0"/>
+            </w:pPr>
+            <w:r>
+              <w:rPr>
+                <w:sz w:val="17"/>
+                <w:szCs w:val="17"/>
+              </w:rPr>
+              <w:t xml:space="preserve"/>
+            </w:r>
+          </w:p>
+        </w:tc>
+        <w:tc>
+          <w:tcPr>
+            <w:tcW w:type="dxa" w:w="1500"/>
+            <w:shd w:fill="F2F5F9" w:color="auto" w:val="clear"/>
+            <w:tcMar>
+              <w:top w:type="dxa" w:w="40"/>
+              <w:left w:type="dxa" w:w="70"/>
+              <w:bottom w:type="dxa" w:w="40"/>
+              <w:right w:type="dxa" w:w="70"/>
+            </w:tcMar>
+          </w:tcPr>
+          <w:p>
+            <w:pPr>
+              <w:spacing w:after="0"/>
+            </w:pPr>
+            <w:r>
+              <w:rPr>
+                <w:sz w:val="17"/>
+                <w:szCs w:val="17"/>
+              </w:rPr>
+              <w:t xml:space="preserve"/>
+            </w:r>
+          </w:p>
+        </w:tc>
+        <w:tc>
+          <w:tcPr>
+            <w:tcW w:type="dxa" w:w="1772"/>
+            <w:shd w:fill="F2F5F9" w:color="auto" w:val="clear"/>
+            <w:tcMar>
+              <w:top w:type="dxa" w:w="40"/>
+              <w:left w:type="dxa" w:w="70"/>
+              <w:bottom w:type="dxa" w:w="40"/>
+              <w:right w:type="dxa" w:w="70"/>
+            </w:tcMar>
+          </w:tcPr>
+          <w:p>
+            <w:pPr>
+              <w:spacing w:after="0"/>
+            </w:pPr>
+            <w:r>
+              <w:rPr>
+                <w:sz w:val="17"/>
+                <w:szCs w:val="17"/>
+              </w:rPr>
+              <w:t xml:space="preserve"/>
+            </w:r>
+          </w:p>
+        </w:tc>
+      </w:tr>
+      <w:tr>
+        <w:tc>
+          <w:tcPr>
+            <w:tcW w:type="dxa" w:w="2300"/>
+            <w:shd w:fill="FFFFFF" w:color="auto" w:val="clear"/>
+            <w:tcMar>
+              <w:top w:type="dxa" w:w="40"/>
+              <w:left w:type="dxa" w:w="70"/>
+              <w:bottom w:type="dxa" w:w="40"/>
+              <w:right w:type="dxa" w:w="70"/>
+            </w:tcMar>
+          </w:tcPr>
+          <w:p>
+            <w:pPr>
+              <w:spacing w:after="0"/>
+            </w:pPr>
+            <w:r>
+              <w:rPr>
+                <w:sz w:val="17"/>
+                <w:szCs w:val="17"/>
+              </w:rPr>
+              <w:t xml:space="preserve">cooling sheets king size</w:t>
+            </w:r>
+          </w:p>
+        </w:tc>
+        <w:tc>
+          <w:tcPr>
+            <w:tcW w:type="dxa" w:w="1100"/>
+            <w:shd w:fill="FFFFFF" w:color="auto" w:val="clear"/>
+            <w:tcMar>
+              <w:top w:type="dxa" w:w="40"/>
+              <w:left w:type="dxa" w:w="70"/>
+              <w:bottom w:type="dxa" w:w="40"/>
+              <w:right w:type="dxa" w:w="70"/>
+            </w:tcMar>
+          </w:tcPr>
+          <w:p>
+            <w:pPr>
+              <w:spacing w:after="0"/>
+            </w:pPr>
+            <w:r>
+              <w:rPr>
+                <w:sz w:val="17"/>
+                <w:szCs w:val="17"/>
+              </w:rPr>
+              <w:t xml:space="preserve">True Bamboo 14 → 10</w:t>
+            </w:r>
+          </w:p>
+        </w:tc>
+        <w:tc>
+          <w:tcPr>
+            <w:tcW w:type="dxa" w:w="1300"/>
+            <w:shd w:fill="FFFFFF" w:color="auto" w:val="clear"/>
+            <w:tcMar>
+              <w:top w:type="dxa" w:w="40"/>
+              <w:left w:type="dxa" w:w="70"/>
+              <w:bottom w:type="dxa" w:w="40"/>
+              <w:right w:type="dxa" w:w="70"/>
+            </w:tcMar>
+          </w:tcPr>
+          <w:p>
+            <w:pPr>
+              <w:spacing w:after="0"/>
+            </w:pPr>
+            <w:r>
+              <w:rPr>
+                <w:sz w:val="17"/>
+                <w:szCs w:val="17"/>
+              </w:rPr>
+              <w:t xml:space="preserve">34 · 0</w:t>
+            </w:r>
+          </w:p>
+        </w:tc>
+        <w:tc>
+          <w:tcPr>
+            <w:tcW w:type="dxa" w:w="1000"/>
+            <w:shd w:fill="FFFFFF" w:color="auto" w:val="clear"/>
+            <w:tcMar>
+              <w:top w:type="dxa" w:w="40"/>
+              <w:left w:type="dxa" w:w="70"/>
+              <w:bottom w:type="dxa" w:w="40"/>
+              <w:right w:type="dxa" w:w="70"/>
+            </w:tcMar>
+          </w:tcPr>
+          <w:p>
+            <w:pPr>
+              <w:spacing w:after="0"/>
+            </w:pPr>
+            <w:r>
+              <w:rPr>
+                <w:sz w:val="17"/>
+                <w:szCs w:val="17"/>
+              </w:rPr>
+              <w:t xml:space="preserve">11.5%†</w:t>
+            </w:r>
+          </w:p>
+        </w:tc>
+        <w:tc>
+          <w:tcPr>
+            <w:tcW w:type="dxa" w:w="1000"/>
+            <w:shd w:fill="FFFFFF" w:color="auto" w:val="clear"/>
+            <w:tcMar>
+              <w:top w:type="dxa" w:w="40"/>
+              <w:left w:type="dxa" w:w="70"/>
+              <w:bottom w:type="dxa" w:w="40"/>
+              <w:right w:type="dxa" w:w="70"/>
+            </w:tcMar>
+          </w:tcPr>
+          <w:p>
+            <w:pPr>
+              <w:spacing w:after="0"/>
+            </w:pPr>
+            <w:r>
+              <w:rPr>
+                <w:sz w:val="17"/>
+                <w:szCs w:val="17"/>
+              </w:rPr>
+              <w:t xml:space="preserve">3.9</w:t>
+            </w:r>
+          </w:p>
+        </w:tc>
+        <w:tc>
+          <w:tcPr>
+            <w:tcW w:type="dxa" w:w="1500"/>
+            <w:shd w:fill="FFFFFF" w:color="auto" w:val="clear"/>
+            <w:tcMar>
+              <w:top w:type="dxa" w:w="40"/>
+              <w:left w:type="dxa" w:w="70"/>
+              <w:bottom w:type="dxa" w:w="40"/>
+              <w:right w:type="dxa" w:w="70"/>
+            </w:tcMar>
+          </w:tcPr>
+          <w:p>
+            <w:pPr>
+              <w:spacing w:after="0"/>
+            </w:pPr>
+            <w:r>
+              <w:rPr>
+                <w:sz w:val="17"/>
+                <w:szCs w:val="17"/>
+              </w:rPr>
+              <w:t xml:space="preserve">$3.67 ($3.67)</w:t>
+            </w:r>
+          </w:p>
+        </w:tc>
+        <w:tc>
+          <w:tcPr>
+            <w:tcW w:type="dxa" w:w="1772"/>
+            <w:shd w:fill="FFFFFF" w:color="auto" w:val="clear"/>
+            <w:tcMar>
+              <w:top w:type="dxa" w:w="40"/>
+              <w:left w:type="dxa" w:w="70"/>
+              <w:bottom w:type="dxa" w:w="40"/>
+              <w:right w:type="dxa" w:w="70"/>
+            </w:tcMar>
+          </w:tcPr>
+          <w:p>
+            <w:pPr>
+              <w:spacing w:after="0"/>
+            </w:pPr>
+            <w:r>
+              <w:rPr>
+                <w:sz w:val="17"/>
+                <w:szCs w:val="17"/>
+              </w:rPr>
+              <w:t xml:space="preserve">$125</w:t>
+            </w:r>
+          </w:p>
+        </w:tc>
+      </w:tr>
+      <w:tr>
+        <w:tc>
+          <w:tcPr>
+            <w:tcW w:type="dxa" w:w="2300"/>
+            <w:shd w:fill="F2F5F9" w:color="auto" w:val="clear"/>
+            <w:tcMar>
+              <w:top w:type="dxa" w:w="40"/>
+              <w:left w:type="dxa" w:w="70"/>
+              <w:bottom w:type="dxa" w:w="40"/>
+              <w:right w:type="dxa" w:w="70"/>
+            </w:tcMar>
+          </w:tcPr>
+          <w:p>
+            <w:pPr>
+              <w:spacing w:after="0"/>
+            </w:pPr>
+            <w:r>
+              <w:rPr>
+                <w:sz w:val="17"/>
+                <w:szCs w:val="17"/>
+              </w:rPr>
+              <w:t xml:space="preserve">queen cooling sheets</w:t>
+            </w:r>
+          </w:p>
+        </w:tc>
+        <w:tc>
+          <w:tcPr>
+            <w:tcW w:type="dxa" w:w="1100"/>
+            <w:shd w:fill="F2F5F9" w:color="auto" w:val="clear"/>
+            <w:tcMar>
+              <w:top w:type="dxa" w:w="40"/>
+              <w:left w:type="dxa" w:w="70"/>
+              <w:bottom w:type="dxa" w:w="40"/>
+              <w:right w:type="dxa" w:w="70"/>
+            </w:tcMar>
+          </w:tcPr>
+          <w:p>
+            <w:pPr>
+              <w:spacing w:after="0"/>
+            </w:pPr>
+            <w:r>
+              <w:rPr>
+                <w:sz w:val="17"/>
+                <w:szCs w:val="17"/>
+              </w:rPr>
+              <w:t xml:space="preserve">— → 7</w:t>
+            </w:r>
+          </w:p>
+        </w:tc>
+        <w:tc>
+          <w:tcPr>
+            <w:tcW w:type="dxa" w:w="1300"/>
+            <w:shd w:fill="F2F5F9" w:color="auto" w:val="clear"/>
+            <w:tcMar>
+              <w:top w:type="dxa" w:w="40"/>
+              <w:left w:type="dxa" w:w="70"/>
+              <w:bottom w:type="dxa" w:w="40"/>
+              <w:right w:type="dxa" w:w="70"/>
+            </w:tcMar>
+          </w:tcPr>
+          <w:p>
+            <w:pPr>
+              <w:spacing w:after="0"/>
+            </w:pPr>
+            <w:r>
+              <w:rPr>
+                <w:sz w:val="17"/>
+                <w:szCs w:val="17"/>
+              </w:rPr>
+              <w:t xml:space="preserve">10.3 · 0</w:t>
+            </w:r>
+          </w:p>
+        </w:tc>
+        <w:tc>
+          <w:tcPr>
+            <w:tcW w:type="dxa" w:w="1000"/>
+            <w:shd w:fill="F2F5F9" w:color="auto" w:val="clear"/>
+            <w:tcMar>
+              <w:top w:type="dxa" w:w="40"/>
+              <w:left w:type="dxa" w:w="70"/>
+              <w:bottom w:type="dxa" w:w="40"/>
+              <w:right w:type="dxa" w:w="70"/>
+            </w:tcMar>
+          </w:tcPr>
+          <w:p>
+            <w:pPr>
+              <w:spacing w:after="0"/>
+            </w:pPr>
+            <w:r>
+              <w:rPr>
+                <w:sz w:val="17"/>
+                <w:szCs w:val="17"/>
+              </w:rPr>
+              <w:t xml:space="preserve">11.5%†</w:t>
+            </w:r>
+          </w:p>
+        </w:tc>
+        <w:tc>
+          <w:tcPr>
+            <w:tcW w:type="dxa" w:w="1000"/>
+            <w:shd w:fill="F2F5F9" w:color="auto" w:val="clear"/>
+            <w:tcMar>
+              <w:top w:type="dxa" w:w="40"/>
+              <w:left w:type="dxa" w:w="70"/>
+              <w:bottom w:type="dxa" w:w="40"/>
+              <w:right w:type="dxa" w:w="70"/>
+            </w:tcMar>
+          </w:tcPr>
+          <w:p>
+            <w:pPr>
+              <w:spacing w:after="0"/>
+            </w:pPr>
+            <w:r>
+              <w:rPr>
+                <w:sz w:val="17"/>
+                <w:szCs w:val="17"/>
+              </w:rPr>
+              <w:t xml:space="preserve">1.2</w:t>
+            </w:r>
+          </w:p>
+        </w:tc>
+        <w:tc>
+          <w:tcPr>
+            <w:tcW w:type="dxa" w:w="1500"/>
+            <w:shd w:fill="F2F5F9" w:color="auto" w:val="clear"/>
+            <w:tcMar>
+              <w:top w:type="dxa" w:w="40"/>
+              <w:left w:type="dxa" w:w="70"/>
+              <w:bottom w:type="dxa" w:w="40"/>
+              <w:right w:type="dxa" w:w="70"/>
+            </w:tcMar>
+          </w:tcPr>
+          <w:p>
+            <w:pPr>
+              <w:spacing w:after="0"/>
+            </w:pPr>
+            <w:r>
+              <w:rPr>
+                <w:sz w:val="17"/>
+                <w:szCs w:val="17"/>
+              </w:rPr>
+              <w:t xml:space="preserve">$4.49 ($4.49)</w:t>
+            </w:r>
+          </w:p>
+        </w:tc>
+        <w:tc>
+          <w:tcPr>
+            <w:tcW w:type="dxa" w:w="1772"/>
+            <w:shd w:fill="F2F5F9" w:color="auto" w:val="clear"/>
+            <w:tcMar>
+              <w:top w:type="dxa" w:w="40"/>
+              <w:left w:type="dxa" w:w="70"/>
+              <w:bottom w:type="dxa" w:w="40"/>
+              <w:right w:type="dxa" w:w="70"/>
+            </w:tcMar>
+          </w:tcPr>
+          <w:p>
+            <w:pPr>
+              <w:spacing w:after="0"/>
+            </w:pPr>
+            <w:r>
+              <w:rPr>
+                <w:sz w:val="17"/>
+                <w:szCs w:val="17"/>
+              </w:rPr>
+              <w:t xml:space="preserve">$46</w:t>
+            </w:r>
+          </w:p>
+        </w:tc>
+      </w:tr>
+      <w:tr>
+        <w:tc>
+          <w:tcPr>
+            <w:tcW w:type="dxa" w:w="2300"/>
+            <w:shd w:fill="FFFFFF" w:color="auto" w:val="clear"/>
+            <w:tcMar>
+              <w:top w:type="dxa" w:w="40"/>
+              <w:left w:type="dxa" w:w="70"/>
+              <w:bottom w:type="dxa" w:w="40"/>
+              <w:right w:type="dxa" w:w="70"/>
+            </w:tcMar>
+          </w:tcPr>
+          <w:p>
+            <w:pPr>
+              <w:spacing w:after="0"/>
+            </w:pPr>
+            <w:r>
+              <w:rPr>
+                <w:sz w:val="17"/>
+                <w:szCs w:val="17"/>
+              </w:rPr>
+              <w:t xml:space="preserve">cooling sheets queen</w:t>
+            </w:r>
+          </w:p>
+        </w:tc>
+        <w:tc>
+          <w:tcPr>
+            <w:tcW w:type="dxa" w:w="1100"/>
+            <w:shd w:fill="FFFFFF" w:color="auto" w:val="clear"/>
+            <w:tcMar>
+              <w:top w:type="dxa" w:w="40"/>
+              <w:left w:type="dxa" w:w="70"/>
+              <w:bottom w:type="dxa" w:w="40"/>
+              <w:right w:type="dxa" w:w="70"/>
+            </w:tcMar>
+          </w:tcPr>
+          <w:p>
+            <w:pPr>
+              <w:spacing w:after="0"/>
+            </w:pPr>
+            <w:r>
+              <w:rPr>
+                <w:sz w:val="17"/>
+                <w:szCs w:val="17"/>
+              </w:rPr>
+              <w:t xml:space="preserve">True Bamboo 19 → 9</w:t>
+            </w:r>
+          </w:p>
+        </w:tc>
+        <w:tc>
+          <w:tcPr>
+            <w:tcW w:type="dxa" w:w="1300"/>
+            <w:shd w:fill="FFFFFF" w:color="auto" w:val="clear"/>
+            <w:tcMar>
+              <w:top w:type="dxa" w:w="40"/>
+              <w:left w:type="dxa" w:w="70"/>
+              <w:bottom w:type="dxa" w:w="40"/>
+              <w:right w:type="dxa" w:w="70"/>
+            </w:tcMar>
+          </w:tcPr>
+          <w:p>
+            <w:pPr>
+              <w:spacing w:after="0"/>
+            </w:pPr>
+            <w:r>
+              <w:rPr>
+                <w:sz w:val="17"/>
+                <w:szCs w:val="17"/>
+              </w:rPr>
+              <w:t xml:space="preserve">9.4 · 0</w:t>
+            </w:r>
+          </w:p>
+        </w:tc>
+        <w:tc>
+          <w:tcPr>
+            <w:tcW w:type="dxa" w:w="1000"/>
+            <w:shd w:fill="FFFFFF" w:color="auto" w:val="clear"/>
+            <w:tcMar>
+              <w:top w:type="dxa" w:w="40"/>
+              <w:left w:type="dxa" w:w="70"/>
+              <w:bottom w:type="dxa" w:w="40"/>
+              <w:right w:type="dxa" w:w="70"/>
+            </w:tcMar>
+          </w:tcPr>
+          <w:p>
+            <w:pPr>
+              <w:spacing w:after="0"/>
+            </w:pPr>
+            <w:r>
+              <w:rPr>
+                <w:sz w:val="17"/>
+                <w:szCs w:val="17"/>
+              </w:rPr>
+              <w:t xml:space="preserve">11.5%†</w:t>
+            </w:r>
+          </w:p>
+        </w:tc>
+        <w:tc>
+          <w:tcPr>
+            <w:tcW w:type="dxa" w:w="1000"/>
+            <w:shd w:fill="FFFFFF" w:color="auto" w:val="clear"/>
+            <w:tcMar>
+              <w:top w:type="dxa" w:w="40"/>
+              <w:left w:type="dxa" w:w="70"/>
+              <w:bottom w:type="dxa" w:w="40"/>
+              <w:right w:type="dxa" w:w="70"/>
+            </w:tcMar>
+          </w:tcPr>
+          <w:p>
+            <w:pPr>
+              <w:spacing w:after="0"/>
+            </w:pPr>
+            <w:r>
+              <w:rPr>
+                <w:sz w:val="17"/>
+                <w:szCs w:val="17"/>
+              </w:rPr>
+              <w:t xml:space="preserve">1.1</w:t>
+            </w:r>
+          </w:p>
+        </w:tc>
+        <w:tc>
+          <w:tcPr>
+            <w:tcW w:type="dxa" w:w="1500"/>
+            <w:shd w:fill="FFFFFF" w:color="auto" w:val="clear"/>
+            <w:tcMar>
+              <w:top w:type="dxa" w:w="40"/>
+              <w:left w:type="dxa" w:w="70"/>
+              <w:bottom w:type="dxa" w:w="40"/>
+              <w:right w:type="dxa" w:w="70"/>
+            </w:tcMar>
+          </w:tcPr>
+          <w:p>
+            <w:pPr>
+              <w:spacing w:after="0"/>
+            </w:pPr>
+            <w:r>
+              <w:rPr>
+                <w:sz w:val="17"/>
+                <w:szCs w:val="17"/>
+              </w:rPr>
+              <w:t xml:space="preserve">$4.49 ($4.49)</w:t>
+            </w:r>
+          </w:p>
+        </w:tc>
+        <w:tc>
+          <w:tcPr>
+            <w:tcW w:type="dxa" w:w="1772"/>
+            <w:shd w:fill="FFFFFF" w:color="auto" w:val="clear"/>
+            <w:tcMar>
+              <w:top w:type="dxa" w:w="40"/>
+              <w:left w:type="dxa" w:w="70"/>
+              <w:bottom w:type="dxa" w:w="40"/>
+              <w:right w:type="dxa" w:w="70"/>
+            </w:tcMar>
+          </w:tcPr>
+          <w:p>
+            <w:pPr>
+              <w:spacing w:after="0"/>
+            </w:pPr>
+            <w:r>
+              <w:rPr>
+                <w:sz w:val="17"/>
+                <w:szCs w:val="17"/>
+              </w:rPr>
+              <w:t xml:space="preserve">$42</w:t>
+            </w:r>
+          </w:p>
+        </w:tc>
+      </w:tr>
+      <w:tr>
+        <w:tc>
+          <w:tcPr>
+            <w:tcW w:type="dxa" w:w="2300"/>
+            <w:shd w:fill="F2F5F9" w:color="auto" w:val="clear"/>
+            <w:tcMar>
+              <w:top w:type="dxa" w:w="40"/>
+              <w:left w:type="dxa" w:w="70"/>
+              <w:bottom w:type="dxa" w:w="40"/>
+              <w:right w:type="dxa" w:w="70"/>
+            </w:tcMar>
+          </w:tcPr>
+          <w:p>
+            <w:pPr>
+              <w:spacing w:after="0"/>
+            </w:pPr>
+            <w:r>
+              <w:rPr>
+                <w:sz w:val="17"/>
+                <w:szCs w:val="17"/>
+              </w:rPr>
+              <w:t xml:space="preserve">Total (16 terms)</w:t>
+            </w:r>
+          </w:p>
+        </w:tc>
+        <w:tc>
+          <w:tcPr>
+            <w:tcW w:type="dxa" w:w="1100"/>
+            <w:shd w:fill="F2F5F9" w:color="auto" w:val="clear"/>
+            <w:tcMar>
+              <w:top w:type="dxa" w:w="40"/>
+              <w:left w:type="dxa" w:w="70"/>
+              <w:bottom w:type="dxa" w:w="40"/>
+              <w:right w:type="dxa" w:w="70"/>
+            </w:tcMar>
+          </w:tcPr>
+          <w:p>
+            <w:pPr>
+              <w:spacing w:after="0"/>
+            </w:pPr>
+            <w:r>
+              <w:rPr>
+                <w:sz w:val="17"/>
+                <w:szCs w:val="17"/>
+              </w:rPr>
+              <w:t xml:space="preserve"/>
+            </w:r>
+          </w:p>
+        </w:tc>
+        <w:tc>
+          <w:tcPr>
+            <w:tcW w:type="dxa" w:w="1300"/>
+            <w:shd w:fill="F2F5F9" w:color="auto" w:val="clear"/>
+            <w:tcMar>
+              <w:top w:type="dxa" w:w="40"/>
+              <w:left w:type="dxa" w:w="70"/>
+              <w:bottom w:type="dxa" w:w="40"/>
+              <w:right w:type="dxa" w:w="70"/>
+            </w:tcMar>
+          </w:tcPr>
+          <w:p>
+            <w:pPr>
+              <w:spacing w:after="0"/>
+            </w:pPr>
+            <w:r>
+              <w:rPr>
+                <w:sz w:val="17"/>
+                <w:szCs w:val="17"/>
+              </w:rPr>
+              <w:t xml:space="preserve">277</w:t>
+            </w:r>
+          </w:p>
+        </w:tc>
+        <w:tc>
+          <w:tcPr>
+            <w:tcW w:type="dxa" w:w="1000"/>
+            <w:shd w:fill="F2F5F9" w:color="auto" w:val="clear"/>
+            <w:tcMar>
+              <w:top w:type="dxa" w:w="40"/>
+              <w:left w:type="dxa" w:w="70"/>
+              <w:bottom w:type="dxa" w:w="40"/>
+              <w:right w:type="dxa" w:w="70"/>
+            </w:tcMar>
+          </w:tcPr>
+          <w:p>
+            <w:pPr>
+              <w:spacing w:after="0"/>
+            </w:pPr>
+            <w:r>
+              <w:rPr>
+                <w:sz w:val="17"/>
+                <w:szCs w:val="17"/>
+              </w:rPr>
+              <w:t xml:space="preserve"/>
+            </w:r>
+          </w:p>
+        </w:tc>
+        <w:tc>
+          <w:tcPr>
+            <w:tcW w:type="dxa" w:w="1000"/>
+            <w:shd w:fill="F2F5F9" w:color="auto" w:val="clear"/>
+            <w:tcMar>
+              <w:top w:type="dxa" w:w="40"/>
+              <w:left w:type="dxa" w:w="70"/>
+              <w:bottom w:type="dxa" w:w="40"/>
+              <w:right w:type="dxa" w:w="70"/>
+            </w:tcMar>
+          </w:tcPr>
+          <w:p>
+            <w:pPr>
+              <w:spacing w:after="0"/>
+            </w:pPr>
+            <w:r>
+              <w:rPr>
+                <w:sz w:val="17"/>
+                <w:szCs w:val="17"/>
+              </w:rPr>
+              <w:t xml:space="preserve">46</w:t>
+            </w:r>
+          </w:p>
+        </w:tc>
+        <w:tc>
+          <w:tcPr>
+            <w:tcW w:type="dxa" w:w="1500"/>
+            <w:shd w:fill="F2F5F9" w:color="auto" w:val="clear"/>
+            <w:tcMar>
+              <w:top w:type="dxa" w:w="40"/>
+              <w:left w:type="dxa" w:w="70"/>
+              <w:bottom w:type="dxa" w:w="40"/>
+              <w:right w:type="dxa" w:w="70"/>
+            </w:tcMar>
+          </w:tcPr>
+          <w:p>
+            <w:pPr>
+              <w:spacing w:after="0"/>
+            </w:pPr>
+            <w:r>
+              <w:rPr>
+                <w:sz w:val="17"/>
+                <w:szCs w:val="17"/>
+              </w:rPr>
+              <w:t xml:space="preserve"/>
+            </w:r>
+          </w:p>
+        </w:tc>
+        <w:tc>
+          <w:tcPr>
+            <w:tcW w:type="dxa" w:w="1772"/>
+            <w:shd w:fill="F2F5F9" w:color="auto" w:val="clear"/>
+            <w:tcMar>
+              <w:top w:type="dxa" w:w="40"/>
+              <w:left w:type="dxa" w:w="70"/>
+              <w:bottom w:type="dxa" w:w="40"/>
+              <w:right w:type="dxa" w:w="70"/>
+            </w:tcMar>
+          </w:tcPr>
+          <w:p>
+            <w:pPr>
+              <w:spacing w:after="0"/>
+            </w:pPr>
+            <w:r>
+              <w:rPr>
+                <w:sz w:val="17"/>
+                <w:szCs w:val="17"/>
+              </w:rPr>
+              <w:t xml:space="preserve">$1,527</w:t>
             </w:r>
           </w:p>
         </w:tc>
@@ -5321,7 +7591,7 @@
           <w:sz w:val="17"/>
           <w:szCs w:val="17"/>
         </w:rPr>
-        <w:t xml:space="preserve">Plan clicks = the audit’s plan for the target rank (units the rank sells ÷ conversion), before the overlap scaling in Section 12. * The campaign’s overall conversion, which beats the market. These terms have barely been shown at the top, which is the problem the push fixes. Budget = plan clicks × this week’s price; add the product-page clicks the base still buys. Ceiling = twice break-even.</w:t>
+        <w:t xml:space="preserve">Plan clicks = the audit’s plan for the target rank (units the rank sells ÷ conversion), before the overlap scaling in Section 12; where the audit has no plan, the register’s requirement before scaling. * The campaign’s overall conversion, which beats the market; these terms have barely been shown at the top, which is the problem the push fixes. † Stand-in: our cooling campaigns’ conversion. B6 has almost no data of its own on these terms (“cooling sheets queen”: 23 clicks and 1 order in 90 days through auto and broad; “cooling sheets king size”: none), so the stop rule below decides once they have 50 top-of-search clicks. Budget = plan clicks × this week’s price; add the product-page clicks the base still buys. Ceiling = twice break-even on the advertised colour’s margin.</w:t>
       </w:r>
     </w:p>
     <w:p>
@@ -5329,7 +7599,7 @@
         <w:spacing w:after="100"/>
       </w:pPr>
       <w:r>
-        <w:t xml:space="preserve">At the full plan this costs about $1,200 a day and should bring about 36 orders a day at about 41% ACoS. The terms share shoppers, so the real total will be lower. Scaled for that overlap (×0.62, Section 12), it is about $750 a day and 22 orders. Either way it is a deliberate, time-boxed investment: three weeks from 29 September, tuned weekly.</w:t>
+        <w:t xml:space="preserve">At the full plan this costs about $1,530 a day and should bring about 46 orders a day at about 41% ACoS. The terms share shoppers, so the real total will be lower. Scaled for that overlap (×0.62, Section 12), it is about $950 a day and 29 orders. Either way it is a deliberate, time-boxed investment: three weeks from 29 September, tuned weekly.</w:t>
       </w:r>
     </w:p>
     <w:p>
@@ -5337,7 +7607,88 @@
         <w:spacing w:after="100"/>
       </w:pPr>
       <w:r>
-        <w:t xml:space="preserve">Set up next: “cooling sheets king size” (1,468 sales a month; True Bamboo 14th; plan 34 clicks a day) and “cooling sheets queen” (2,277; True Bamboo 19th; plan 9 a day). Add both to the rank tracker and confirm each has one live exact campaign on White. Push them once they are tracked.</w:t>
+        <w:t xml:space="preserve">The three cooling terms are pushed now, not after tracking starts. Build one exact campaign each on King White or Queen White, at the ceiling, on fixed bidding. Read their rank from ASinsight until our rank tracker has them. Their ceilings are low ($3.67–$4.49) because the stand-in conversion is modest; if they can’t hold the top at the ceiling for 3 days, the rule below brings them to you.</w:t>
+      </w:r>
+    </w:p>
+    <w:p>
+      <w:pPr>
+        <w:spacing w:after="100"/>
+      </w:pPr>
+      <w:r>
+        <w:t xml:space="preserve">Left out for now, and why:</w:t>
+      </w:r>
+    </w:p>
+    <w:p>
+      <w:pPr>
+        <w:pStyle w:val="ListParagraph"/>
+        <w:numPr>
+          <w:ilvl w:val="0"/>
+          <w:numId w:val="3"/>
+        </w:numPr>
+        <w:spacing w:after="60"/>
+      </w:pPr>
+      <w:r>
+        <w:t xml:space="preserve">“cooling sheets” (rank 142): too far to reach yet.</w:t>
+      </w:r>
+    </w:p>
+    <w:p>
+      <w:pPr>
+        <w:pStyle w:val="ListParagraph"/>
+        <w:numPr>
+          <w:ilvl w:val="0"/>
+          <w:numId w:val="3"/>
+        </w:numPr>
+        <w:spacing w:after="60"/>
+      </w:pPr>
+      <w:r>
+        <w:t xml:space="preserve">“cooling bed sheets”: its rank collapsed; find the cause first.</w:t>
+      </w:r>
+    </w:p>
+    <w:p>
+      <w:pPr>
+        <w:pStyle w:val="ListParagraph"/>
+        <w:numPr>
+          <w:ilvl w:val="0"/>
+          <w:numId w:val="3"/>
+        </w:numPr>
+        <w:spacing w:after="60"/>
+      </w:pPr>
+      <w:r>
+        <w:t xml:space="preserve">Colour terms such as “black bamboo sheets”: these are conversions terms (Section 9).</w:t>
+      </w:r>
+    </w:p>
+    <w:p>
+      <w:pPr>
+        <w:pStyle w:val="ListParagraph"/>
+        <w:numPr>
+          <w:ilvl w:val="0"/>
+          <w:numId w:val="3"/>
+        </w:numPr>
+        <w:spacing w:after="60"/>
+      </w:pPr>
+      <w:r>
+        <w:t xml:space="preserve">“king size bamboo sheets set”: a plan of 5 clicks a week.</w:t>
+      </w:r>
+    </w:p>
+    <w:p>
+      <w:pPr>
+        <w:pStyle w:val="ListParagraph"/>
+        <w:numPr>
+          <w:ilvl w:val="0"/>
+          <w:numId w:val="3"/>
+        </w:numPr>
+        <w:spacing w:after="60"/>
+      </w:pPr>
+      <w:r>
+        <w:t xml:space="preserve">The rank-1 targets with no campaign and no data, such as “organic sheets queen”, “queen size deep pocket sheets” and “6 piece king size sheets set”: build them and add them after the first weekly review.</w:t>
+      </w:r>
+    </w:p>
+    <w:p>
+      <w:pPr>
+        <w:spacing w:after="100"/>
+      </w:pPr>
+      <w:r>
+        <w:t xml:space="preserve">How each push term is tuned:</w:t>
       </w:r>
     </w:p>
     <w:p>
@@ -5433,7 +7784,7 @@
         <w:t xml:space="preserve">Your decision. </w:t>
       </w:r>
       <w:r>
-        <w:t xml:space="preserve">Approve the push budget for three weeks: the full plan (about $1,200 a day) or the overlap-adjusted plan (about $750 a day).</w:t>
+        <w:t xml:space="preserve">Approve the push budget for three weeks: the full plan (about $1,530 a day) or the overlap-adjusted plan (about $950 a day).</w:t>
       </w:r>
     </w:p>
     <w:p>
@@ -6438,7 +8789,7 @@
                 <w:sz w:val="17"/>
                 <w:szCs w:val="17"/>
               </w:rPr>
-              <w:t xml:space="preserve">no</w:t>
+              <w:t xml:space="preserve">added to the push</w:t>
             </w:r>
           </w:p>
         </w:tc>
@@ -6510,7 +8861,7 @@
                 <w:sz w:val="17"/>
                 <w:szCs w:val="17"/>
               </w:rPr>
-              <w:t xml:space="preserve">Break-even; mix first (63%); move to Queen White</w:t>
+              <w:t xml:space="preserve">Push on Queen White; base cut in the same write (63%)</w:t>
             </w:r>
           </w:p>
         </w:tc>
@@ -6584,7 +8935,7 @@
                 <w:sz w:val="17"/>
                 <w:szCs w:val="17"/>
               </w:rPr>
-              <w:t xml:space="preserve">no</w:t>
+              <w:t xml:space="preserve">added to the push</w:t>
             </w:r>
           </w:p>
         </w:tc>
@@ -6656,7 +9007,7 @@
                 <w:sz w:val="17"/>
                 <w:szCs w:val="17"/>
               </w:rPr>
-              <w:t xml:space="preserve">Break-even; mix first (70%)</w:t>
+              <w:t xml:space="preserve">Push; base cut in the same write (70%)</w:t>
             </w:r>
           </w:p>
         </w:tc>
@@ -6730,7 +9081,7 @@
                 <w:sz w:val="17"/>
                 <w:szCs w:val="17"/>
               </w:rPr>
-              <w:t xml:space="preserve">no</w:t>
+              <w:t xml:space="preserve">added to the push</w:t>
             </w:r>
           </w:p>
         </w:tc>
@@ -6802,7 +9153,7 @@
                 <w:sz w:val="17"/>
                 <w:szCs w:val="17"/>
               </w:rPr>
-              <w:t xml:space="preserve">Break-even; mix first</w:t>
+              <w:t xml:space="preserve">Push; base cut in the same write</w:t>
             </w:r>
           </w:p>
         </w:tc>
@@ -6948,7 +9299,7 @@
                 <w:sz w:val="17"/>
                 <w:szCs w:val="17"/>
               </w:rPr>
-              <w:t xml:space="preserve">Break-even; mix first (57%)</w:t>
+              <w:t xml:space="preserve">Colour term: conversions, at break-even; base cut (57%)</w:t>
             </w:r>
           </w:p>
         </w:tc>
@@ -11590,7 +13941,7 @@
         <w:spacing w:after="60"/>
       </w:pPr>
       <w:r>
-        <w:t xml:space="preserve">Restart “bamboo sheets full”. Add “cooling sheets king size” and “cooling sheets queen” to the rank tracker, and start hourly tracking of sponsored and organic rank for B6 and True Bamboo on the push terms.</w:t>
+        <w:t xml:space="preserve">Restart “bamboo sheets full” and “bamboo king sheets”. Build exact campaigns on White for “cooling sheets king size”, “cooling sheets queen” and “queen cooling sheets”, and add them to the rank tracker. Start hourly tracking of sponsored and organic rank for B6 and True Bamboo on the push terms.</w:t>
       </w:r>
     </w:p>
     <w:p>
@@ -11603,7 +13954,7 @@
         <w:spacing w:after="60"/>
       </w:pPr>
       <w:r>
-        <w:t xml:space="preserve">Keep every ranking ad on White, and hold the new campaigns and the retags.</w:t>
+        <w:t xml:space="preserve">Keep every ranking ad on White, and hold the audit’s 15 new campaigns and the retags.</w:t>
       </w:r>
     </w:p>
     <w:p>

</xml_diff>

<commit_message>
Record approved DBS6 push budget and 1 October post-deal audit
Co-Authored-By: Claude Opus 5.5 <noreply@anthropic.com>
Claude-Session: https://claude.ai/code/session_01LY7A1KPDoE1cQtWdmceR2R
</commit_message>
<xml_diff>
--- a/docs/DBS6_Audit_Corrections_20260928.docx
+++ b/docs/DBS6_Audit_Corrections_20260928.docx
@@ -305,10 +305,10 @@
           <w:bCs/>
           <w:color w:val="1F3A5F"/>
         </w:rPr>
-        <w:t xml:space="preserve">Decisions needed from you today: </w:t>
-      </w:r>
-      <w:r>
-        <w:t xml:space="preserve">the goals for the deal days and after (Section 3), and the push budget for three weeks: about $1,530 a day at the full plan, or $950 adjusted for overlap between terms (Section 5.3).</w:t>
+        <w:t xml:space="preserve">Decided: </w:t>
+      </w:r>
+      <w:r>
+        <w:t xml:space="preserve">the full push plan, about $1,530 a day for about 46 orders a day, for three weeks from 29 September (Section 5.3). A separate audit on 1 October sets the post-deal prices, TACoS goal and spend limit.</w:t>
       </w:r>
     </w:p>
     <w:p>
@@ -1967,7 +1967,7 @@
         <w:t xml:space="preserve">For the deal days (to 30 September): </w:t>
       </w:r>
       <w:r>
-        <w:t xml:space="preserve">the push budget (Section 5.3) plus a spend limit for everything else. Deal spend is running at $924 a day.</w:t>
+        <w:t xml:space="preserve">the approved push budget (Section 5.3). Campaigns outside the push keep their current budgets until the 1 October audit, with no raises. Deal spend is running at $924 a day.</w:t>
       </w:r>
     </w:p>
     <w:p>
@@ -1984,10 +1984,10 @@
           <w:b/>
           <w:bCs/>
         </w:rPr>
-        <w:t xml:space="preserve">From 1 October: </w:t>
-      </w:r>
-      <w:r>
-        <w:t xml:space="preserve">the push budget is a deliberate, time-boxed investment, approved for three weeks and reviewed weekly. Everything outside the push gets a TACoS goal well below the audit’s 25% (B6 ran at about 7% before the deal), and a daily spend limit set as a share of the last 7 days’ total sales.</w:t>
+        <w:t xml:space="preserve">From 1 October, set in the separate post-deal audit: </w:t>
+      </w:r>
+      <w:r>
+        <w:t xml:space="preserve">a TACoS goal for everything outside the push, well below the audit’s 25% (B6 ran at about 7% before the deal), and a daily spend limit set as a share of the last 7 days’ total sales. The push budget carries on through it: it is approved for three weeks and reviewed weekly.</w:t>
       </w:r>
     </w:p>
     <w:p>
@@ -2164,7 +2164,7 @@
         <w:pStyle w:val="Heading2"/>
       </w:pPr>
       <w:r>
-        <w:t xml:space="preserve">Day 1 after the deal — 1 October</w:t>
+        <w:t xml:space="preserve">Day 1 after the deal — 1 October (the separate post-deal audit)</w:t>
       </w:r>
     </w:p>
     <w:p>
@@ -7599,7 +7599,7 @@
         <w:spacing w:after="100"/>
       </w:pPr>
       <w:r>
-        <w:t xml:space="preserve">At the full plan this costs about $1,530 a day and should bring about 46 orders a day at about 41% ACoS. The terms share shoppers, so the real total will be lower. Scaled for that overlap (×0.62, Section 12), it is about $950 a day and 29 orders. Either way it is a deliberate, time-boxed investment: three weeks from 29 September, tuned weekly.</w:t>
+        <w:t xml:space="preserve">At the full plan this costs about $1,530 a day and should bring about 46 orders a day at about 41% ACoS. The terms share shoppers, so the real total will be lower. Scaled for that overlap (×0.62, Section 12), it is about $950 a day and 29 orders. The full plan is approved as a deliberate, time-boxed investment: three weeks from 29 September, tuned weekly.</w:t>
       </w:r>
     </w:p>
     <w:p>
@@ -7781,10 +7781,10 @@
           <w:bCs/>
           <w:color w:val="1F3A5F"/>
         </w:rPr>
-        <w:t xml:space="preserve">Your decision. </w:t>
-      </w:r>
-      <w:r>
-        <w:t xml:space="preserve">Approve the push budget for three weeks: the full plan (about $1,530 a day) or the overlap-adjusted plan (about $950 a day).</w:t>
+        <w:t xml:space="preserve">Approved. </w:t>
+      </w:r>
+      <w:r>
+        <w:t xml:space="preserve">The full plan, about $1,530 a day, for three weeks from 29 September.</w:t>
       </w:r>
     </w:p>
     <w:p>
@@ -13902,7 +13902,7 @@
         <w:spacing w:after="60"/>
       </w:pPr>
       <w:r>
-        <w:t xml:space="preserve">Today: agree the goals for the deal days and after, and approve the push budget.</w:t>
+        <w:t xml:space="preserve">Today: load the approved push plan (Section 5.3).</w:t>
       </w:r>
     </w:p>
     <w:p>
@@ -13967,7 +13967,7 @@
         <w:spacing w:after="60"/>
       </w:pPr>
       <w:r>
-        <w:t xml:space="preserve">1 October: re-price on the full-price margin, bring spend inside the limit, and keep the push running on qualifying terms.</w:t>
+        <w:t xml:space="preserve">1 October: the separate post-deal audit re-prices on the full-price margin, sets the TACoS goal and spend limit outside the push, and keeps the push running.</w:t>
       </w:r>
     </w:p>
     <w:p>

</xml_diff>

<commit_message>
Drop fixed-bidding changes from DBS6 corrections; relabel CPC column
Bidding strategies stay as they are. The top-of-search price column is
our own cost per click when we won, with a holding benchmark and thin
rows marked.

Co-Authored-By: Claude Opus 5.5 <noreply@anthropic.com>
Claude-Session: https://claude.ai/code/session_01LY7A1KPDoE1cQtWdmceR2R
</commit_message>
<xml_diff>
--- a/docs/DBS6_Audit_Corrections_20260928.docx
+++ b/docs/DBS6_Audit_Corrections_20260928.docx
@@ -79,7 +79,7 @@
         <w:t xml:space="preserve">Push harder at top of search, on a tactical set of terms, with a costed plan. </w:t>
       </w:r>
       <w:r>
-        <w:t xml:space="preserve">A competitor with 129 reviews, True Bamboo, climbed from about 110 to the top 5 on three of our main terms in about 9 days by holding the top ad slot. B6’s own history says the same: once the clicks land, its terms reach the top 10 in a median of 5 days. What’s missing is volume at the top. Ten terms are funded for the rest of the deal within a total B6 budget of $1,300 a day; from 1 October the budget is re-evaluated. Six more wait on a listing check, a price-limit decision or the 1 October audit (Section 5.3). Fixed bidding, the base cut and the push price go in one write. Prices then step up daily until each term holds the top slot, never above twice break-even. The audit’s 18 jumps of 75% go.</w:t>
+        <w:t xml:space="preserve">A competitor with 129 reviews, True Bamboo, climbed from about 110 to the top 5 on three of our main terms in about 9 days by holding the top ad slot. B6’s own history says the same: once the clicks land, its terms reach the top 10 in a median of 5 days. What’s missing is volume at the top. Ten terms are funded for the rest of the deal within a total B6 budget of $1,300 a day; from 1 October the budget is re-evaluated. Six more wait on a listing check, a price-limit decision or the 1 October audit (Section 5.3). The base cut and the push price go in one write; bidding strategies stay as they are. Prices then step up daily until each term holds the top slot, never above twice break-even. The audit’s 18 jumps of 75% go.</w:t>
       </w:r>
     </w:p>
     <w:p>
@@ -565,7 +565,7 @@
                 <w:sz w:val="17"/>
                 <w:szCs w:val="17"/>
               </w:rPr>
-              <w:t xml:space="preserve">Down-only / fixed bidding</w:t>
+              <w:t xml:space="preserve">Down-only bidding</w:t>
             </w:r>
           </w:p>
         </w:tc>
@@ -589,7 +589,7 @@
                 <w:sz w:val="17"/>
                 <w:szCs w:val="17"/>
               </w:rPr>
-              <w:t xml:space="preserve">Down-only lets Amazon cut our bid when it thinks a click is less likely to sell, so the ad often loses the top slot. Fixed bidding bids exactly what we set. A push needs fixed bidding.</w:t>
+              <w:t xml:space="preserve">Our campaigns use down-only bidding: Amazon may cut our bid when it thinks a click is less likely to sell, so the price we set at the top is a maximum, not what we always pay. Bidding strategies stay as they are, so whether a term holds the top is read on its impression share.</w:t>
             </w:r>
           </w:p>
         </w:tc>
@@ -1747,7 +1747,7 @@
         <w:t xml:space="preserve">A push price has limits. </w:t>
       </w:r>
       <w:r>
-        <w:t xml:space="preserve">Start from break-even and add a premium for the rank gap: +25% when the current rank is within 1.5× the target, otherwise (current ÷ target − 1) × 50%. Step up by at most 30% a day until the term holds a top-3 sponsored position most hours and at least 30% of top-of-search impressions. Never pay more than twice break-even. If a term sits at that ceiling on fixed bidding and still can’t hold the top for 3 days, bring it to you: raise its ceiling for a set time, or swap the term.</w:t>
+        <w:t xml:space="preserve">Start from break-even and add a premium for the rank gap: +25% when the current rank is within 1.5× the target, otherwise (current ÷ target − 1) × 50%. Step up by at most 30% a day until the term holds a top-3 sponsored position most hours and at least 30% of top-of-search impressions. Never pay more than twice break-even. If a term sits at that ceiling and still can’t hold the top for 3 days, bring it to you: raise its ceiling for a set time, or swap the term.</w:t>
       </w:r>
     </w:p>
     <w:p>
@@ -1767,7 +1767,7 @@
         <w:t xml:space="preserve">Fix the mix in the same write as the push. </w:t>
       </w:r>
       <w:r>
-        <w:t xml:space="preserve">If more than 20% of clicks land on product pages, lower the base bid and raise the boost to reach the push price, in one write. Cut the base by at most 50% a step, or 25% where product pages bring orders. Push campaigns run on fixed bidding.</w:t>
+        <w:t xml:space="preserve">If more than 20% of clicks land on product pages, lower the base bid and raise the boost to reach the push price, in one write. Cut the base by at most 50% a step, or 25% where product pages bring orders.</w:t>
       </w:r>
     </w:p>
     <w:p>
@@ -2104,7 +2104,7 @@
         <w:spacing w:after="60"/>
       </w:pPr>
       <w:r>
-        <w:t xml:space="preserve">Switch the push campaigns to fixed bidding and cut their base bids in the same write, raising the boosts so the top-of-search price holds (Section 8). Fixed bidding removes Amazon’s down-only trim on product pages. A switch without the base cut would raise product-page cost for a few days on the campaigns that already leak there.</w:t>
+        <w:t xml:space="preserve">Cut the push campaigns’ base bids and raise their boosts in the same write, so the top-of-search price reaches the push price while product pages get cheaper (Section 8). Bidding strategies stay as they are.</w:t>
       </w:r>
     </w:p>
     <w:p>
@@ -2414,19 +2414,6 @@
       </w:pPr>
       <w:r>
         <w:t xml:space="preserve">On one focus campaign it raises the base bid with the price: Bamboo Sheets King Size goes from $0.50 to $1.40 (+180%). That nearly triples what it pays on product pages as well.</w:t>
-      </w:r>
-    </w:p>
-    <w:p>
-      <w:pPr>
-        <w:pStyle w:val="ListParagraph"/>
-        <w:numPr>
-          <w:ilvl w:val="0"/>
-          <w:numId w:val="3"/>
-        </w:numPr>
-        <w:spacing w:after="60"/>
-      </w:pPr>
-      <w:r>
-        <w:t xml:space="preserve">It leaves every push campaign on down-only bidding.</w:t>
       </w:r>
     </w:p>
     <w:p>
@@ -3834,7 +3821,7 @@
                 <w:sz w:val="17"/>
                 <w:szCs w:val="17"/>
               </w:rPr>
-              <w:t xml:space="preserve">Top slot costs now</w:t>
+              <w:t xml:space="preserve">Our top-of-search cost per click</w:t>
             </w:r>
           </w:p>
         </w:tc>
@@ -5001,7 +4988,7 @@
                 <w:sz w:val="17"/>
                 <w:szCs w:val="17"/>
               </w:rPr>
-              <w:t xml:space="preserve">$6.98</w:t>
+              <w:t xml:space="preserve">$6.98 — thin</w:t>
             </w:r>
           </w:p>
         </w:tc>
@@ -5195,7 +5182,7 @@
                 <w:sz w:val="17"/>
                 <w:szCs w:val="17"/>
               </w:rPr>
-              <w:t xml:space="preserve">$6.14</w:t>
+              <w:t xml:space="preserve">$6.14 — thin</w:t>
             </w:r>
           </w:p>
         </w:tc>
@@ -7371,7 +7358,7 @@
           <w:sz w:val="17"/>
           <w:szCs w:val="17"/>
         </w:rPr>
-        <w:t xml:space="preserve">Plan clicks = the audit’s plan for the target rank (units the rank sells ÷ conversion), before the overlap scaling in Section 12; where the audit has no plan, the register’s requirement before scaling. * The campaign’s overall conversion, which beats the market; these terms have barely been shown at the top. † Stand-in: our cooling campaigns’ conversion; B6 has almost no data of its own on these terms. “Top slot costs now” = what we already pay per top-of-search click on the term, from the audit. Budget = plan clicks × this week’s price; add the product-page clicks the base still buys. Ceiling = twice break-even on the advertised colour’s margin.</w:t>
+        <w:t xml:space="preserve">Plan clicks = the audit’s plan for the target rank (units the rank sells ÷ conversion), before the overlap scaling in Section 12; where the audit has no plan, the register’s requirement before scaling. * The campaign’s overall conversion, which beats the market; these terms have barely been shown at the top. † Stand-in: our cooling campaigns’ conversion; B6 has almost no data of its own on these terms. “Our top-of-search cost per click” = what we paid on the term when we won the top slot (from the audit), not what it takes to hold it most hours. The audit’s only holding benchmark is about $5.18: what campaigns holding 30%+ of top-of-search impressions pay on the “bamboo sheets” and Full groups. “Thin” = the ceiling is within about 5% of our own cost per click, so the term may not hold the top. Budget = plan clicks × this week’s price; add the product-page clicks the base still buys. Ceiling = twice break-even on the advertised colour’s margin.</w:t>
       </w:r>
     </w:p>
     <w:p>
@@ -7416,10 +7403,10 @@
           <w:b/>
           <w:bCs/>
         </w:rPr>
-        <w:t xml:space="preserve">Price limit below what the top slot costs: </w:t>
-      </w:r>
-      <w:r>
-        <w:t xml:space="preserve">“bamboo cooling sheets” and “bamboo king sheets”. At twice break-even they can’t hold the top. They join only if you raise their ceiling for a set time.</w:t>
+        <w:t xml:space="preserve">Price limit below what we already pay at the top: </w:t>
+      </w:r>
+      <w:r>
+        <w:t xml:space="preserve">“bamboo cooling sheets” and “bamboo king sheets”. At twice break-even they are unlikely to hold the top. They join only if you raise their ceiling for a set time.</w:t>
       </w:r>
     </w:p>
     <w:p>
@@ -7439,7 +7426,7 @@
         <w:t xml:space="preserve">New campaigns: </w:t>
       </w:r>
       <w:r>
-        <w:t xml:space="preserve">the three cooling terms. They need new exact campaigns, and campaigns launched in the last deal days learn on deal traffic, the same reason the audit’s 15 new campaigns are held. Their ceilings are also below what the top slot costs. Build them in the 1 October audit, and add them to the rank tracker now.</w:t>
+        <w:t xml:space="preserve">the three cooling terms. They need new exact campaigns, and campaigns launched in the last deal days learn on deal traffic, the same reason the audit’s 15 new campaigns are held. Their ceilings are also below the $5.18 holding benchmark. Build them in the 1 October audit, and add them to the rank tracker now.</w:t>
       </w:r>
     </w:p>
     <w:p>
@@ -9520,7 +9507,7 @@
                 <w:sz w:val="17"/>
                 <w:szCs w:val="17"/>
               </w:rPr>
-              <w:t xml:space="preserve">$6.16 on fixed bidding, with the base $1.60 → $1.20 and boost 413%</w:t>
+              <w:t xml:space="preserve">$6.16, with the base $1.60 → $1.20 and boost 413%</w:t>
             </w:r>
           </w:p>
         </w:tc>
@@ -9666,7 +9653,7 @@
                 <w:sz w:val="17"/>
                 <w:szCs w:val="17"/>
               </w:rPr>
-              <w:t xml:space="preserve">$5.28 (−37%) on fixed bidding</w:t>
+              <w:t xml:space="preserve">$5.28 (−37%)</w:t>
             </w:r>
           </w:p>
         </w:tc>
@@ -10339,7 +10326,7 @@
         <w:spacing w:after="100"/>
       </w:pPr>
       <w:r>
-        <w:t xml:space="preserve">The push price here, $6.16, is within 6% of the audit’s number. The real correction is fixed bidding and a deeper base cut.</w:t>
+        <w:t xml:space="preserve">The push price here, $6.16, is within 6% of the audit’s number. The real correction is a deeper base cut, so the money goes to the top instead of product pages.</w:t>
       </w:r>
     </w:p>
     <w:p>
@@ -10347,7 +10334,7 @@
         <w:spacing w:after="100"/>
       </w:pPr>
       <w:r>
-        <w:t xml:space="preserve">It buys too little at the top: 39% of its clicks, against 57% on product pages, and 1.5% of the top-of-search impressions. The plan asks for 69 top-of-search clicks a day (about 40 after the overlap scaling in Section 12); it gets 7. The fix is the mix and fixed bidding more than a higher price:</w:t>
+        <w:t xml:space="preserve">It buys too little at the top: 39% of its clicks, against 57% on product pages, and 1.5% of the top-of-search impressions. The plan asks for 69 top-of-search clicks a day (about 40 after the overlap scaling in Section 12); it gets 7. The fix is the mix more than a higher price:</w:t>
       </w:r>
     </w:p>
     <w:p>
@@ -10386,7 +10373,7 @@
         <w:spacing w:after="60"/>
       </w:pPr>
       <w:r>
-        <w:t xml:space="preserve">Fixed bidding, which puts it at $6.16 at the top.</w:t>
+        <w:t xml:space="preserve">That puts it at up to $6.16 at the top.</w:t>
       </w:r>
     </w:p>
     <w:p>
@@ -10451,7 +10438,7 @@
         <w:t xml:space="preserve">Push </w:t>
       </w:r>
       <w:r>
-        <w:t xml:space="preserve">where it is in the plan: fixed bidding, the base cut and push price in one write, daily steps until it holds the top, and a budget for its planned clicks.</w:t>
+        <w:t xml:space="preserve">where it is in the plan: the base cut and push price in one write, daily steps until it holds the top, and a budget for its planned clicks.</w:t>
       </w:r>
     </w:p>
     <w:p>
@@ -10491,7 +10478,7 @@
         <w:t xml:space="preserve">Too few clicks to judge: </w:t>
       </w:r>
       <w:r>
-        <w:t xml:space="preserve">break-even until the campaign has 15 top-of-search clicks, on fixed bidding so it can collect them.</w:t>
+        <w:t xml:space="preserve">break-even until the campaign has 15 top-of-search clicks.</w:t>
       </w:r>
     </w:p>
     <w:p>
@@ -11966,7 +11953,7 @@
                 <w:sz w:val="17"/>
                 <w:szCs w:val="17"/>
               </w:rPr>
-              <w:t xml:space="preserve">Restart the existing campaign on Full White, on fixed bidding. Drop the new campaign.</w:t>
+              <w:t xml:space="preserve">Restart the existing campaign on Full White. Drop the new campaign.</w:t>
             </w:r>
           </w:p>
         </w:tc>
@@ -12220,7 +12207,7 @@
         <w:t xml:space="preserve">Correction. </w:t>
       </w:r>
       <w:r>
-        <w:t xml:space="preserve">Set the base to $0.60 and the boost to 700% (the same $4.80 at the top) on fixed bidding, in one write. That leaves room up to $6.00 at the top. It is the plan’s second term (54 units a week), so it is not parked: it serves at $4.80 while its listing is checked, then joins the push (Section 5.3).</w:t>
+        <w:t xml:space="preserve">Set the base to $0.60 and the boost to 700% (the same $4.80 at the top), in one write, and check the ad is live on King White. That leaves room up to $6.00 at the top. It is the plan’s second term (54 units a week), so it is not parked: it serves at $4.80 while its listing is checked, then joins the push (Section 5.3).</w:t>
       </w:r>
     </w:p>
     <w:p>
@@ -13792,7 +13779,7 @@
         <w:spacing w:after="60"/>
       </w:pPr>
       <w:r>
-        <w:t xml:space="preserve">On the push terms: fixed bidding, the base cut and the push price in one write, budgets by hand, and daily steps until each holds the top.</w:t>
+        <w:t xml:space="preserve">On the push terms: the base cut and the push price in one write, budgets by hand, and daily steps until each holds the top. No change to bidding strategies.</w:t>
       </w:r>
     </w:p>
     <w:p>
@@ -13995,7 +13982,7 @@
         <w:spacing w:after="60"/>
       </w:pPr>
       <w:r>
-        <w:t xml:space="preserve">It raises prices on campaigns that barely show at the top, and leaves push campaigns on down-only bidding.</w:t>
+        <w:t xml:space="preserve">It raises prices on campaigns that barely show at the top.</w:t>
       </w:r>
     </w:p>
     <w:p>

</xml_diff>

<commit_message>
State the DBS6 deal-day spend as a two-day margin exception
Shows the arithmetic: $1,300/day runs about 7% margin on 29-30 Sep,
about $480 against holding 10%; the 10% rule governs from 1 October.

Co-Authored-By: Claude Opus 5.5 <noreply@anthropic.com>
Claude-Session: https://claude.ai/code/session_01LY7A1KPDoE1cQtWdmceR2R
</commit_message>
<xml_diff>
--- a/docs/DBS6_Audit_Corrections_20260928.docx
+++ b/docs/DBS6_Audit_Corrections_20260928.docx
@@ -308,7 +308,7 @@
         <w:t xml:space="preserve">Budget set: </w:t>
       </w:r>
       <w:r>
-        <w:t xml:space="preserve">for the rest of the deal (to 30 September), up to $1,300 a day of B6 ad spend in total. It is $982 a day now, at about 11% margin. The increase goes to top of search on the ranking terms in the push, about $1,060 a day (Section 5.3). From 1 October a separate audit re-evaluates the budget and sets the post-deal prices and goals, keeping margin after ads above 10%.</w:t>
+        <w:t xml:space="preserve">for the rest of the deal (29–30 September), up to $1,300 a day of B6 ad spend in total, as a stated two-day exception to the 10% margin rule. Margin after ads runs at about 7% on those two days (Section 5.3). Today spend is $982 a day at about 11% margin. The increase goes to top of search on the ranking terms in the push, about $1,060 a day. From 1 October the 10% rule governs, and a separate audit re-evaluates the budget and sets the post-deal prices and goals.</w:t>
       </w:r>
     </w:p>
     <w:p>
@@ -1964,10 +1964,10 @@
           <w:b/>
           <w:bCs/>
         </w:rPr>
-        <w:t xml:space="preserve">For the deal days (to 30 September): </w:t>
-      </w:r>
-      <w:r>
-        <w:t xml:space="preserve">total B6 ad spend up to $1,300 a day, with the increase going to top of search on the push terms (Section 5.3). Campaigns outside the push keep their current budgets, with no raises.</w:t>
+        <w:t xml:space="preserve">For the deal days (29–30 September), a stated exception: </w:t>
+      </w:r>
+      <w:r>
+        <w:t xml:space="preserve">total B6 ad spend up to $1,300 a day, with the increase going to top of search on the push terms. Margin after ads runs at about 7% on those two days instead of 10% (Section 5.3). Campaigns outside the push keep their current budgets, with no raises.</w:t>
       </w:r>
     </w:p>
     <w:p>
@@ -7523,6 +7523,22 @@
         <w:spacing w:after="100"/>
       </w:pPr>
       <w:r>
+        <w:rPr>
+          <w:b/>
+          <w:bCs/>
+          <w:color w:val="1F3A5F"/>
+        </w:rPr>
+        <w:t xml:space="preserve">The two-day margin exception. </w:t>
+      </w:r>
+      <w:r>
+        <w:t xml:space="preserve">Today B6 spends $982 a day at about 11% margin after ads. B6 keeps 23.8% of sales before ads, so that implies about $7,670 a day in total sales during the deal. At those sales, 10% margin allows about $1,060 a day of ads in total. At $1,300 a day, margin runs at about 7%. That costs about $240 a day, or about $480 over the two days, against holding 10%. The push’s own sales won’t close the gap on the same days: even if every push sale were new and arrived at once, 10% would allow only about $120 a day more than today. It is taken knowingly, because the last deal days are when rank is cheapest to buy, since the deal lifts conversion. From 1 October the 10% rule governs.</w:t>
+      </w:r>
+    </w:p>
+    <w:p>
+      <w:pPr>
+        <w:spacing w:after="100"/>
+      </w:pPr>
+      <w:r>
         <w:t xml:space="preserve">It should bring about 32 orders a day at about 41% ACoS, which is above the 23.8% break-even: each push order costs more than it earns. The payback is organic. At their target ranks the audit’s plan puts these terms at about 245 units a week, against the roughly 480 a week B6 sells today. Most of those units would come without an ad once the rank holds.</w:t>
       </w:r>
     </w:p>
@@ -7531,7 +7547,7 @@
         <w:spacing w:after="100"/>
       </w:pPr>
       <w:r>
-        <w:t xml:space="preserve">The margin rule governs: check B6’s margin after ads every week, and if it drops below 10%, cut the push from the bottom of the funded list up. Released or re-ceilinged terms join only while total spend stays inside $1,300 a day.</w:t>
+        <w:t xml:space="preserve">From 1 October the margin rule governs: check B6’s margin after ads every week, and if it drops below 10%, cut the push from the bottom of the funded list up. Released or re-ceilinged terms join only while total spend stays inside the limit the 1 October audit sets.</w:t>
       </w:r>
     </w:p>
     <w:p>
@@ -7635,7 +7651,7 @@
         <w:t xml:space="preserve">Budget. </w:t>
       </w:r>
       <w:r>
-        <w:t xml:space="preserve">For the rest of the deal, up to $1,300 a day of B6 ad spend in total, of which the funded push is about $1,060 a day. It is re-evaluated in the 1 October audit.</w:t>
+        <w:t xml:space="preserve">For the rest of the deal (29–30 September), up to $1,300 a day of B6 ad spend in total, as a stated two-day exception at about 7% margin; the funded push is about $1,060 a day. From 1 October the 10% rule governs and the budget is re-evaluated in the post-deal audit.</w:t>
       </w:r>
     </w:p>
     <w:p>

</xml_diff>

<commit_message>
DBS6: two deal days are for pushing; budget and margin rule re-evaluated 1 Oct
Co-Authored-By: Claude Opus 5.5 <noreply@anthropic.com>
Claude-Session: https://claude.ai/code/session_01LY7A1KPDoE1cQtWdmceR2R
</commit_message>
<xml_diff>
--- a/docs/DBS6_Audit_Corrections_20260928.docx
+++ b/docs/DBS6_Audit_Corrections_20260928.docx
@@ -308,7 +308,7 @@
         <w:t xml:space="preserve">Budget set: </w:t>
       </w:r>
       <w:r>
-        <w:t xml:space="preserve">for the rest of the deal (29–30 September), up to $1,300 a day of B6 ad spend in total, as a stated two-day exception to the 10% margin rule. Margin after ads runs at about 7% on those two days (Section 5.3). Today spend is $982 a day at about 11% margin. The increase goes to top of search on the ranking terms in the push, about $1,060 a day. From 1 October the 10% rule governs, and a separate audit re-evaluates the budget and sets the post-deal prices and goals.</w:t>
+        <w:t xml:space="preserve">for the rest of the deal (29–30 September), up to $1,300 a day of B6 ad spend in total, as a stated two-day exception to the 10% margin rule. Margin after ads runs at about 7% on those two days (Section 5.3). Today spend is $982 a day at about 11% margin. The increase goes to top of search on the ranking terms in the push, about $1,060 a day. These two days are for pushing. From 1 October a separate audit re-evaluates the budget and the margin rule, and sets the post-deal prices and goals.</w:t>
       </w:r>
     </w:p>
     <w:p>
@@ -1967,7 +1967,7 @@
         <w:t xml:space="preserve">For the deal days (29–30 September), a stated exception: </w:t>
       </w:r>
       <w:r>
-        <w:t xml:space="preserve">total B6 ad spend up to $1,300 a day, with the increase going to top of search on the push terms. Margin after ads runs at about 7% on those two days instead of 10% (Section 5.3). Campaigns outside the push keep their current budgets, with no raises.</w:t>
+        <w:t xml:space="preserve">total B6 ad spend up to $1,300 a day, with the increase going to top of search on the push terms. These two days are for pushing: margin after ads runs at about 7% instead of 10% (Section 5.3). Campaigns outside the push keep their current budgets, with no raises.</w:t>
       </w:r>
     </w:p>
     <w:p>
@@ -1984,10 +1984,10 @@
           <w:b/>
           <w:bCs/>
         </w:rPr>
-        <w:t xml:space="preserve">From 1 October, set in the separate post-deal audit: </w:t>
-      </w:r>
-      <w:r>
-        <w:t xml:space="preserve">a spend limit that keeps B6’s margin after ads above 10%. At the full price that means total ads at or under about 13.8% of sales, since B6 keeps 23.8% before ads. The same audit re-evaluates the push budget inside that limit; the push terms and the weekly tuning below carry over.</w:t>
+        <w:t xml:space="preserve">From 1 October, re-evaluated in the separate post-deal audit: </w:t>
+      </w:r>
+      <w:r>
+        <w:t xml:space="preserve">the spend limit and the margin rule. Keeping margin after ads above 10% at the full price would mean total ads at or under about 13.8% of sales, since B6 keeps 23.8% before ads. The same audit re-evaluates the push budget inside that limit; the push terms and the weekly tuning below carry over.</w:t>
       </w:r>
     </w:p>
     <w:p>
@@ -7515,7 +7515,7 @@
         <w:t xml:space="preserve">What it costs. </w:t>
       </w:r>
       <w:r>
-        <w:t xml:space="preserve">The funded push is about $1,060 a day. With about $220 a day on the other campaigns, total B6 ad spend is about $1,280 a day, inside the $1,300 limit. For the deal’s remaining days (29–30 September) the push costs about $2,100. From 1 October its budget is re-evaluated in the post-deal audit, inside the 10% margin rule.</w:t>
+        <w:t xml:space="preserve">The funded push is about $1,060 a day. With about $220 a day on the other campaigns, total B6 ad spend is about $1,280 a day, inside the $1,300 limit. For the deal’s remaining days (29–30 September) the push costs about $2,100. From 1 October its budget is re-evaluated in the post-deal audit.</w:t>
       </w:r>
     </w:p>
     <w:p>
@@ -7531,7 +7531,7 @@
         <w:t xml:space="preserve">The two-day margin exception. </w:t>
       </w:r>
       <w:r>
-        <w:t xml:space="preserve">Today B6 spends $982 a day at about 11% margin after ads. B6 keeps 23.8% of sales before ads, so that implies about $7,670 a day in total sales during the deal. At those sales, 10% margin allows about $1,060 a day of ads in total. At $1,300 a day, margin runs at about 7%. That costs about $240 a day, or about $480 over the two days, against holding 10%. The push’s own sales won’t close the gap on the same days: even if every push sale were new and arrived at once, 10% would allow only about $120 a day more than today. It is taken knowingly, because the last deal days are when rank is cheapest to buy, since the deal lifts conversion. From 1 October the 10% rule governs.</w:t>
+        <w:t xml:space="preserve">Today B6 spends $982 a day at about 11% margin after ads. B6 keeps 23.8% of sales before ads, so that implies about $7,670 a day in total sales during the deal. At those sales, 10% margin allows about $1,060 a day of ads in total. At $1,300 a day, margin runs at about 7%. That costs about $240 a day, or about $480 over the two days, against holding 10%. The push’s own sales won’t close the gap on the same days: even if every push sale were new and arrived at once, 10% would allow only about $120 a day more than today. It is taken knowingly: these two days are for pushing, because the last deal days are when rank is cheapest to buy, since the deal lifts conversion. From 1 October the budget and the margin rule are re-evaluated.</w:t>
       </w:r>
     </w:p>
     <w:p>
@@ -7547,7 +7547,7 @@
         <w:spacing w:after="100"/>
       </w:pPr>
       <w:r>
-        <w:t xml:space="preserve">From 1 October the margin rule governs: check B6’s margin after ads every week, and if it drops below 10%, cut the push from the bottom of the funded list up. Released or re-ceilinged terms join only while total spend stays inside the limit the 1 October audit sets.</w:t>
+        <w:t xml:space="preserve">From 1 October, whatever margin rule the post-deal audit sets governs. Check B6’s margin after ads every week, and if it drops below that floor, cut the push from the bottom of the funded list up. Released or re-ceilinged terms join only while total spend stays inside the limit the 1 October audit sets.</w:t>
       </w:r>
     </w:p>
     <w:p>
@@ -7651,7 +7651,7 @@
         <w:t xml:space="preserve">Budget. </w:t>
       </w:r>
       <w:r>
-        <w:t xml:space="preserve">For the rest of the deal (29–30 September), up to $1,300 a day of B6 ad spend in total, as a stated two-day exception at about 7% margin; the funded push is about $1,060 a day. From 1 October the 10% rule governs and the budget is re-evaluated in the post-deal audit.</w:t>
+        <w:t xml:space="preserve">For the rest of the deal (29–30 September), up to $1,300 a day of B6 ad spend in total, as a stated two-day exception at about 7% margin; the funded push is about $1,060 a day. From 1 October the budget and the margin rule are re-evaluated in the post-deal audit.</w:t>
       </w:r>
     </w:p>
     <w:p>

</xml_diff>